<commit_message>
Improve dissertation prose and abstract clarity
</commit_message>
<xml_diff>
--- a/thesis/Yikai_Zhao_MSc_Dissertation.docx
+++ b/thesis/Yikai_Zhao_MSc_Dissertation.docx
@@ -185,12 +185,7 @@
     </w:p>
     <w:p>
       <w:r>
-        <w:rPr>
-          <w:rFonts w:ascii="Arial" w:hAnsi="Arial" w:eastAsia="Arial" w:cs="Arial"/>
-          <w:color w:val="000000"/>
-          <w:sz w:val="22"/>
-        </w:rPr>
-        <w:t>Vision Transformers (ViTs) represent images as sequences of patch tokens, making positional information important for recovering the two-dimensional arrangement that self-attention does not encode by itself. This dissertation presents a controlled empirical evaluation of positional encoding in a shared ViT trained from scratch. It compares no positional encoding, learnable absolute embeddings, fixed row- and column-wise sinusoidal encodings, additive and element-wise multiplicative combinations, shifted frequency schedules, and radial and squared extensions. Separate experiments examine patch-to-position assignment, reduced training data, a CIFAR-100 extension, and hybrid and dual-branch fusion models. All formal comparisons use five seeds, validation-selected checkpoints, held-out test accuracy and loss, 95% t-confidence intervals, same-seed paired differences, and parameter counts when model capacity changes. On CIFAR-10, learnable absolute positional encoding achieved the highest core mean test accuracy at 78.60 ± 0.42%, while shifted multiplicative encoding was the strongest fixed design at 78.08 ± 0.09%; the no-position baseline reached 71.29 ± 0.83%. Shifted multiplicative encoding exceeded learnable encoding by 2.54 percentage points in the 1,000-example setting, but the mean ordering reversed with 5,000, 10,000, and full training data. For the four pre-selected models, CIFAR-100 retained the CIFAR-10 ranking, with learnable encoding first. The best dual-branch fusion model reached 77.74 ± 0.44% on CIFAR-10 despite using approximately 2.5 times as many trainable parameters as the learnable single-branch model. These results show that positional information is valuable in the evaluated ViT, fixed spatial priors can be competitive in a highly data-limited regime, and added architectural complexity does not necessarily improve classification performance.</w:t>
+        <w:t>Vision Transformers (ViTs) divide an image into patches and process them as a sequence. Self-attention does not identify the original location of each patch, so a ViT usually adds positional encoding (PE). This study examines how different PE methods affect a small ViT trained from scratch. The main experiment compares no PE, learnable absolute PE, and several fixed two-dimensional sinusoidal PE methods on CIFAR-10. The fixed methods use row and column coordinates and combine them by addition or element-wise multiplication. Additional experiments test shifted, radial and squared variants, four patch-to-position mappings, smaller training subsets, CIFAR-100, and hybrid or dual-branch models. Each formal comparison uses five training seeds. Checkpoints are selected using validation accuracy, and final performance is measured on the held-out test set. The results are reported with 95% confidence intervals and same-seed paired differences. On CIFAR-10, learnable absolute PE achieved the highest core mean test accuracy at 78.60 ± 0.42%. Shifted multiplicative PE was the best fixed method at 78.08 ± 0.09%, while the no-PE baseline reached 71.29 ± 0.83%. With 1,000 training examples, shifted multiplicative PE exceeded learnable PE by 2.54 percentage points. Learnable PE performed better with 5,000, 10,000 and all available training examples. The selected methods kept the same ranking on CIFAR-100. The best dual-branch model reached 77.74 ± 0.44% on CIFAR-10, despite using about 2.5 times as many trainable parameters as the learnable single-branch model. These results show that PE clearly improves this ViT. Fixed PE can be useful when training data are very limited, but learnable PE performs best in most settings. More complex models do not necessarily improve accuracy.</w:t>
       </w:r>
     </w:p>
     <w:p>
@@ -215,82 +210,7 @@
         </w:rPr>
       </w:pPr>
       <w:r>
-        <w:rPr>
-          <w:rFonts w:ascii="Arial" w:hAnsi="Arial" w:eastAsia="Arial" w:cs="Arial"/>
-          <w:color w:val="000000"/>
-          <w:sz w:val="22"/>
-        </w:rPr>
-        <w:t xml:space="preserve">Vision Transformers (ViTs) have become an important alternative to convolutional neural networks for image classification. A ViT divides an image into patches and processes their embeddings as a token sequence, allowing self-attention to model interactions across the full image. This formulation, however, does not by itself preserve token order or the two-dimensional location of each patch. Positional information is therefore required if the model is to distinguish patches by where they originated in the image grid </w:t>
-      </w:r>
-      <w:r>
-        <w:rPr>
-          <w:lang w:eastAsia="zh-CN"/>
-        </w:rPr>
-        <w:fldChar w:fldCharType="begin"/>
-      </w:r>
-      <w:r>
-        <w:rPr>
-          <w:lang w:eastAsia="zh-CN"/>
-        </w:rPr>
-        <w:instrText xml:space="preserve"> ADDIN ZOTERO_ITEM CSL_CITATION {"citationID":"n8UUAZqh","properties":{"unsorted":false,"formattedCitation":"[1]","plainCitation":"[1]","noteIndex":0},"citationItems":[{"id":9,"uris":["http://zotero.org/users/15596373/items/PV84RS4V"],"itemData":{"id":9,"type":"article","abstract":"While the Transformer architecture has become the de-facto standard for natural language processing tasks, its applications to computer vision remain limited. In vision, attention is either applied in conjunction with convolutional networks, or used to replace certain components of convolutional networks while keeping their overall structure in place. We show that this reliance on CNNs is not necessary and a pure transformer applied directly to sequences of image patches can perform very well on image classification tasks. When pre-trained on large amounts of data and transferred to multiple mid-sized or small image recognition benchmarks (ImageNet, CIFAR-100, VTAB, etc.), Vision Transformer (ViT) attains excellent results compared to state-of-the-art convolutional networks while requiring substantially fewer computational resources to train.","DOI":"10.48550/arXiv.2010.11929","language":"en","note":"arXiv:2010.11929 [cs]","number":"arXiv:2010.11929","publisher":"arXiv","source":"arXiv.org","title":"An Image is Worth 16x16 Words: Transformers for Image Recognition at Scale","title-short":"An Image is Worth 16x16 Words","URL":"http://arxiv.org/abs/2010.11929","author":[{"family":"Dosovitskiy","given":"Alexey"},{"family":"Beyer","given":"Lucas"},{"family":"Kolesnikov","given":"Alexander"},{"family":"Weissenborn","given":"Dirk"},{"family":"Zhai","given":"Xiaohua"},{"family":"Unterthiner","given":"Thomas"},{"family":"Dehghani","given":"Mostafa"},{"family":"Minderer","given":"Matthias"},{"family":"Heigold","given":"Georg"},{"family":"Gelly","given":"Sylvain"},{"family":"Uszkoreit","given":"Jakob"},{"family":"Houlsby","given":"Neil"}],"accessed":{"date-parts":[["2026",1,10]]},"issued":{"date-parts":[["2021",6,3]]}}}],"schema":"https://github.com/citation-style-language/schema/raw/master/csl-citation.json"} </w:instrText>
-      </w:r>
-      <w:r>
-        <w:rPr>
-          <w:lang w:eastAsia="zh-CN"/>
-        </w:rPr>
-        <w:fldChar w:fldCharType="separate"/>
-      </w:r>
-      <w:r>
-        <w:t>[1]</w:t>
-      </w:r>
-      <w:r>
-        <w:rPr>
-          <w:lang w:eastAsia="zh-CN"/>
-        </w:rPr>
-        <w:fldChar w:fldCharType="end"/>
-      </w:r>
-      <w:r>
-        <w:rPr>
-          <w:rFonts w:ascii="Arial" w:hAnsi="Arial" w:eastAsia="Arial" w:cs="Arial"/>
-          <w:color w:val="000000"/>
-          <w:sz w:val="22"/>
-        </w:rPr>
-        <w:t xml:space="preserve">, </w:t>
-      </w:r>
-      <w:r>
-        <w:rPr>
-          <w:lang w:eastAsia="zh-CN"/>
-        </w:rPr>
-        <w:fldChar w:fldCharType="begin"/>
-      </w:r>
-      <w:r>
-        <w:rPr>
-          <w:lang w:eastAsia="zh-CN"/>
-        </w:rPr>
-        <w:instrText xml:space="preserve"> ADDIN ZOTERO_ITEM CSL_CITATION {"citationID":"K3ew3VHP","properties":{"unsorted":false,"formattedCitation":"[2]","plainCitation":"[2]","noteIndex":0},"citationItems":[{"id":11,"uris":["http://zotero.org/users/15596373/items/N2D5YYTR"],"itemData":{"id":11,"type":"article","abstract":"The dominant sequence transduction models are based on complex recurrent or convolutional neural networks that include an encoder and a decoder. The best performing models also connect the encoder and decoder through an attention mechanism. We propose a new simple network architecture, the Transformer, based solely on attention mechanisms, dispensing with recurrence and convolutions entirely. Experiments on two machine translation tasks show these models to be superior in quality while being more parallelizable and requiring significantly less time to train. Our model achieves 28.4 BLEU on the WMT 2014 Englishto-German translation task, improving over the existing best results, including ensembles, by over 2 BLEU. On the WMT 2014 English-to-French translation task, our model establishes a new single-model state-of-the-art BLEU score of 41.8 after training for 3.5 days on eight GPUs, a small fraction of the training costs of the best models from the literature. We show that the Transformer generalizes well to other tasks by applying it successfully to English constituency parsing both with large and limited training data.","DOI":"10.48550/arXiv.1706.03762","language":"en","note":"arXiv:1706.03762 [cs]","number":"arXiv:1706.03762","publisher":"arXiv","source":"arXiv.org","title":"Attention Is All You Need","URL":"http://arxiv.org/abs/1706.03762","author":[{"family":"Vaswani","given":"Ashish"},{"family":"Shazeer","given":"Noam"},{"family":"Parmar","given":"Niki"},{"family":"Uszkoreit","given":"Jakob"},{"family":"Jones","given":"Llion"},{"family":"Gomez","given":"Aidan N."},{"family":"Kaiser","given":"Lukasz"},{"family":"Polosukhin","given":"Illia"}],"accessed":{"date-parts":[["2026",1,10]]},"issued":{"date-parts":[["2023",8,2]]}}}],"schema":"https://github.com/citation-style-language/schema/raw/master/csl-citation.json"} </w:instrText>
-      </w:r>
-      <w:r>
-        <w:rPr>
-          <w:lang w:eastAsia="zh-CN"/>
-        </w:rPr>
-        <w:fldChar w:fldCharType="separate"/>
-      </w:r>
-      <w:r>
-        <w:t>[2]</w:t>
-      </w:r>
-      <w:r>
-        <w:rPr>
-          <w:lang w:eastAsia="zh-CN"/>
-        </w:rPr>
-        <w:fldChar w:fldCharType="end"/>
-      </w:r>
-      <w:r>
-        <w:rPr>
-          <w:rFonts w:ascii="Arial" w:hAnsi="Arial" w:eastAsia="Arial" w:cs="Arial"/>
-          <w:color w:val="000000"/>
-          <w:sz w:val="22"/>
-        </w:rPr>
-        <w:t>.</w:t>
+        <w:t>Unlike a convolutional network, a standard Vision Transformer does not impose spatial order through local filters. Its self-attention layers compare patch representations without knowing where the patches originated unless location is supplied separately. Positional encoding therefore determines whether the model can distinguish, for example, evidence in the top-left from similar evidence near the centre [1], [2].</w:t>
       </w:r>
     </w:p>
     <w:p>
@@ -301,47 +221,7 @@
         </w:rPr>
       </w:pPr>
       <w:r>
-        <w:rPr>
-          <w:rFonts w:ascii="Arial" w:hAnsi="Arial" w:eastAsia="Arial" w:cs="Arial"/>
-          <w:color w:val="000000"/>
-          <w:sz w:val="22"/>
-        </w:rPr>
-        <w:t xml:space="preserve">The original ViT addresses this requirement with a learnable absolute positional embedding for every token position </w:t>
-      </w:r>
-      <w:r>
-        <w:rPr>
-          <w:lang w:eastAsia="zh-CN"/>
-        </w:rPr>
-        <w:fldChar w:fldCharType="begin"/>
-      </w:r>
-      <w:r>
-        <w:rPr>
-          <w:lang w:eastAsia="zh-CN"/>
-        </w:rPr>
-        <w:instrText xml:space="preserve"> ADDIN ZOTERO_ITEM CSL_CITATION {"citationID":"ocjkVr1z","properties":{"unsorted":false,"formattedCitation":"[1]","plainCitation":"[1]","noteIndex":0},"citationItems":[{"id":9,"uris":["http://zotero.org/users/15596373/items/PV84RS4V"],"itemData":{"id":9,"type":"article","abstract":"While the Transformer architecture has become the de-facto standard for natural language processing tasks, its applications to computer vision remain limited. In vision, attention is either applied in conjunction with convolutional networks, or used to replace certain components of convolutional networks while keeping their overall structure in place. We show that this reliance on CNNs is not necessary and a pure transformer applied directly to sequences of image patches can perform very well on image classification tasks. When pre-trained on large amounts of data and transferred to multiple mid-sized or small image recognition benchmarks (ImageNet, CIFAR-100, VTAB, etc.), Vision Transformer (ViT) attains excellent results compared to state-of-the-art convolutional networks while requiring substantially fewer computational resources to train.","DOI":"10.48550/arXiv.2010.11929","language":"en","note":"arXiv:2010.11929 [cs]","number":"arXiv:2010.11929","publisher":"arXiv","source":"arXiv.org","title":"An Image is Worth 16x16 Words: Transformers for Image Recognition at Scale","title-short":"An Image is Worth 16x16 Words","URL":"http://arxiv.org/abs/2010.11929","author":[{"family":"Dosovitskiy","given":"Alexey"},{"family":"Beyer","given":"Lucas"},{"family":"Kolesnikov","given":"Alexander"},{"family":"Weissenborn","given":"Dirk"},{"family":"Zhai","given":"Xiaohua"},{"family":"Unterthiner","given":"Thomas"},{"family":"Dehghani","given":"Mostafa"},{"family":"Minderer","given":"Matthias"},{"family":"Heigold","given":"Georg"},{"family":"Gelly","given":"Sylvain"},{"family":"Uszkoreit","given":"Jakob"},{"family":"Houlsby","given":"Neil"}],"accessed":{"date-parts":[["2026",1,10]]},"issued":{"date-parts":[["2021",6,3]]}}}],"schema":"https://github.com/citation-style-language/schema/raw/master/csl-citation.json"} </w:instrText>
-      </w:r>
-      <w:r>
-        <w:rPr>
-          <w:lang w:eastAsia="zh-CN"/>
-        </w:rPr>
-        <w:fldChar w:fldCharType="separate"/>
-      </w:r>
-      <w:r>
-        <w:t>[1]</w:t>
-      </w:r>
-      <w:r>
-        <w:rPr>
-          <w:lang w:eastAsia="zh-CN"/>
-        </w:rPr>
-        <w:fldChar w:fldCharType="end"/>
-      </w:r>
-      <w:r>
-        <w:rPr>
-          <w:rFonts w:ascii="Arial" w:hAnsi="Arial" w:eastAsia="Arial" w:cs="Arial"/>
-          <w:color w:val="000000"/>
-          <w:sz w:val="22"/>
-        </w:rPr>
-        <w:t>. Such embeddings can adapt to the training task, but they represent location through a table indexed by sequence position rather than an explicit row-column construction. Fixed two-dimensional encodings offer a complementary trade-off: they calculate positional vectors directly from patch coordinates and add no learned positional parameters, but their spatial representation cannot adapt during training. The relative value of these choices may therefore depend on the amount of training data, the patch-to-position mapping, and the difficulty of the classification task.</w:t>
+        <w:t>The original ViT attaches a learned vector to each token position [1]. This table can adapt during training, but it represents location indirectly through sequence index. A fixed two-dimensional encoding instead derives its vector from patch row and column. It adds no trainable positional parameters and makes the spatial rule explicit, but it cannot adapt to the task. The balance may therefore change with data availability, patch-to-position mapping and classification difficulty.</w:t>
       </w:r>
     </w:p>
     <w:p>
@@ -352,12 +232,7 @@
         </w:rPr>
       </w:pPr>
       <w:r>
-        <w:rPr>
-          <w:rFonts w:ascii="Arial" w:hAnsi="Arial" w:eastAsia="Arial" w:cs="Arial"/>
-          <w:color w:val="000000"/>
-          <w:sz w:val="22"/>
-        </w:rPr>
-        <w:t>This dissertation examines positional encoding as a controlled design choice rather than proposing a new general-purpose Transformer architecture. Using one shared ViT backbone, it compares no positional encoding and learnable absolute positional encoding with fixed two-dimensional designs that vary the combination of row and column information and their sinusoidal frequency schedules. Further experiments distinguish patch-to-position assignment from token ordering and evaluate whether hybrid or dual-branch extensions provide a measurable benefit. The data split, optimisation, checkpoint selection, and random seeds are kept fixed within each comparison so that the effect of each design change can be examined directly.</w:t>
+        <w:t>Comparisons across published positional mechanisms often also involve different architectures or training regimes [5], [10]–[12], which makes attribution difficult. This project instead holds the patches, ViT backbone and training procedure constant. It asks whether PE improves the shared model, which fixed designs are most competitive, and how the answer changes with patch-to-position assignment or data availability. Hybrid and dual-branch models are treated separately because they also change model capacity or architecture.</w:t>
       </w:r>
     </w:p>
     <w:p>
@@ -368,12 +243,7 @@
         </w:rPr>
       </w:pPr>
       <w:r>
-        <w:rPr>
-          <w:rFonts w:ascii="Arial" w:hAnsi="Arial" w:eastAsia="Arial" w:cs="Arial"/>
-          <w:color w:val="000000"/>
-          <w:sz w:val="22"/>
-        </w:rPr>
-        <w:t>The main evaluation uses CIFAR-10 with five training seeds and validation-selected checkpoints. Reduced-data experiments use 1,000, 5,000, and 10,000 training examples to examine whether a fixed spatial prior becomes more useful when labelled data are limited. CIFAR-100 provides a more fine-grained extension at the same input resolution, allowing the relative ordering of selected methods to be compared under a harder classification task. Test accuracy and loss are reported with 95% t-confidence intervals and same-seed paired differences, while parameter counts accompany hybrid and fusion comparisons.</w:t>
+        <w:t>CIFAR-10 provides the five-seed main comparison. Reduced-data subsets test whether a fixed spatial prior helps when labels are scarce, while CIFAR-100 raises the number of classes without changing image or patch-grid size. Results use validation-selected checkpoints, 95% t confidence intervals and same-seed paired differences; parameter counts accompany models whose capacity changes.</w:t>
       </w:r>
     </w:p>
     <w:p>
@@ -384,12 +254,18 @@
         </w:rPr>
       </w:pPr>
       <w:r>
+        <w:t>The experiments show that positional information matters for the evaluated ViT, but the relative value of learned and fixed encodings depends on the data regime. Learnable absolute PE leads most comparisons, whereas shifted multiplicative PE becomes competitive in the smallest training subset. The extension experiments also show that additional architectural complexity does not by itself improve classification performance.</w:t>
+      </w:r>
+    </w:p>
+    <w:p>
+      <w:pPr>
         <w:rPr>
-          <w:rFonts w:ascii="Arial" w:hAnsi="Arial" w:eastAsia="Arial" w:cs="Arial"/>
-          <w:color w:val="000000"/>
-          <w:sz w:val="22"/>
+          <w:rFonts w:eastAsia="宋体"/>
+          <w:lang w:eastAsia="zh-CN"/>
         </w:rPr>
-        <w:t>The results establish three main patterns. In the core CIFAR-10 comparison, learnable absolute positional encoding achieved the highest mean accuracy (78.60 ± 0.42%), shifted multiplicative encoding was the strongest fixed method (78.08 ± 0.09%), and the no-position baseline was lower (71.29 ± 0.83%). Shifted multiplicative encoding exceeded learnable encoding only in the 1,000-example setting; the mean ordering reversed as more training data were used. The four selected methods retained the same ranking on CIFAR-100, while the best fusion model remained below learnable positional encoding despite more than doubling the parameter count. These findings support a cautious conclusion: a fixed two-dimensional encoding can be a useful deterministic alternative, but learnable positional encoding performs best in most of the evaluated settings, and additional complexity alone is not a reliable route to better performance.</w:t>
+      </w:pPr>
+      <w:r>
+        <w:t>Chapter 2 reviews positional information in Transformers and identifies the comparison gap addressed here. Chapter 3 defines the datasets, shared architecture, PE variants, patch mappings and evaluation protocol. Chapter 4 reports the experiments and results. Chapter 5 connects those findings to the research questions and discusses their limitations and practical meaning. Chapter 6 summarises the supported conclusions and outlines future work.</w:t>
       </w:r>
     </w:p>
     <w:p>
@@ -934,59 +810,59 @@
     </w:p>
     <w:p>
       <w:r>
-        <w:t xml:space="preserve">The core operation of the Transformer encoder is self-attention. As illustrated in Figure 2, given an input representation </w:t>
-      </w:r>
-      <w:r>
-        <w:rPr>
-          <w:i/>
-        </w:rPr>
-        <w:t>X</w:t>
-      </w:r>
-      <w:r>
-        <w:t xml:space="preserve">, the model applies learned linear projections to produce query, key, and value matrices, denoted </w:t>
-      </w:r>
-      <w:r>
-        <w:rPr>
-          <w:i/>
-        </w:rPr>
-        <w:t>Q</w:t>
-      </w:r>
+        <w:t xml:space="preserve">The core operation of the Transformer encoder is self-attention. As illustrated in Figure 2, an input representation </w:t>
+      </w:r>
+      <m:oMath>
+        <m:r>
+          <m:t>X</m:t>
+          <w:rPr>
+            <w:rFonts w:ascii="Cambria Math" w:hAnsi="Cambria Math"/>
+            <w:sz w:val="21"/>
+            <w:szCs w:val="21"/>
+          </w:rPr>
+        </m:r>
+      </m:oMath>
+      <w:r>
+        <w:t xml:space="preserve"> is projected into query, key and value matrices, denoted </w:t>
+      </w:r>
+      <m:oMath>
+        <m:r>
+          <m:t>Q</m:t>
+          <w:rPr>
+            <w:rFonts w:ascii="Cambria Math" w:hAnsi="Cambria Math"/>
+            <w:sz w:val="21"/>
+            <w:szCs w:val="21"/>
+          </w:rPr>
+        </m:r>
+      </m:oMath>
       <w:r>
         <w:t xml:space="preserve">, </w:t>
       </w:r>
-      <w:r>
-        <w:rPr>
-          <w:i/>
-        </w:rPr>
-        <w:t>K</w:t>
-      </w:r>
-      <w:r>
-        <w:t xml:space="preserve">, and </w:t>
-      </w:r>
-      <w:r>
-        <w:rPr>
-          <w:i/>
-        </w:rPr>
-        <w:t>V</w:t>
-      </w:r>
-      <w:r>
-        <w:t xml:space="preserve">. The query and key matrices are used to compute attention scores, which are </w:t>
-      </w:r>
-      <w:proofErr w:type="spellStart"/>
-      <w:r>
-        <w:t>normalised</w:t>
-      </w:r>
-      <w:proofErr w:type="spellEnd"/>
-      <w:r>
-        <w:t xml:space="preserve"> with a </w:t>
-      </w:r>
-      <w:proofErr w:type="spellStart"/>
-      <w:r>
-        <w:t>softmax</w:t>
-      </w:r>
-      <w:proofErr w:type="spellEnd"/>
-      <w:r>
-        <w:t xml:space="preserve"> function to produce attention weights. These weights are then applied to the value matrix, allowing each token to aggregate information from other tokens.</w:t>
+      <m:oMath>
+        <m:r>
+          <m:t>K</m:t>
+          <w:rPr>
+            <w:rFonts w:ascii="Cambria Math" w:hAnsi="Cambria Math"/>
+            <w:sz w:val="21"/>
+            <w:szCs w:val="21"/>
+          </w:rPr>
+        </m:r>
+      </m:oMath>
+      <w:r>
+        <w:t xml:space="preserve"> and </w:t>
+      </w:r>
+      <m:oMath>
+        <m:r>
+          <m:t>V</m:t>
+          <w:rPr>
+            <w:rFonts w:ascii="Cambria Math" w:hAnsi="Cambria Math"/>
+            <w:sz w:val="21"/>
+            <w:szCs w:val="21"/>
+          </w:rPr>
+        </m:r>
+      </m:oMath>
+      <w:r>
+        <w:t>. Intuitively, a query describes what one token is looking for, a key determines how well another token matches that request, and a value contains the information that can be passed on. Query-key similarities are normalised with softmax to form attention weights, and those weights determine how the value vectors are combined.</w:t>
       </w:r>
     </w:p>
     <w:p>
@@ -1220,71 +1096,69 @@
     </w:p>
     <w:p>
       <w:r>
-        <w:t xml:space="preserve">Equation (2) gives the scaled dot-product attention operation. In this expression, </w:t>
+        <w:t xml:space="preserve">Equation (2) gives the scaled dot-product attention operation. The symbol </w:t>
       </w:r>
       <m:oMath>
         <m:sSub>
-          <m:sSubPr>
-            <m:ctrlPr>
-              <w:rPr>
-                <w:rFonts w:ascii="Cambria Math" w:hAnsi="Cambria Math"/>
-              </w:rPr>
-            </m:ctrlPr>
-          </m:sSubPr>
           <m:e>
             <m:r>
+              <m:t>d</m:t>
               <w:rPr>
                 <w:rFonts w:ascii="Cambria Math" w:hAnsi="Cambria Math"/>
-              </w:rPr>
-              <m:t>d</m:t>
+                <w:sz w:val="21"/>
+                <w:szCs w:val="21"/>
+              </w:rPr>
             </m:r>
           </m:e>
           <m:sub>
             <m:r>
+              <m:t>k</m:t>
               <w:rPr>
                 <w:rFonts w:ascii="Cambria Math" w:hAnsi="Cambria Math"/>
-              </w:rPr>
-              <m:t>k</m:t>
+                <w:sz w:val="21"/>
+                <w:szCs w:val="21"/>
+              </w:rPr>
             </m:r>
           </m:sub>
         </m:sSub>
       </m:oMath>
       <w:r>
-        <w:t xml:space="preserve"> is the dimensionality of the key vectors. Self-attention is powerful because it allows direct interactions between all tokens in a sequence, including tokens that are far apart. This is one </w:t>
-      </w:r>
-      <w:r>
-        <w:lastRenderedPageBreak/>
-        <w:t xml:space="preserve">reason Transformers have been effective in natural language processing and have later been adapted to computer vision. At the same time, self-attention compares token representations rather than their original positions. Without positional information, changing the order of tokens would not be represented in the same way as in recurrent or convolutional models </w:t>
-      </w:r>
-      <w:r>
-        <w:rPr>
-          <w:lang w:eastAsia="zh-CN"/>
-        </w:rPr>
-        <w:fldChar w:fldCharType="begin"/>
-      </w:r>
-      <w:r>
-        <w:rPr>
-          <w:lang w:eastAsia="zh-CN"/>
-        </w:rPr>
-        <w:instrText xml:space="preserve"> ADDIN ZOTERO_ITEM CSL_CITATION {"citationID":"xMz70Wbn","properties":{"unsorted":false,"formattedCitation":"[2]","plainCitation":"[2]","noteIndex":0},"citationItems":[{"id":11,"uris":["http://zotero.org/users/15596373/items/N2D5YYTR"],"itemData":{"id":11,"type":"article","abstract":"The dominant sequence transduction models are based on complex recurrent or convolutional neural networks that include an encoder and a decoder. The best performing models also connect the encoder and decoder through an attention mechanism. We propose a new simple network architecture, the Transformer, based solely on attention mechanisms, dispensing with recurrence and convolutions entirely. Experiments on two machine translation tasks show these models to be superior in quality while being more parallelizable and requiring significantly less time to train. Our model achieves 28.4 BLEU on the WMT 2014 Englishto-German translation task, improving over the existing best results, including ensembles, by over 2 BLEU. On the WMT 2014 English-to-French translation task, our model establishes a new single-model state-of-the-art BLEU score of 41.8 after training for 3.5 days on eight GPUs, a small fraction of the training costs of the best models from the literature. We show that the Transformer generalizes well to other tasks by applying it successfully to English constituency parsing both with large and limited training data.","DOI":"10.48550/arXiv.1706.03762","language":"en","note":"arXiv:1706.03762 [cs]","number":"arXiv:1706.03762","publisher":"arXiv","source":"arXiv.org","title":"Attention Is All You Need","URL":"http://arxiv.org/abs/1706.03762","author":[{"family":"Vaswani","given":"Ashish"},{"family":"Shazeer","given":"Noam"},{"family":"Parmar","given":"Niki"},{"family":"Uszkoreit","given":"Jakob"},{"family":"Jones","given":"Llion"},{"family":"Gomez","given":"Aidan N."},{"family":"Kaiser","given":"Lukasz"},{"family":"Polosukhin","given":"Illia"}],"accessed":{"date-parts":[["2026",1,10]]},"issued":{"date-parts":[["2023",8,2]]}}}],"schema":"https://github.com/citation-style-language/schema/raw/master/csl-citation.json"} </w:instrText>
-      </w:r>
-      <w:r>
-        <w:rPr>
-          <w:lang w:eastAsia="zh-CN"/>
-        </w:rPr>
-        <w:fldChar w:fldCharType="separate"/>
-      </w:r>
-      <w:r>
-        <w:t>[2]</w:t>
-      </w:r>
-      <w:r>
-        <w:rPr>
-          <w:lang w:eastAsia="zh-CN"/>
-        </w:rPr>
-        <w:fldChar w:fldCharType="end"/>
-      </w:r>
-      <w:r>
-        <w:t>.</w:t>
+        <w:t xml:space="preserve"> is the key-vector dimension; dividing by </w:t>
+      </w:r>
+      <m:oMath>
+        <m:rad>
+          <m:radPr>
+            <m:degHide m:val="on"/>
+          </m:radPr>
+          <m:deg/>
+          <m:e>
+            <m:sSub>
+              <m:e>
+                <m:r>
+                  <m:t>d</m:t>
+                  <w:rPr>
+                    <w:rFonts w:ascii="Cambria Math" w:hAnsi="Cambria Math"/>
+                    <w:sz w:val="21"/>
+                    <w:szCs w:val="21"/>
+                  </w:rPr>
+                </m:r>
+              </m:e>
+              <m:sub>
+                <m:r>
+                  <m:t>k</m:t>
+                  <w:rPr>
+                    <w:rFonts w:ascii="Cambria Math" w:hAnsi="Cambria Math"/>
+                    <w:sz w:val="21"/>
+                    <w:szCs w:val="21"/>
+                  </w:rPr>
+                </m:r>
+              </m:sub>
+            </m:sSub>
+          </m:e>
+        </m:rad>
+      </m:oMath>
+      <w:r>
+        <w:t xml:space="preserve"> keeps the similarity scores from growing simply because the vectors are wider. Self-attention allows every token to interact directly with every other token, including distant ones. This ability helped Transformers succeed in language and later in vision. However, the operation compares token representations, not their original positions. Without an added positional signal, reordering the tokens does not create the same kind of structural change that it would in a recurrent or convolutional model [2].</w:t>
       </w:r>
     </w:p>
     <w:p>
@@ -3103,103 +2977,17 @@
     </w:p>
     <w:p>
       <w:r>
-        <w:t xml:space="preserve">A Vision Transformer converts a two-dimensional patch grid into a one-dimensional token sequence, usually by scanning the grid in row-major order. This serialization step must be separated from the position assigned to each token. Without positional information, self-attention is permutation equivariant: permuting the patch tokens produces the same permutation in their outputs, while a class token cannot identify which physical location supplied each patch. </w:t>
-      </w:r>
-      <w:proofErr w:type="spellStart"/>
-      <w:r>
-        <w:t>Dufter</w:t>
-      </w:r>
-      <w:proofErr w:type="spellEnd"/>
-      <w:r>
-        <w:t xml:space="preserve"> et al. provide a broader account of this property and show why position information is required when order or spatial location carries meaning </w:t>
-      </w:r>
-      <w:r>
-        <w:fldChar w:fldCharType="begin"/>
-      </w:r>
-      <w:r>
-        <w:instrText xml:space="preserve"> ADDIN ZOTERO_ITEM CSL_CITATION {"citationID":"YdFiGJI2","properties":{"unsorted":false,"formattedCitation":"[5]","plainCitation":"[5]","noteIndex":0},"citationItems":[{"id":303,"uris":["http://zotero.org/users/15596373/items/Y6V8PGBG"],"itemData":{"id":303,"type":"article-journal","container-title":"Computational Linguistics","DOI":"10.1162/coli_a_00445","issue":"3","page":"733–763","title":"Position Information in Transformers: An Overview","URL":"https://doi.org/10.1162/coli_a_00445","volume":"48","author":[{"family":"Dufter","given":"Philipp"},{"family":"Schmitt","given":"Martin"},{"family":"Schütze","given":"Hinrich"}],"issued":{"date-parts":[["2022"]]}}}],"schema":"https://github.com/citation-style-language/schema/raw/master/csl-citation.json"} </w:instrText>
-      </w:r>
-      <w:r>
-        <w:fldChar w:fldCharType="separate"/>
-      </w:r>
-      <w:r>
-        <w:t>[5]</w:t>
-      </w:r>
-      <w:r>
-        <w:fldChar w:fldCharType="end"/>
-      </w:r>
-      <w:r>
-        <w:t>. Once positional vectors are added, two operations that look similar can represent different interventions. Permuting patch tokens and their positional vectors together preserves each content–coordinate pair; permuting only the tokens changes which positional vector is assigned to each physical patch.</w:t>
+        <w:t>A ViT stores a two-dimensional patch grid as a one-dimensional sequence, usually row by row. Storage order is not the same as the position assigned to a token. Without PE, permuting patch tokens only permutes their patch-level outputs; the classification token still sees the same set and cannot identify their physical locations. This is permutation equivariance [5]. Once positional vectors are added, moving a patch with its vector preserves the content-location pair, whereas moving only the patch assigns it a different location. These interventions therefore test different questions.</w:t>
       </w:r>
     </w:p>
     <w:p>
       <w:r>
-        <w:t xml:space="preserve">Recent work has begun to treat patch order as an explicit design variable. LOOPE learns an ordering for positional embeddings at a chosen set of frequencies </w:t>
-      </w:r>
-      <w:r>
-        <w:fldChar w:fldCharType="begin"/>
-      </w:r>
-      <w:r>
-        <w:instrText xml:space="preserve"> ADDIN ZOTERO_ITEM CSL_CITATION {"citationID":"GfHGAuMj","properties":{"unsorted":false,"formattedCitation":"[6]","plainCitation":"[6]","noteIndex":0},"citationItems":[{"id":5,"uris":["http://zotero.org/users/15596373/items/SV6NHW7I"],"itemData":{"id":5,"type":"article","DOI":"10.48550/arXiv.2504.14386","language":"en","note":"arXiv:2504.14386 [cs]","number":"arXiv:2504.14386","publisher":"arXiv","source":"arXiv.org","title":"LOOPE: Learnable Optimal Patch Order in Positional Embeddings for Vision Transformers","title-short":"LOOPE","URL":"http://arxiv.org/abs/2504.14386","author":[{"family":"Chowdhury","given":"Md Abtahi Majeed"},{"family":"Rahman","given":"Md Rifat Ur"},{"family":"Taki","given":"Akil Ahmad"}],"accessed":{"date-parts":[["2026",1,12]]},"issued":{"date-parts":[["2025",4,19]]}}}],"schema":"https://github.com/citation-style-language/schema/raw/master/csl-citation.json"} </w:instrText>
-      </w:r>
-      <w:r>
-        <w:fldChar w:fldCharType="separate"/>
-      </w:r>
-      <w:r>
-        <w:t>[6]</w:t>
-      </w:r>
-      <w:r>
-        <w:fldChar w:fldCharType="end"/>
-      </w:r>
-      <w:r>
-        <w:t xml:space="preserve">. </w:t>
-      </w:r>
-      <w:proofErr w:type="spellStart"/>
-      <w:r>
-        <w:t>REOrder</w:t>
-      </w:r>
-      <w:proofErr w:type="spellEnd"/>
-      <w:r>
-        <w:t xml:space="preserve"> instead searches for task-dependent patch permutations and reports that alternatives such as column-major and space-filling-curve orders can affect vision sequence models </w:t>
-      </w:r>
-      <w:r>
-        <w:fldChar w:fldCharType="begin"/>
-      </w:r>
-      <w:r>
-        <w:instrText xml:space="preserve"> ADDIN ZOTERO_ITEM CSL_CITATION {"citationID":"aI7N0iqV","properties":{"unsorted":false,"formattedCitation":"[7]","plainCitation":"[7]","noteIndex":0},"citationItems":[{"id":310,"uris":["http://zotero.org/users/15596373/items/HKCYMIIE"],"itemData":{"id":310,"type":"paper-conference","container-title":"Advances in Neural Information Processing Systems","DOI":"10.52202/085713-3842","title":"REOrdering Patches Improves Vision Models","URL":"https://papers.nips.cc/paper_files/paper/2025/hash/a751eb81265da168df0e765b5bc874c9-Abstract-Conference.html","volume":"38","author":[{"family":"Kutscher","given":"Declan"},{"family":"Chan","given":"David M."},{"family":"Bai","given":"Yutong"},{"family":"Darrell","given":"Trevor"},{"family":"Gupta","given":"Ritwik"}],"issued":{"date-parts":[["2025"]]}}}],"schema":"https://github.com/citation-style-language/schema/raw/master/csl-citation.json"} </w:instrText>
-      </w:r>
-      <w:r>
-        <w:fldChar w:fldCharType="separate"/>
-      </w:r>
-      <w:r>
-        <w:t>[7]</w:t>
-      </w:r>
-      <w:r>
-        <w:fldChar w:fldCharType="end"/>
-      </w:r>
-      <w:r>
-        <w:t xml:space="preserve">. LOOPE is a 2025 preprint, while </w:t>
-      </w:r>
-      <w:proofErr w:type="spellStart"/>
-      <w:r>
-        <w:t>REOrder</w:t>
-      </w:r>
-      <w:proofErr w:type="spellEnd"/>
-      <w:r>
-        <w:t xml:space="preserve"> appeared in </w:t>
-      </w:r>
-      <w:proofErr w:type="spellStart"/>
-      <w:r>
-        <w:t>NeurIPS</w:t>
-      </w:r>
-      <w:proofErr w:type="spellEnd"/>
-      <w:r>
-        <w:t xml:space="preserve"> 2025; both mechanisms are more elaborate than choosing between ordinary row-major and column-major mappings. They nevertheless show that flattening a patch grid is not a purely cosmetic implementation detail. Their results also do not establish a universally best order, because sensitivity depends on the positional representation and on whether the architecture preserves full self-attention's permutation property.</w:t>
+        <w:t>Recent work treats patch order as a design variable. LOOPE learns an ordering for positional embeddings at selected frequencies [6], while REOrder searches for task-dependent patch permutations and reports effects from alternatives such as column-major and space-filling-curve orders [7]. LOOPE is a 2025 preprint and REOrder appeared at NeurIPS 2025; both are more elaborate than the four deterministic mappings used here. They show that flattening can matter, but neither establishes a universal best order because the effect depends on the position mechanism and architecture.</w:t>
       </w:r>
     </w:p>
     <w:p>
       <w:r>
-        <w:t>A clear description of patch order therefore needs three linked quantities: the physical patch coordinate, the token's sequence slot, and the positional coordinate or vector assigned at that slot. This distinction provides a precise basis for comparing row-wise and column-wise configurations. It also prevents an accuracy difference caused by reassigned coordinates from being described incorrectly as a change in local token adjacency.</w:t>
+        <w:t>A precise comparison must track the physical patch location, its sequence slot and the positional coordinate attached to that slot. This prevents patch-to-position reassignment from being mistaken for a change in token adjacency. Section 3.5 uses these quantities to define the four project mappings.</w:t>
       </w:r>
     </w:p>
     <w:p>
@@ -3490,24 +3278,7 @@
     </w:p>
     <w:p>
       <w:r>
-        <w:lastRenderedPageBreak/>
-        <w:t xml:space="preserve">The practical gap addressed here is therefore one of attribution rather than a lack of proposed positional encodings. Results reported by different studies can reflect changes in architecture, model scale, data, augmentation or </w:t>
-      </w:r>
-      <w:proofErr w:type="spellStart"/>
-      <w:r>
-        <w:t>optimisation</w:t>
-      </w:r>
-      <w:proofErr w:type="spellEnd"/>
-      <w:r>
-        <w:t xml:space="preserve"> as well as the position method itself. The following chapters use one </w:t>
-      </w:r>
-      <w:proofErr w:type="spellStart"/>
-      <w:r>
-        <w:t>ViT</w:t>
-      </w:r>
-      <w:proofErr w:type="spellEnd"/>
-      <w:r>
-        <w:t xml:space="preserve"> architecture and a common training and evaluation protocol to separate four factors: the presence and form of positional encoding, the mapping between patches and positional coordinates, the effect of limited training data, and the cost of adding hybrid or multi-branch complexity. This scope supports a controlled empirical comparison; it does not claim a universally superior positional encoding or a new general-purpose Transformer architecture.</w:t>
+        <w:t>The practical gap is therefore one of attribution, not a lack of proposed encodings. Results from different studies may reflect changes in architecture, scale, data, augmentation or optimisation as well as the position method. This project instead uses one ViT and a common protocol to separate four factors: PE presence and form, patch-coordinate mapping, limited training data, and the cost of hybrid or multi-branch complexity. This controlled comparison does not claim a universally superior encoding or a new general-purpose Transformer.</w:t>
       </w:r>
     </w:p>
     <w:p>
@@ -3523,8 +3294,9 @@
     <w:p>
       <w:bookmarkStart w:id="5" w:name="OLE_LINK1"/>
       <w:r>
-        <w:t>This chapter presents the experimental procedure used to compare positional representations in Vision Transformers. All experiments follow a common pipeline: images are preprocessed and divided into patches, positional information is assigned to the resulting tokens, and the tokens are then processed by the same Transformer encoder. Model selection is based on validation performance, after which the selected checkpoint is evaluated on the held-out test set. The chapter then describes the datasets, model architecture, positional encoding schemes, patch-assignment strategies, model extensions, training protocol, and statistical analysis.</w:t>
-      </w:r>
+        <w:t>This chapter explains how the experiments were constructed so that each reported comparison can be reproduced and interpreted. Every image passes through the same broad pipeline: dataset-specific preprocessing, division into patches, assignment of positional information, and processing by a shared Transformer encoder. Validation performance selects the checkpoint; the official test set is used only after selection. The following sections define the controlled design, data, shared architecture, positional encodings, patch mappings, extensions, training protocol and statistical analysis.</w:t>
+      </w:r>
+      <w:bookmarkEnd w:id="5"/>
     </w:p>
     <w:bookmarkEnd w:id="5"/>
     <w:p>
@@ -3543,39 +3315,9 @@
       </w:pPr>
       <w:bookmarkStart w:id="6" w:name="OLE_LINK2"/>
       <w:r>
-        <w:rPr>
-          <w:lang w:eastAsia="zh-CN"/>
-        </w:rPr>
-        <w:t xml:space="preserve">The study is designed as a controlled empirical comparison rather than an attempt to introduce a new general-purpose Transformer architecture. Within each experiment, the </w:t>
-      </w:r>
-      <w:proofErr w:type="spellStart"/>
-      <w:r>
-        <w:rPr>
-          <w:lang w:eastAsia="zh-CN"/>
-        </w:rPr>
-        <w:t>ViT</w:t>
-      </w:r>
-      <w:proofErr w:type="spellEnd"/>
-      <w:r>
-        <w:rPr>
-          <w:lang w:eastAsia="zh-CN"/>
-        </w:rPr>
-        <w:t xml:space="preserve"> backbone, data split, </w:t>
-      </w:r>
-      <w:proofErr w:type="spellStart"/>
-      <w:r>
-        <w:rPr>
-          <w:lang w:eastAsia="zh-CN"/>
-        </w:rPr>
-        <w:t>optimiser</w:t>
-      </w:r>
-      <w:proofErr w:type="spellEnd"/>
-      <w:r>
-        <w:rPr>
-          <w:lang w:eastAsia="zh-CN"/>
-        </w:rPr>
-        <w:t>, and checkpoint-selection rule are kept fixed. The main experimental factors are the positional encoding scheme, the assignment of positional vectors to physical patches, and the use of hybrid or dual-branch fusion components.</w:t>
-      </w:r>
+        <w:t>The study changes one main factor at a time rather than introducing a new general-purpose Transformer. Within each comparison, the ViT backbone, data split, optimiser and checkpoint-selection rule remain fixed. The factors that do change are the positional encoding, the assignment of positional vectors to physical patches, and, in the extension experiments, the use of hybrid or dual-branch fusion components. This design reduces the number of competing explanations for an observed accuracy difference.</w:t>
+      </w:r>
+      <w:bookmarkEnd w:id="6"/>
     </w:p>
     <w:p>
       <w:pPr>
@@ -3584,33 +3326,7 @@
         </w:rPr>
       </w:pPr>
       <w:r>
-        <w:rPr>
-          <w:lang w:eastAsia="zh-CN"/>
-        </w:rPr>
-        <w:t xml:space="preserve">The main evaluation is conducted on CIFAR-10 using five training seeds. The no-position model and the learnable absolute-position model serve as the main controls, while the fixed row-column encodings examine different ways of representing two-dimensional spatial information. Patch-assignment, hybrid, and fusion models are evaluated separately so that their additional design changes can be distinguished from the core positional-encoding comparison. CIFAR-100 is used to examine whether the observed positional-encoding trends </w:t>
-      </w:r>
-      <w:r>
-        <w:t>remain consistent</w:t>
-      </w:r>
-      <w:r>
-        <w:rPr>
-          <w:lang w:eastAsia="zh-CN"/>
-        </w:rPr>
-        <w:t xml:space="preserve"> on a more fine-grained classification task, while reduced-data CIFAR-10 evaluates their </w:t>
-      </w:r>
-      <w:proofErr w:type="spellStart"/>
-      <w:r>
-        <w:rPr>
-          <w:lang w:eastAsia="zh-CN"/>
-        </w:rPr>
-        <w:t>behaviour</w:t>
-      </w:r>
-      <w:proofErr w:type="spellEnd"/>
-      <w:r>
-        <w:rPr>
-          <w:lang w:eastAsia="zh-CN"/>
-        </w:rPr>
-        <w:t xml:space="preserve"> when less labelled training data are available.</w:t>
+        <w:t>The main evaluation uses CIFAR-10 and five training seeds. No PE provides a genuine no-position control, while learnable absolute PE provides the standard learned reference. Fixed row-column encodings then test different ways to represent the two-dimensional grid without trainable positional parameters. Patch-assignment, hybrid and fusion models are analysed separately because they change more than the core positional vector. CIFAR-100 tests whether the observed ranking is retained on a finer-grained classification problem, and reduced-data CIFAR-10 tests whether the relationship changes when fewer labelled images are available.</w:t>
       </w:r>
     </w:p>
     <w:bookmarkEnd w:id="6"/>
@@ -3624,43 +3340,7 @@
     </w:p>
     <w:p>
       <w:r>
-        <w:t xml:space="preserve">This study uses CIFAR-10 for the main controlled evaluation and CIFAR-100 as a more challenging extension. </w:t>
-      </w:r>
-      <w:r>
-        <w:t xml:space="preserve">Both datasets contain 32 × 32 RGB images and follow the same official training and test-set structure, allowing the same </w:t>
-      </w:r>
-      <w:proofErr w:type="spellStart"/>
-      <w:r>
-        <w:t>ViT</w:t>
-      </w:r>
-      <w:proofErr w:type="spellEnd"/>
-      <w:r>
-        <w:t xml:space="preserve"> architecture and training pipeline to be used for both</w:t>
-      </w:r>
-      <w:r>
-        <w:rPr>
-          <w:rFonts w:hint="eastAsia"/>
-          <w:lang w:eastAsia="zh-CN"/>
-        </w:rPr>
-        <w:t xml:space="preserve"> </w:t>
-      </w:r>
-      <w:r>
-        <w:fldChar w:fldCharType="begin"/>
-      </w:r>
-      <w:r>
-        <w:instrText xml:space="preserve"> ADDIN ZOTERO_ITEM CSL_CITATION {"citationID":"c4e71230","properties":{"unsorted":false,"formattedCitation":"[13]","plainCitation":"[13]","noteIndex":0},"citationItems":[{"id":311,"uris":["http://zotero.org/users/15596373/items/DY37KUI9"],"itemData":{"id":311,"type":"report","title":"Learning Multiple Layers of Features from Tiny Images","publisher":"University of Toronto","URL":"https://www.cs.toronto.edu/~kriz/learning-features-2009-TR.pdf","author":[{"family":"Krizhevsky","given":"Alex"}],"issued":{"date-parts":[[2009]]}}}]} </w:instrText>
-      </w:r>
-      <w:r>
-        <w:fldChar w:fldCharType="separate"/>
-      </w:r>
-      <w:r>
-        <w:t>[13]</w:t>
-      </w:r>
-      <w:r>
-        <w:fldChar w:fldCharType="end"/>
-      </w:r>
-      <w:r>
-        <w:t>. CIFAR-10 provides a manageable setting for repeated positional-encoding ablations. CIFAR-100 increases the number of classes from 10 to 100. This design examines whether observations obtained on CIFAR-10 are retained when the classification task becomes more fine-grained.</w:t>
+        <w:t>CIFAR-10 is used for the main controlled evaluation because its 32 × 32 images make repeated five-seed ablations practical. CIFAR-100 provides a harder extension while preserving the same image size and patch grid. Both datasets contain RGB images and use the same official structure of 50,000 training images and 10,000 test images [13]. CIFAR-10 has 10 broad classes, whereas CIFAR-100 has 100 finer-grained classes. The shared resolution allows the same ViT architecture to be used, so the second dataset changes classification difficulty without also changing the positional grid.</w:t>
       </w:r>
     </w:p>
     <w:p>
@@ -4123,125 +3803,227 @@
     </w:tbl>
     <w:p>
       <w:r>
-        <w:t xml:space="preserve">For both datasets, a fixed random permutation with split seed 42 divides the official 50,000-image training set into 45,000 training images and 5,000 validation images; the official 10,000-image test set remains separate. Training images are augmented using a random 32 × 32 crop with four-pixel padding and random horizontal flipping, while validation and test images are not augmented. Normalisation is applied independently to each colour channel as </w:t>
+        <w:t xml:space="preserve">For both datasets, a fixed random permutation with split seed 42 divides the official 50,000-image training set into 45,000 training images and 5,000 validation images; the official 10,000-image test set remains separate. Training images receive two simple augmentations: a random 32 × 32 crop after four-pixel padding and a random horizontal flip. Validation and test images are not augmented. Each colour channel is then normalised as </w:t>
       </w:r>
       <m:oMath>
         <m:sSup>
-          <m:sSupPr>
-            <m:ctrlPr>
-              <w:rPr>
-                <w:rFonts w:ascii="Cambria Math" w:hAnsi="Cambria Math"/>
-              </w:rPr>
-            </m:ctrlPr>
-          </m:sSupPr>
           <m:e>
             <m:r>
+              <m:t>x</m:t>
               <w:rPr>
                 <w:rFonts w:ascii="Cambria Math" w:hAnsi="Cambria Math"/>
-              </w:rPr>
-              <m:t>x</m:t>
+                <w:sz w:val="21"/>
+                <w:szCs w:val="21"/>
+              </w:rPr>
             </m:r>
           </m:e>
           <m:sup>
             <m:r>
+              <m:t>′</m:t>
               <w:rPr>
                 <w:rFonts w:ascii="Cambria Math" w:hAnsi="Cambria Math"/>
-              </w:rPr>
-              <m:t>'</m:t>
+                <w:sz w:val="21"/>
+                <w:szCs w:val="21"/>
+              </w:rPr>
             </m:r>
           </m:sup>
         </m:sSup>
         <m:r>
+          <m:t>=</m:t>
           <w:rPr>
             <w:rFonts w:ascii="Cambria Math" w:hAnsi="Cambria Math"/>
+            <w:sz w:val="21"/>
+            <w:szCs w:val="21"/>
           </w:rPr>
-          <m:t>=</m:t>
         </m:r>
         <m:f>
           <m:fPr>
-            <m:ctrlPr>
-              <w:rPr>
-                <w:rFonts w:ascii="Cambria Math" w:hAnsi="Cambria Math"/>
-              </w:rPr>
-            </m:ctrlPr>
+            <m:type m:val="bar"/>
           </m:fPr>
           <m:num>
             <m:r>
+              <m:t>x−μ</m:t>
               <w:rPr>
                 <w:rFonts w:ascii="Cambria Math" w:hAnsi="Cambria Math"/>
-              </w:rPr>
-              <m:t>x-μ</m:t>
+                <w:sz w:val="21"/>
+                <w:szCs w:val="21"/>
+              </w:rPr>
             </m:r>
           </m:num>
           <m:den>
             <m:r>
+              <m:t>σ</m:t>
               <w:rPr>
                 <w:rFonts w:ascii="Cambria Math" w:hAnsi="Cambria Math"/>
-              </w:rPr>
-              <m:t>σ</m:t>
+                <w:sz w:val="21"/>
+                <w:szCs w:val="21"/>
+              </w:rPr>
             </m:r>
           </m:den>
         </m:f>
       </m:oMath>
       <w:r>
-        <w:t xml:space="preserve">. The implementation uses </w:t>
+        <w:t xml:space="preserve">, where </w:t>
       </w:r>
       <m:oMath>
         <m:r>
+          <m:t>x</m:t>
           <w:rPr>
             <w:rFonts w:ascii="Cambria Math" w:hAnsi="Cambria Math"/>
+            <w:sz w:val="21"/>
+            <w:szCs w:val="21"/>
           </w:rPr>
-          <m:t>μ</m:t>
         </m:r>
       </m:oMath>
       <w:r>
-        <w:t xml:space="preserve"> = (0.4914, 0.4822, 0.4465) and </w:t>
+        <w:t xml:space="preserve"> is the original channel value and </w:t>
       </w:r>
       <m:oMath>
         <m:r>
+          <m:t>μ</m:t>
           <w:rPr>
             <w:rFonts w:ascii="Cambria Math" w:hAnsi="Cambria Math"/>
+            <w:sz w:val="21"/>
+            <w:szCs w:val="21"/>
           </w:rPr>
-          <m:t>σ</m:t>
         </m:r>
       </m:oMath>
       <w:r>
-        <w:t xml:space="preserve"> = (0.2470, 0.2435, 0.2616) for CIFAR-10, and </w:t>
+        <w:t xml:space="preserve"> and </w:t>
       </w:r>
       <m:oMath>
         <m:r>
+          <m:t>σ</m:t>
           <w:rPr>
             <w:rFonts w:ascii="Cambria Math" w:hAnsi="Cambria Math"/>
+            <w:sz w:val="21"/>
+            <w:szCs w:val="21"/>
           </w:rPr>
-          <m:t>μ</m:t>
         </m:r>
       </m:oMath>
       <w:r>
-        <w:t xml:space="preserve"> = (0.5071, 0.4867, 0.4408) and </w:t>
+        <w:t xml:space="preserve"> are the dataset-specific channel mean and standard deviation. CIFAR-10 uses </w:t>
       </w:r>
       <m:oMath>
         <m:r>
+          <m:t>μ=(0.4914,</m:t>
           <w:rPr>
             <w:rFonts w:ascii="Cambria Math" w:hAnsi="Cambria Math"/>
+            <w:sz w:val="21"/>
+            <w:szCs w:val="21"/>
           </w:rPr>
-          <m:t>σ</m:t>
+        </m:r>
+        <m:r>
+          <m:t>0.4822,</m:t>
+          <w:rPr>
+            <w:rFonts w:ascii="Cambria Math" w:hAnsi="Cambria Math"/>
+            <w:sz w:val="21"/>
+            <w:szCs w:val="21"/>
+          </w:rPr>
+        </m:r>
+        <m:r>
+          <m:t>0.4465)</m:t>
+          <w:rPr>
+            <w:rFonts w:ascii="Cambria Math" w:hAnsi="Cambria Math"/>
+            <w:sz w:val="21"/>
+            <w:szCs w:val="21"/>
+          </w:rPr>
         </m:r>
       </m:oMath>
       <w:r>
-        <w:t xml:space="preserve"> = (0.2675, 0.2565, 0.2761) for CIFAR-100.</w:t>
+        <w:t xml:space="preserve"> and </w:t>
+      </w:r>
+      <m:oMath>
+        <m:r>
+          <m:t>σ=(0.2470,</m:t>
+          <w:rPr>
+            <w:rFonts w:ascii="Cambria Math" w:hAnsi="Cambria Math"/>
+            <w:sz w:val="21"/>
+            <w:szCs w:val="21"/>
+          </w:rPr>
+        </m:r>
+        <m:r>
+          <m:t>0.2435,</m:t>
+          <w:rPr>
+            <w:rFonts w:ascii="Cambria Math" w:hAnsi="Cambria Math"/>
+            <w:sz w:val="21"/>
+            <w:szCs w:val="21"/>
+          </w:rPr>
+        </m:r>
+        <m:r>
+          <m:t>0.2616)</m:t>
+          <w:rPr>
+            <w:rFonts w:ascii="Cambria Math" w:hAnsi="Cambria Math"/>
+            <w:sz w:val="21"/>
+            <w:szCs w:val="21"/>
+          </w:rPr>
+        </m:r>
+      </m:oMath>
+      <w:r>
+        <w:t xml:space="preserve">; CIFAR-100 uses </w:t>
+      </w:r>
+      <m:oMath>
+        <m:r>
+          <m:t>μ=(0.5071,</m:t>
+          <w:rPr>
+            <w:rFonts w:ascii="Cambria Math" w:hAnsi="Cambria Math"/>
+            <w:sz w:val="21"/>
+            <w:szCs w:val="21"/>
+          </w:rPr>
+        </m:r>
+        <m:r>
+          <m:t>0.4867,</m:t>
+          <w:rPr>
+            <w:rFonts w:ascii="Cambria Math" w:hAnsi="Cambria Math"/>
+            <w:sz w:val="21"/>
+            <w:szCs w:val="21"/>
+          </w:rPr>
+        </m:r>
+        <m:r>
+          <m:t>0.4408)</m:t>
+          <w:rPr>
+            <w:rFonts w:ascii="Cambria Math" w:hAnsi="Cambria Math"/>
+            <w:sz w:val="21"/>
+            <w:szCs w:val="21"/>
+          </w:rPr>
+        </m:r>
+      </m:oMath>
+      <w:r>
+        <w:t xml:space="preserve"> and </w:t>
+      </w:r>
+      <m:oMath>
+        <m:r>
+          <m:t>σ=(0.2675,</m:t>
+          <w:rPr>
+            <w:rFonts w:ascii="Cambria Math" w:hAnsi="Cambria Math"/>
+            <w:sz w:val="21"/>
+            <w:szCs w:val="21"/>
+          </w:rPr>
+        </m:r>
+        <m:r>
+          <m:t>0.2565,</m:t>
+          <w:rPr>
+            <w:rFonts w:ascii="Cambria Math" w:hAnsi="Cambria Math"/>
+            <w:sz w:val="21"/>
+            <w:szCs w:val="21"/>
+          </w:rPr>
+        </m:r>
+        <m:r>
+          <m:t>0.2761)</m:t>
+          <w:rPr>
+            <w:rFonts w:ascii="Cambria Math" w:hAnsi="Cambria Math"/>
+            <w:sz w:val="21"/>
+            <w:szCs w:val="21"/>
+          </w:rPr>
+        </m:r>
+      </m:oMath>
+      <w:r>
+        <w:t>.</w:t>
       </w:r>
     </w:p>
     <w:p>
       <w:r>
-        <w:t xml:space="preserve">In addition to the full-data setting, reduced-data CIFAR-10 experiments use training subsets of 1,000, 5,000 and 10,000 images sampled from the fixed 45,000-image training pool. The formal comparison uses learnable absolute PE and shifted multiplicative PE with the common learning rate specified in Section 3.7. The validation and test sets remain unchanged. For each seed, the same sampled subset is shared by both models, enabling a paired comparison under identical training data. Subset composition varies across seeds, so the resulting variability reflects both parameter </w:t>
-      </w:r>
-      <w:proofErr w:type="spellStart"/>
-      <w:r>
-        <w:t>initialisation</w:t>
-      </w:r>
-      <w:proofErr w:type="spellEnd"/>
-      <w:r>
-        <w:t xml:space="preserve"> and training-subset selection.</w:t>
+        <w:t>The reduced-data study draws subsets of 1,000, 5,000 and 10,000 images from the fixed 45,000-image CIFAR-10 training pool. It compares learnable absolute PE with shifted multiplicative PE using the common learning rate in Section 3.7; validation and test sets do not change. Within a seed, both models receive exactly the same subset, which makes their difference a paired comparison rather than a comparison of two different samples. The subset itself changes across seeds, so the reported variation includes both parameter initialisation and which training images were selected.</w:t>
       </w:r>
     </w:p>
     <w:p>
@@ -4255,32 +4037,9 @@
     <w:p>
       <w:bookmarkStart w:id="7" w:name="OLE_LINK3"/>
       <w:r>
-        <w:t xml:space="preserve">All single-branch models use the same Vision Transformer architecture </w:t>
-      </w:r>
-      <w:r>
-        <w:fldChar w:fldCharType="begin"/>
-      </w:r>
-      <w:r>
-        <w:instrText xml:space="preserve"> ADDIN ZOTERO_ITEM CSL_CITATION {"citationID":"IeuOi07K","properties":{"unsorted":false,"formattedCitation":"[1]","plainCitation":"[1]","noteIndex":0},"citationItems":[{"id":9,"uris":["http://zotero.org/users/15596373/items/PV84RS4V"],"itemData":{"id":9,"type":"article","abstract":"While the Transformer architecture has become the de-facto standard for natural language processing tasks, its applications to computer vision remain limited. In vision, attention is either applied in conjunction with convolutional networks, or used to replace certain components of convolutional networks while keeping their overall structure in place. We show that this reliance on CNNs is not necessary and a pure transformer applied directly to sequences of image patches can perform very well on image classification tasks. When pre-trained on large amounts of data and transferred to multiple mid-sized or small image recognition benchmarks (ImageNet, CIFAR-100, VTAB, etc.), Vision Transformer (ViT) attains excellent results compared to state-of-the-art convolutional networks while requiring substantially fewer computational resources to train.","DOI":"10.48550/arXiv.2010.11929","language":"en","note":"arXiv:2010.11929 [cs]","number":"arXiv:2010.11929","publisher":"arXiv","source":"arXiv.org","title":"An Image is Worth 16x16 Words: Transformers for Image Recognition at Scale","title-short":"An Image is Worth 16x16 Words","URL":"http://arxiv.org/abs/2010.11929","author":[{"family":"Dosovitskiy","given":"Alexey"},{"family":"Beyer","given":"Lucas"},{"family":"Kolesnikov","given":"Alexander"},{"family":"Weissenborn","given":"Dirk"},{"family":"Zhai","given":"Xiaohua"},{"family":"Unterthiner","given":"Thomas"},{"family":"Dehghani","given":"Mostafa"},{"family":"Minderer","given":"Matthias"},{"family":"Heigold","given":"Georg"},{"family":"Gelly","given":"Sylvain"},{"family":"Uszkoreit","given":"Jakob"},{"family":"Houlsby","given":"Neil"}],"accessed":{"date-parts":[["2026",1,10]]},"issued":{"date-parts":[["2021",6,3]]}}}]} </w:instrText>
-      </w:r>
-      <w:r>
-        <w:fldChar w:fldCharType="separate"/>
-      </w:r>
-      <w:r>
-        <w:rPr>
-          <w:noProof/>
-        </w:rPr>
-        <w:t>[1]</w:t>
-      </w:r>
-      <w:r>
-        <w:fldChar w:fldCharType="end"/>
-      </w:r>
-      <w:r>
-        <w:t xml:space="preserve">. </w:t>
-      </w:r>
-      <w:r>
-        <w:t>Each 32 × 32 RGB image is divided into an 8 × 8 grid of patch embeddings using a 4 × 4 convolution with stride 4, resulting in 64 patch tokens. A learnable classification token is then prepended, producing a sequence of 65 tokens with an embedding dimension of 128.</w:t>
-      </w:r>
+        <w:t>All single-branch models use the same small Vision Transformer architecture [1]. A 4 × 4 convolution with stride 4 divides each 32 × 32 RGB image into an 8 × 8 grid, producing 64 patch tokens. A learnable classification token is placed at the start of this sequence. The encoder therefore receives 65 tokens, each represented by 128 numbers.</w:t>
+      </w:r>
+      <w:bookmarkEnd w:id="7"/>
     </w:p>
     <w:bookmarkEnd w:id="7"/>
     <w:p>
@@ -4290,63 +4049,89 @@
         </w:rPr>
       </w:pPr>
       <w:r>
-        <w:t xml:space="preserve">The encoder consists of four pre-normalisation Transformer blocks. Each block contains four self-attention heads and a two-layer MLP with a hidden dimension of 512 and GELU activation. Layer normalisation is applied before both sublayers, giving the residual updates </w:t>
+        <w:t xml:space="preserve">The encoder contains four pre-normalisation Transformer blocks. Pre-normalisation means that layer normalisation is applied before the attention or MLP sublayer. If </w:t>
+      </w:r>
+      <m:oMath>
+        <m:r>
+          <m:t>x</m:t>
+          <w:rPr>
+            <w:rFonts w:ascii="Cambria Math" w:hAnsi="Cambria Math"/>
+            <w:sz w:val="21"/>
+            <w:szCs w:val="21"/>
+          </w:rPr>
+        </m:r>
+      </m:oMath>
+      <w:r>
+        <w:t xml:space="preserve"> is a block input, the two residual updates are </w:t>
       </w:r>
       <m:oMath>
         <m:sSup>
-          <m:sSupPr>
-            <m:ctrlPr>
-              <w:rPr>
-                <w:rFonts w:ascii="Cambria Math" w:hAnsi="Cambria Math"/>
-              </w:rPr>
-            </m:ctrlPr>
-          </m:sSupPr>
           <m:e>
             <m:r>
+              <m:t>x</m:t>
               <w:rPr>
                 <w:rFonts w:ascii="Cambria Math" w:hAnsi="Cambria Math"/>
-              </w:rPr>
-              <m:t>x</m:t>
+                <w:sz w:val="21"/>
+                <w:szCs w:val="21"/>
+              </w:rPr>
             </m:r>
           </m:e>
           <m:sup>
             <m:r>
+              <m:t>′</m:t>
               <w:rPr>
                 <w:rFonts w:ascii="Cambria Math" w:hAnsi="Cambria Math"/>
-              </w:rPr>
-              <m:t>'</m:t>
+                <w:sz w:val="21"/>
+                <w:szCs w:val="21"/>
+              </w:rPr>
             </m:r>
           </m:sup>
         </m:sSup>
         <m:r>
+          <m:t>=x+</m:t>
           <w:rPr>
             <w:rFonts w:ascii="Cambria Math" w:hAnsi="Cambria Math"/>
+            <w:sz w:val="21"/>
+            <w:szCs w:val="21"/>
           </w:rPr>
-          <m:t>=x+</m:t>
         </m:r>
         <m:r>
           <m:rPr>
             <m:nor/>
           </m:rPr>
           <m:t>MSA</m:t>
+          <w:rPr>
+            <w:rFonts w:ascii="Cambria Math" w:hAnsi="Cambria Math"/>
+            <w:sz w:val="21"/>
+            <w:szCs w:val="21"/>
+          </w:rPr>
         </m:r>
         <m:r>
+          <m:t>(</m:t>
           <w:rPr>
             <w:rFonts w:ascii="Cambria Math" w:hAnsi="Cambria Math"/>
+            <w:sz w:val="21"/>
+            <w:szCs w:val="21"/>
           </w:rPr>
-          <m:t>(</m:t>
         </m:r>
         <m:r>
           <m:rPr>
             <m:nor/>
           </m:rPr>
           <m:t>LN</m:t>
+          <w:rPr>
+            <w:rFonts w:ascii="Cambria Math" w:hAnsi="Cambria Math"/>
+            <w:sz w:val="21"/>
+            <w:szCs w:val="21"/>
+          </w:rPr>
         </m:r>
         <m:r>
+          <m:t>(x))</m:t>
           <w:rPr>
             <w:rFonts w:ascii="Cambria Math" w:hAnsi="Cambria Math"/>
+            <w:sz w:val="21"/>
+            <w:szCs w:val="21"/>
           </w:rPr>
-          <m:t>(x))</m:t>
         </m:r>
       </m:oMath>
       <w:r>
@@ -4354,125 +4139,136 @@
       </w:r>
       <m:oMath>
         <m:sSup>
-          <m:sSupPr>
-            <m:ctrlPr>
-              <w:rPr>
-                <w:rFonts w:ascii="Cambria Math" w:hAnsi="Cambria Math"/>
-              </w:rPr>
-            </m:ctrlPr>
-          </m:sSupPr>
           <m:e>
             <m:r>
+              <m:t>x</m:t>
               <w:rPr>
                 <w:rFonts w:ascii="Cambria Math" w:hAnsi="Cambria Math"/>
-              </w:rPr>
-              <m:t>x</m:t>
+                <w:sz w:val="21"/>
+                <w:szCs w:val="21"/>
+              </w:rPr>
             </m:r>
           </m:e>
           <m:sup>
             <m:r>
+              <m:t>″</m:t>
               <w:rPr>
                 <w:rFonts w:ascii="Cambria Math" w:hAnsi="Cambria Math"/>
-              </w:rPr>
-              <m:t>″</m:t>
+                <w:sz w:val="21"/>
+                <w:szCs w:val="21"/>
+              </w:rPr>
             </m:r>
           </m:sup>
         </m:sSup>
         <m:r>
+          <m:t>=</m:t>
           <w:rPr>
             <w:rFonts w:ascii="Cambria Math" w:hAnsi="Cambria Math"/>
+            <w:sz w:val="21"/>
+            <w:szCs w:val="21"/>
           </w:rPr>
-          <m:t>=</m:t>
         </m:r>
         <m:sSup>
-          <m:sSupPr>
-            <m:ctrlPr>
-              <w:rPr>
-                <w:rFonts w:ascii="Cambria Math" w:hAnsi="Cambria Math"/>
-              </w:rPr>
-            </m:ctrlPr>
-          </m:sSupPr>
           <m:e>
             <m:r>
+              <m:t>x</m:t>
               <w:rPr>
                 <w:rFonts w:ascii="Cambria Math" w:hAnsi="Cambria Math"/>
-              </w:rPr>
-              <m:t>x</m:t>
+                <w:sz w:val="21"/>
+                <w:szCs w:val="21"/>
+              </w:rPr>
             </m:r>
           </m:e>
           <m:sup>
             <m:r>
+              <m:t>′</m:t>
               <w:rPr>
                 <w:rFonts w:ascii="Cambria Math" w:hAnsi="Cambria Math"/>
-              </w:rPr>
-              <m:t>'</m:t>
+                <w:sz w:val="21"/>
+                <w:szCs w:val="21"/>
+              </w:rPr>
             </m:r>
           </m:sup>
         </m:sSup>
         <m:r>
+          <m:t>+</m:t>
           <w:rPr>
             <w:rFonts w:ascii="Cambria Math" w:hAnsi="Cambria Math"/>
+            <w:sz w:val="21"/>
+            <w:szCs w:val="21"/>
           </w:rPr>
-          <m:t>+</m:t>
         </m:r>
         <m:r>
           <m:rPr>
             <m:nor/>
           </m:rPr>
           <m:t>MLP</m:t>
+          <w:rPr>
+            <w:rFonts w:ascii="Cambria Math" w:hAnsi="Cambria Math"/>
+            <w:sz w:val="21"/>
+            <w:szCs w:val="21"/>
+          </w:rPr>
         </m:r>
         <m:r>
+          <m:t>(</m:t>
           <w:rPr>
             <w:rFonts w:ascii="Cambria Math" w:hAnsi="Cambria Math"/>
+            <w:sz w:val="21"/>
+            <w:szCs w:val="21"/>
           </w:rPr>
-          <m:t>(</m:t>
         </m:r>
         <m:r>
           <m:rPr>
             <m:nor/>
           </m:rPr>
           <m:t>LN</m:t>
+          <w:rPr>
+            <w:rFonts w:ascii="Cambria Math" w:hAnsi="Cambria Math"/>
+            <w:sz w:val="21"/>
+            <w:szCs w:val="21"/>
+          </w:rPr>
         </m:r>
         <m:r>
+          <m:t>(</m:t>
           <w:rPr>
             <w:rFonts w:ascii="Cambria Math" w:hAnsi="Cambria Math"/>
+            <w:sz w:val="21"/>
+            <w:szCs w:val="21"/>
           </w:rPr>
-          <m:t>(</m:t>
         </m:r>
         <m:sSup>
-          <m:sSupPr>
-            <m:ctrlPr>
-              <w:rPr>
-                <w:rFonts w:ascii="Cambria Math" w:hAnsi="Cambria Math"/>
-              </w:rPr>
-            </m:ctrlPr>
-          </m:sSupPr>
           <m:e>
             <m:r>
+              <m:t>x</m:t>
               <w:rPr>
                 <w:rFonts w:ascii="Cambria Math" w:hAnsi="Cambria Math"/>
-              </w:rPr>
-              <m:t>x</m:t>
+                <w:sz w:val="21"/>
+                <w:szCs w:val="21"/>
+              </w:rPr>
             </m:r>
           </m:e>
           <m:sup>
             <m:r>
+              <m:t>′</m:t>
               <w:rPr>
                 <w:rFonts w:ascii="Cambria Math" w:hAnsi="Cambria Math"/>
-              </w:rPr>
-              <m:t>'</m:t>
+                <w:sz w:val="21"/>
+                <w:szCs w:val="21"/>
+              </w:rPr>
             </m:r>
           </m:sup>
         </m:sSup>
         <m:r>
+          <m:t>))</m:t>
           <w:rPr>
             <w:rFonts w:ascii="Cambria Math" w:hAnsi="Cambria Math"/>
+            <w:sz w:val="21"/>
+            <w:szCs w:val="21"/>
           </w:rPr>
-          <m:t>))</m:t>
         </m:r>
       </m:oMath>
       <w:r>
-        <w:t>. A final layer-normalisation step is applied before the linear classification head. Embedding, attention, projection, and MLP dropout are set to zero in the formal CIFAR-10 experiments. The no-PE and fixed-PE single-branch variants each contain 801,034 trainable parameters on CIFAR-10, while the learnable positional embedding increases the total to 809,354.</w:t>
+        <w:t>. Here, MSA denotes multi-head self-attention and LN denotes layer normalisation. Each attention module has four heads. The MLP expands the 128-component representation to 512 components, applies GELU, and projects it back to 128. A final layer normalisation precedes the linear classifier. Dropout is zero in the formal CIFAR-10 runs. On CIFAR-10, no-PE and fixed-PE single-branch models contain 801,034 trainable parameters; adding the learnable positional table raises the total to 809,354.</w:t>
       </w:r>
     </w:p>
     <w:p>
@@ -5148,53 +4944,9 @@
       </w:pPr>
       <w:bookmarkStart w:id="8" w:name="OLE_LINK4"/>
       <w:r>
-        <w:rPr>
-          <w:sz w:val="21"/>
-        </w:rPr>
-        <w:t xml:space="preserve">Table 2 </w:t>
-      </w:r>
-      <w:proofErr w:type="spellStart"/>
-      <w:r>
-        <w:rPr>
-          <w:sz w:val="21"/>
-        </w:rPr>
-        <w:t>summarises</w:t>
-      </w:r>
-      <w:proofErr w:type="spellEnd"/>
-      <w:r>
-        <w:rPr>
-          <w:sz w:val="21"/>
-        </w:rPr>
-        <w:t xml:space="preserve"> the architecture shared by all single-branch models. The same </w:t>
-      </w:r>
-      <w:proofErr w:type="spellStart"/>
-      <w:r>
-        <w:rPr>
-          <w:sz w:val="21"/>
-        </w:rPr>
-        <w:t>ViT</w:t>
-      </w:r>
-      <w:proofErr w:type="spellEnd"/>
-      <w:r>
-        <w:rPr>
-          <w:sz w:val="21"/>
-        </w:rPr>
-        <w:t xml:space="preserve"> configuration is used for both CIFAR-10 and CIFAR-100; only the output layer and dataset-specific </w:t>
-      </w:r>
-      <w:proofErr w:type="spellStart"/>
-      <w:r>
-        <w:rPr>
-          <w:sz w:val="21"/>
-        </w:rPr>
-        <w:t>normalisation</w:t>
-      </w:r>
-      <w:proofErr w:type="spellEnd"/>
-      <w:r>
-        <w:rPr>
-          <w:sz w:val="21"/>
-        </w:rPr>
-        <w:t xml:space="preserve"> are changed.</w:t>
-      </w:r>
+        <w:t>Table 2 summarises the shared single-branch architecture. CIFAR-10 and CIFAR-100 use the same patch projection and encoder; only dataset-specific normalisation and the classifier output size change. Keeping the token grid and encoder fixed makes the cross-dataset comparison easier to interpret.</w:t>
+      </w:r>
+      <w:bookmarkEnd w:id="8"/>
     </w:p>
     <w:bookmarkEnd w:id="8"/>
     <w:p>
@@ -5207,14 +4959,21 @@
     </w:p>
     <w:p>
       <w:r>
-        <w:t xml:space="preserve">This section describes the positional-encoding methods evaluated using the shared ViT architecture. In the main comparison, positional encoding is the only model component that changes. Under the default row-major arrangement, the 64 patches form an 8 × 8 grid. Patch index </w:t>
+        <w:t>All models in this section use the same patch projection, Transformer encoder and classifier described in Section 3.3. The only change in the main comparison is the positional term added to the token sequence before it enters the encoder. This keeps the visual input and network unchanged while asking a simple question: how should the model be told where each patch came from? The no-PE and learnable models provide two controls, while the fixed variants encode selected properties of the two-dimensional patch grid. Table 3 summarises the resulting configurations.</w:t>
+      </w:r>
+    </w:p>
+    <w:p>
+      <w:r>
+        <w:t xml:space="preserve">Under the default row-major arrangement, the 64 patches form an 8 × 8 grid. Rows and columns are numbered from 0 to 7, starting at the top-left corner. Patch index </w:t>
       </w:r>
       <m:oMath>
         <m:r>
+          <m:t>j∈{0,…,63}</m:t>
           <w:rPr>
             <w:rFonts w:ascii="Cambria Math" w:hAnsi="Cambria Math"/>
+            <w:sz w:val="21"/>
+            <w:szCs w:val="21"/>
           </w:rPr>
-          <m:t>j∈{0,…,63}</m:t>
         </m:r>
       </m:oMath>
       <w:r>
@@ -5222,41 +4981,45 @@
       </w:r>
       <m:oMath>
         <m:r>
+          <m:t>r=⌊</m:t>
           <w:rPr>
             <w:rFonts w:ascii="Cambria Math" w:hAnsi="Cambria Math"/>
+            <w:sz w:val="21"/>
+            <w:szCs w:val="21"/>
           </w:rPr>
-          <m:t>r=⌊</m:t>
         </m:r>
         <m:f>
           <m:fPr>
-            <m:ctrlPr>
-              <w:rPr>
-                <w:rFonts w:ascii="Cambria Math" w:hAnsi="Cambria Math"/>
-              </w:rPr>
-            </m:ctrlPr>
+            <m:type m:val="bar"/>
           </m:fPr>
           <m:num>
             <m:r>
+              <m:t>j</m:t>
               <w:rPr>
                 <w:rFonts w:ascii="Cambria Math" w:hAnsi="Cambria Math"/>
-              </w:rPr>
-              <m:t>j</m:t>
+                <w:sz w:val="21"/>
+                <w:szCs w:val="21"/>
+              </w:rPr>
             </m:r>
           </m:num>
           <m:den>
             <m:r>
+              <m:t>8</m:t>
               <w:rPr>
                 <w:rFonts w:ascii="Cambria Math" w:hAnsi="Cambria Math"/>
-              </w:rPr>
-              <m:t>8</m:t>
+                <w:sz w:val="21"/>
+                <w:szCs w:val="21"/>
+              </w:rPr>
             </m:r>
           </m:den>
         </m:f>
         <m:r>
+          <m:t>⌋</m:t>
           <w:rPr>
             <w:rFonts w:ascii="Cambria Math" w:hAnsi="Cambria Math"/>
+            <w:sz w:val="21"/>
+            <w:szCs w:val="21"/>
           </w:rPr>
-          <m:t>⌋</m:t>
         </m:r>
       </m:oMath>
       <w:r>
@@ -5264,22 +5027,31 @@
       </w:r>
       <m:oMath>
         <m:r>
+          <m:t>c=j</m:t>
           <w:rPr>
             <w:rFonts w:ascii="Cambria Math" w:hAnsi="Cambria Math"/>
+            <w:sz w:val="21"/>
+            <w:szCs w:val="21"/>
           </w:rPr>
-          <m:t>c=j</m:t>
         </m:r>
         <m:r>
           <m:rPr>
             <m:nor/>
           </m:rPr>
           <m:t>mod</m:t>
+          <w:rPr>
+            <w:rFonts w:ascii="Cambria Math" w:hAnsi="Cambria Math"/>
+            <w:sz w:val="21"/>
+            <w:szCs w:val="21"/>
+          </w:rPr>
         </m:r>
         <m:r>
+          <m:t>8</m:t>
           <w:rPr>
             <w:rFonts w:ascii="Cambria Math" w:hAnsi="Cambria Math"/>
+            <w:sz w:val="21"/>
+            <w:szCs w:val="21"/>
           </w:rPr>
-          <m:t>8</m:t>
         </m:r>
       </m:oMath>
       <w:r>
@@ -5287,47 +5059,55 @@
       </w:r>
       <m:oMath>
         <m:r>
+          <m:t>S(p)</m:t>
           <w:rPr>
             <w:rFonts w:ascii="Cambria Math" w:hAnsi="Cambria Math"/>
+            <w:sz w:val="21"/>
+            <w:szCs w:val="21"/>
           </w:rPr>
-          <m:t>S(p)</m:t>
         </m:r>
       </m:oMath>
       <w:r>
-        <w:t xml:space="preserve"> denotes the </w:t>
+        <w:t xml:space="preserve"> denotes the sinusoidal mapping in Equation (1). It converts one scalar coordinate </w:t>
       </w:r>
       <m:oMath>
         <m:r>
+          <m:t>p</m:t>
           <w:rPr>
             <w:rFonts w:ascii="Cambria Math" w:hAnsi="Cambria Math"/>
+            <w:sz w:val="21"/>
+            <w:szCs w:val="21"/>
           </w:rPr>
-          <m:t>d</m:t>
         </m:r>
       </m:oMath>
       <w:r>
-        <w:t xml:space="preserve">-dimensional sinusoidal mapping defined in Equation (1), where </w:t>
+        <w:t xml:space="preserve"> into a vector with 128 components. Here, </w:t>
       </w:r>
       <m:oMath>
         <m:r>
+          <m:t>d=128</m:t>
           <w:rPr>
             <w:rFonts w:ascii="Cambria Math" w:hAnsi="Cambria Math"/>
+            <w:sz w:val="21"/>
+            <w:szCs w:val="21"/>
           </w:rPr>
-          <m:t>d=128</m:t>
         </m:r>
       </m:oMath>
       <w:r>
-        <w:t xml:space="preserve">. Depending on the positional-encoding design, </w:t>
+        <w:t xml:space="preserve"> is the embedding dimension defined in Equation (1). Depending on the design, </w:t>
       </w:r>
       <m:oMath>
         <m:r>
+          <m:t>p</m:t>
           <w:rPr>
             <w:rFonts w:ascii="Cambria Math" w:hAnsi="Cambria Math"/>
+            <w:sz w:val="21"/>
+            <w:szCs w:val="21"/>
           </w:rPr>
-          <m:t>p</m:t>
         </m:r>
       </m:oMath>
       <w:r>
-        <w:t xml:space="preserve"> represents a row coordinate, a column coordinate, or a value derived from both.</w:t>
+        <w:t xml:space="preserve"> is a row coordinate, a column coordinate, or a scalar derived from both.</w:t>
       </w:r>
     </w:p>
     <w:p>
@@ -5337,7 +5117,7 @@
         </w:rPr>
       </w:pPr>
       <w:r>
-        <w:t>Fixed positional tensors are calculated once from the grid coordinates and stored as non-trainable buffers. The classification-token position receives a zero vector, so the fixed encoding is added only to the 64 patch tokens. These encodings therefore add no trainable positional parameters.</w:t>
+        <w:t>For every fixed method, the 64 patch-position vectors are calculated once when the model is created and stored as a non-trainable tensor. The classification token receives a zero vector because it does not correspond to a physical image location; fixed positional information is therefore added only to the patch tokens. This provides a deterministic spatial signal without adding trainable parameters, but the signal cannot adapt to the training data. All fixed methods add their vectors at the same point in the network, which keeps the comparison focused on the positional representation itself.</w:t>
       </w:r>
     </w:p>
     <w:p>
@@ -5350,51 +5130,75 @@
     </w:p>
     <w:p>
       <w:r>
-        <w:t xml:space="preserve">In the no-PE baseline, the token sequence described in Section 3.3 enters the Transformer encoder without an added positional term. The learnable absolute PE model instead adds a trainable positional tensor </w:t>
+        <w:t>The no-PE baseline adds no positional term. Its patch tokens contain visual content, but they carry no explicit row, column or sequence-position label. This model measures how well the shared encoder performs without being told where the patches originated, so the effect of adding positional information can be assessed against a genuine no-position control.</w:t>
+      </w:r>
+    </w:p>
+    <w:p>
+      <w:r>
+        <w:t xml:space="preserve">The learnable absolute PE model instead adds a trainable tensor </w:t>
       </w:r>
       <m:oMath>
         <m:r>
+          <m:t>L∈</m:t>
           <w:rPr>
             <w:rFonts w:ascii="Cambria Math" w:hAnsi="Cambria Math"/>
+            <w:sz w:val="21"/>
+            <w:szCs w:val="21"/>
           </w:rPr>
-          <m:t>L∈</m:t>
         </m:r>
         <m:sSup>
-          <m:sSupPr>
-            <m:ctrlPr>
-              <w:rPr>
-                <w:rFonts w:ascii="Cambria Math" w:hAnsi="Cambria Math"/>
-              </w:rPr>
-            </m:ctrlPr>
-          </m:sSupPr>
           <m:e>
             <m:r>
               <m:rPr>
                 <m:scr m:val="double-struck"/>
                 <m:sty m:val="p"/>
               </m:rPr>
+              <m:t>R</m:t>
               <w:rPr>
                 <w:rFonts w:ascii="Cambria Math" w:hAnsi="Cambria Math"/>
-              </w:rPr>
-              <m:t>R</m:t>
+                <w:sz w:val="21"/>
+                <w:szCs w:val="21"/>
+              </w:rPr>
             </m:r>
           </m:e>
           <m:sup>
             <m:r>
+              <m:t>1×65×128</m:t>
               <w:rPr>
                 <w:rFonts w:ascii="Cambria Math" w:hAnsi="Cambria Math"/>
-              </w:rPr>
-              <m:t>1×65×128</m:t>
+                <w:sz w:val="21"/>
+                <w:szCs w:val="21"/>
+              </w:rPr>
             </m:r>
           </m:sup>
         </m:sSup>
       </m:oMath>
       <w:r>
-        <w:t xml:space="preserve"> to the same sequence. The tensor is shared across </w:t>
-      </w:r>
-      <w:r>
-        <w:lastRenderedPageBreak/>
-        <w:t>input images, but it contains one 128-dimensional vector for the classification-token position and one for each of the 64 patch positions. It is initialised to zero and updated during training, introducing 65 × 128 = 8,320 trainable parameters.</w:t>
+        <w:t xml:space="preserve"> to the same token sequence. The 65 positions comprise the classification-token slot and the 64 patch slots, with one 128-component vector for each. The tensor is shared across input images, initialised to zero and updated during training, adding </w:t>
+      </w:r>
+      <m:oMath>
+        <m:r>
+          <m:t>65×128=</m:t>
+          <w:rPr>
+            <w:rFonts w:ascii="Cambria Math" w:hAnsi="Cambria Math"/>
+            <w:sz w:val="21"/>
+            <w:szCs w:val="21"/>
+          </w:rPr>
+        </m:r>
+        <m:r>
+          <m:rPr>
+            <m:sty m:val="p"/>
+          </m:rPr>
+          <m:t>8,320</m:t>
+          <w:rPr>
+            <w:rFonts w:ascii="Cambria Math" w:hAnsi="Cambria Math"/>
+            <w:sz w:val="21"/>
+            <w:szCs w:val="21"/>
+          </w:rPr>
+        </m:r>
+      </m:oMath>
+      <w:r>
+        <w:t xml:space="preserve"> trainable parameters. This flexibility allows each slot to learn its own vector, but it does not impose an explicit relationship between neighbouring rows or columns. It serves as the main learned reference because it follows the absolute-position design used by the original ViT [1].</w:t>
       </w:r>
     </w:p>
     <w:p>
@@ -5407,36 +5211,59 @@
     </w:p>
     <w:p>
       <w:r>
-        <w:t xml:space="preserve">The row-wise and column-wise fixed encodings use one grid coordinate at a time. For a patch at coordinate </w:t>
+        <w:t xml:space="preserve">The row-wise and column-wise encodings isolate one spatial coordinate at a time. For a patch at grid coordinate </w:t>
       </w:r>
       <m:oMath>
         <m:r>
+          <m:t>(r,c)</m:t>
           <w:rPr>
             <w:rFonts w:ascii="Cambria Math" w:hAnsi="Cambria Math"/>
+            <w:sz w:val="21"/>
+            <w:szCs w:val="21"/>
           </w:rPr>
-          <m:t>(r,c)</m:t>
         </m:r>
       </m:oMath>
       <w:r>
-        <w:t>, the row-wise model assigns the same vector to every patch in a row. The column-wise model assigns the same vector to every patch in a column. These encodings are defined in Equation (</w:t>
-      </w:r>
-      <w:r>
-        <w:fldChar w:fldCharType="begin"/>
-      </w:r>
-      <w:r>
-        <w:instrText xml:space="preserve"> REF eq6 \h </w:instrText>
-      </w:r>
-      <w:r>
-        <w:fldChar w:fldCharType="separate"/>
+        <w:t xml:space="preserve">, the row-wise model assigns the same positional vector to all eight patches in row </w:t>
       </w:r>
       <m:oMath>
         <m:r>
+          <m:t>r</m:t>
           <w:rPr>
             <w:rFonts w:ascii="Cambria Math" w:hAnsi="Cambria Math"/>
+            <w:sz w:val="21"/>
+            <w:szCs w:val="21"/>
           </w:rPr>
-          <m:t>6</m:t>
         </m:r>
       </m:oMath>
+      <w:r>
+        <w:t xml:space="preserve">. The column-wise model does the same for all patches in column </w:t>
+      </w:r>
+      <m:oMath>
+        <m:r>
+          <m:t>c</m:t>
+          <w:rPr>
+            <w:rFonts w:ascii="Cambria Math" w:hAnsi="Cambria Math"/>
+            <w:sz w:val="21"/>
+            <w:szCs w:val="21"/>
+          </w:rPr>
+        </m:r>
+      </m:oMath>
+      <w:r>
+        <w:t>, as defined in Equation (</w:t>
+      </w:r>
+      <w:r>
+        <w:fldChar w:fldCharType="begin"/>
+      </w:r>
+      <w:r>
+        <w:instrText xml:space="preserve"> REF eq6 \h </w:instrText>
+      </w:r>
+      <w:r>
+        <w:fldChar w:fldCharType="separate"/>
+      </w:r>
+      <w:r>
+        <w:t>6</w:t>
+      </w:r>
       <w:r>
         <w:fldChar w:fldCharType="end"/>
       </w:r>
@@ -5555,6 +5382,104 @@
     </w:p>
     <w:p>
       <w:pPr>
+        <w:keepLines/>
+        <w:jc w:val="center"/>
+      </w:pPr>
+      <w:r>
+        <w:t xml:space="preserve">Here, </w:t>
+      </w:r>
+      <m:oMath>
+        <m:sSub>
+          <m:e>
+            <m:r>
+              <m:t>P</m:t>
+              <w:rPr>
+                <w:rFonts w:ascii="Cambria Math" w:hAnsi="Cambria Math"/>
+                <w:sz w:val="21"/>
+                <w:szCs w:val="21"/>
+              </w:rPr>
+            </m:r>
+          </m:e>
+          <m:sub>
+            <m:r>
+              <m:rPr>
+                <m:nor/>
+              </m:rPr>
+              <m:t>row</m:t>
+              <w:rPr>
+                <w:rFonts w:ascii="Cambria Math" w:hAnsi="Cambria Math"/>
+                <w:sz w:val="21"/>
+                <w:szCs w:val="21"/>
+              </w:rPr>
+            </m:r>
+          </m:sub>
+        </m:sSub>
+        <m:r>
+          <m:t>(r,c)</m:t>
+          <w:rPr>
+            <w:rFonts w:ascii="Cambria Math" w:hAnsi="Cambria Math"/>
+            <w:sz w:val="21"/>
+            <w:szCs w:val="21"/>
+          </w:rPr>
+        </m:r>
+      </m:oMath>
+      <w:r>
+        <w:t xml:space="preserve"> and </w:t>
+      </w:r>
+      <m:oMath>
+        <m:sSub>
+          <m:e>
+            <m:r>
+              <m:t>P</m:t>
+              <w:rPr>
+                <w:rFonts w:ascii="Cambria Math" w:hAnsi="Cambria Math"/>
+                <w:sz w:val="21"/>
+                <w:szCs w:val="21"/>
+              </w:rPr>
+            </m:r>
+          </m:e>
+          <m:sub>
+            <m:r>
+              <m:rPr>
+                <m:nor/>
+              </m:rPr>
+              <m:t>col</m:t>
+              <w:rPr>
+                <w:rFonts w:ascii="Cambria Math" w:hAnsi="Cambria Math"/>
+                <w:sz w:val="21"/>
+                <w:szCs w:val="21"/>
+              </w:rPr>
+            </m:r>
+          </m:sub>
+        </m:sSub>
+        <m:r>
+          <m:t>(r,c)</m:t>
+          <w:rPr>
+            <w:rFonts w:ascii="Cambria Math" w:hAnsi="Cambria Math"/>
+            <w:sz w:val="21"/>
+            <w:szCs w:val="21"/>
+          </w:rPr>
+        </m:r>
+      </m:oMath>
+      <w:r>
+        <w:t xml:space="preserve"> are the 128-component terms added to the patch at </w:t>
+      </w:r>
+      <m:oMath>
+        <m:r>
+          <m:t>(r,c)</m:t>
+          <w:rPr>
+            <w:rFonts w:ascii="Cambria Math" w:hAnsi="Cambria Math"/>
+            <w:sz w:val="21"/>
+            <w:szCs w:val="21"/>
+          </w:rPr>
+        </m:r>
+      </m:oMath>
+      <w:r>
+        <w:t>. The row model can distinguish the eight rows but not different columns within one row; the column model has the opposite limitation. They are included as single-axis controls, showing how much each coordinate contributes before the two axes are combined.</w:t>
+      </w:r>
+    </w:p>
+    <w:p>
+      <w:pPr>
         <w:pStyle w:val="Heading3"/>
       </w:pPr>
       <w:r>
@@ -5563,79 +5488,98 @@
     </w:p>
     <w:p>
       <w:r>
-        <w:rPr>
-          <w:rFonts w:ascii="Arial" w:hAnsi="Arial" w:eastAsia="Arial" w:cs="Arial"/>
-          <w:color w:val="000000"/>
-          <w:sz w:val="22"/>
-        </w:rPr>
-        <w:t>The additive and multiplicative encodings combine the row and column vectors into a single positional vector without changing the 128-dimensional embedding size. The additive variant sums corresponding components, while the multiplicative variant takes their element-wise product, as defined in Equation (</w:t>
-      </w:r>
-      <w:r>
-        <w:rPr>
-          <w:rFonts w:ascii="Arial" w:hAnsi="Arial" w:eastAsia="Arial" w:cs="Arial"/>
-          <w:color w:val="000000"/>
-          <w:sz w:val="22"/>
-        </w:rPr>
+        <w:t>The additive and multiplicative designs use both grid coordinates while keeping the positional vector at 128 components. Addition sums each component of the row vector with the matching component of the column vector. This retains information from both axes, although different row-column pairs can produce similar sums. Multiplication instead forms a direct component-wise interaction between the two vectors; values near zero can weaken individual components. Equation (</w:t>
+      </w:r>
+      <w:r>
         <w:fldChar w:fldCharType="begin"/>
       </w:r>
       <w:r>
-        <w:rPr>
-          <w:rFonts w:ascii="Arial" w:hAnsi="Arial" w:eastAsia="Arial" w:cs="Arial"/>
-          <w:color w:val="000000"/>
-          <w:sz w:val="22"/>
-        </w:rPr>
         <w:instrText xml:space="preserve"> REF eq7 \h </w:instrText>
       </w:r>
       <w:r>
-        <w:rPr>
-          <w:rFonts w:ascii="Arial" w:hAnsi="Arial" w:eastAsia="Arial" w:cs="Arial"/>
-          <w:color w:val="000000"/>
-          <w:sz w:val="22"/>
-        </w:rPr>
         <w:fldChar w:fldCharType="separate"/>
       </w:r>
       <w:r>
-        <w:rPr>
-          <w:rFonts w:ascii="Arial" w:hAnsi="Arial" w:eastAsia="Arial" w:cs="Arial"/>
-          <w:color w:val="000000"/>
-          <w:sz w:val="22"/>
-        </w:rPr>
         <w:t>7</w:t>
       </w:r>
       <w:r>
-        <w:rPr>
-          <w:rFonts w:ascii="Arial" w:hAnsi="Arial" w:eastAsia="Arial" w:cs="Arial"/>
-          <w:color w:val="000000"/>
-          <w:sz w:val="22"/>
-        </w:rPr>
         <w:fldChar w:fldCharType="end"/>
       </w:r>
       <w:r>
-        <w:rPr>
-          <w:rFonts w:ascii="Arial" w:hAnsi="Arial" w:eastAsia="Arial" w:cs="Arial"/>
-          <w:color w:val="000000"/>
-          <w:sz w:val="22"/>
-        </w:rPr>
-        <w:t xml:space="preserve">). Here, </w:t>
+        <w:t xml:space="preserve">) defines both operations. Here, </w:t>
+      </w:r>
+      <m:oMath>
+        <m:sSub>
+          <m:e>
+            <m:r>
+              <m:t>P</m:t>
+              <w:rPr>
+                <w:rFonts w:ascii="Cambria Math" w:hAnsi="Cambria Math"/>
+                <w:sz w:val="21"/>
+                <w:szCs w:val="21"/>
+              </w:rPr>
+            </m:r>
+          </m:e>
+          <m:sub>
+            <m:r>
+              <m:rPr>
+                <m:nor/>
+              </m:rPr>
+              <m:t>add</m:t>
+              <w:rPr>
+                <w:rFonts w:ascii="Cambria Math" w:hAnsi="Cambria Math"/>
+                <w:sz w:val="21"/>
+                <w:szCs w:val="21"/>
+              </w:rPr>
+            </m:r>
+          </m:sub>
+        </m:sSub>
+      </m:oMath>
+      <w:r>
+        <w:t xml:space="preserve"> and </w:t>
+      </w:r>
+      <m:oMath>
+        <m:sSub>
+          <m:e>
+            <m:r>
+              <m:t>P</m:t>
+              <w:rPr>
+                <w:rFonts w:ascii="Cambria Math" w:hAnsi="Cambria Math"/>
+                <w:sz w:val="21"/>
+                <w:szCs w:val="21"/>
+              </w:rPr>
+            </m:r>
+          </m:e>
+          <m:sub>
+            <m:r>
+              <m:rPr>
+                <m:nor/>
+              </m:rPr>
+              <m:t>mult</m:t>
+              <w:rPr>
+                <w:rFonts w:ascii="Cambria Math" w:hAnsi="Cambria Math"/>
+                <w:sz w:val="21"/>
+                <w:szCs w:val="21"/>
+              </w:rPr>
+            </m:r>
+          </m:sub>
+        </m:sSub>
+      </m:oMath>
+      <w:r>
+        <w:t xml:space="preserve"> denote the resulting positional terms, while </w:t>
       </w:r>
       <m:oMath>
         <m:r>
           <m:t>⊙</m:t>
           <w:rPr>
             <w:rFonts w:ascii="Cambria Math" w:hAnsi="Cambria Math"/>
-            <w:color w:val="000000"/>
             <w:sz w:val="21"/>
             <w:szCs w:val="21"/>
           </w:rPr>
         </m:r>
       </m:oMath>
       <w:r>
-        <w:rPr>
-          <w:rFonts w:ascii="Arial" w:hAnsi="Arial" w:eastAsia="Arial" w:cs="Arial"/>
-          <w:color w:val="000000"/>
-          <w:sz w:val="22"/>
-        </w:rPr>
-        <w:t xml:space="preserve"> denotes element-wise multiplication.</w:t>
+        <w:t xml:space="preserve"> denotes element-wise multiplication rather than matrix multiplication.</w:t>
       </w:r>
     </w:p>
     <w:p>
@@ -5749,30 +5693,19 @@
     </w:p>
     <w:p>
       <w:r>
-        <w:rPr>
-          <w:rFonts w:ascii="Arial" w:hAnsi="Arial" w:eastAsia="Arial" w:cs="Arial"/>
-          <w:color w:val="000000"/>
-          <w:sz w:val="22"/>
-        </w:rPr>
-        <w:t xml:space="preserve">The shifted variants retain these two combination rules but assign different sinusoidal frequency schedules to the row and column axes. For sine–cosine pair </w:t>
+        <w:t xml:space="preserve">In the unshifted designs, the row and column vectors use the same sequence of sinusoidal frequencies. The shifted designs test a small alternative: the row and column axes are given different frequency schedules before their vectors are combined. This makes the two axis signals less alike without changing the grid coordinates or adding parameters. For sine-cosine pair </w:t>
       </w:r>
       <m:oMath>
         <m:r>
           <m:t>i</m:t>
           <w:rPr>
             <w:rFonts w:ascii="Cambria Math" w:hAnsi="Cambria Math"/>
-            <w:color w:val="000000"/>
             <w:sz w:val="21"/>
             <w:szCs w:val="21"/>
           </w:rPr>
         </m:r>
       </m:oMath>
       <w:r>
-        <w:rPr>
-          <w:rFonts w:ascii="Arial" w:hAnsi="Arial" w:eastAsia="Arial" w:cs="Arial"/>
-          <w:color w:val="000000"/>
-          <w:sz w:val="22"/>
-        </w:rPr>
         <w:t xml:space="preserve">, the row schedule uses exponent </w:t>
       </w:r>
       <m:oMath>
@@ -5780,7 +5713,6 @@
           <m:t>−</m:t>
           <w:rPr>
             <w:rFonts w:ascii="Cambria Math" w:hAnsi="Cambria Math"/>
-            <w:color w:val="000000"/>
             <w:sz w:val="21"/>
             <w:szCs w:val="21"/>
           </w:rPr>
@@ -5794,7 +5726,6 @@
               <m:t>2i</m:t>
               <w:rPr>
                 <w:rFonts w:ascii="Cambria Math" w:hAnsi="Cambria Math"/>
-                <w:color w:val="000000"/>
                 <w:sz w:val="21"/>
                 <w:szCs w:val="21"/>
               </w:rPr>
@@ -5805,7 +5736,6 @@
               <m:t>d</m:t>
               <w:rPr>
                 <w:rFonts w:ascii="Cambria Math" w:hAnsi="Cambria Math"/>
-                <w:color w:val="000000"/>
                 <w:sz w:val="21"/>
                 <w:szCs w:val="21"/>
               </w:rPr>
@@ -5814,19 +5744,13 @@
         </m:f>
       </m:oMath>
       <w:r>
-        <w:rPr>
-          <w:rFonts w:ascii="Arial" w:hAnsi="Arial" w:eastAsia="Arial" w:cs="Arial"/>
-          <w:color w:val="000000"/>
-          <w:sz w:val="22"/>
-        </w:rPr>
-        <w:t xml:space="preserve">, whereas the column schedule uses </w:t>
+        <w:t xml:space="preserve"> and the column schedule uses the offset exponent </w:t>
       </w:r>
       <m:oMath>
         <m:r>
           <m:t>−</m:t>
           <w:rPr>
             <w:rFonts w:ascii="Cambria Math" w:hAnsi="Cambria Math"/>
-            <w:color w:val="000000"/>
             <w:sz w:val="21"/>
             <w:szCs w:val="21"/>
           </w:rPr>
@@ -5840,7 +5764,6 @@
               <m:t>2i+1</m:t>
               <w:rPr>
                 <w:rFonts w:ascii="Cambria Math" w:hAnsi="Cambria Math"/>
-                <w:color w:val="000000"/>
                 <w:sz w:val="21"/>
                 <w:szCs w:val="21"/>
               </w:rPr>
@@ -5851,7 +5774,6 @@
               <m:t>d</m:t>
               <w:rPr>
                 <w:rFonts w:ascii="Cambria Math" w:hAnsi="Cambria Math"/>
-                <w:color w:val="000000"/>
                 <w:sz w:val="21"/>
                 <w:szCs w:val="21"/>
               </w:rPr>
@@ -5860,194 +5782,25 @@
         </m:f>
       </m:oMath>
       <w:r>
-        <w:rPr>
-          <w:rFonts w:ascii="Arial" w:hAnsi="Arial" w:eastAsia="Arial" w:cs="Arial"/>
-          <w:color w:val="000000"/>
-          <w:sz w:val="22"/>
-        </w:rPr>
-        <w:t>, as defined in Equation (</w:t>
-      </w:r>
-      <w:r>
-        <w:rPr>
-          <w:rFonts w:ascii="Arial" w:hAnsi="Arial" w:eastAsia="Arial" w:cs="Arial"/>
-          <w:color w:val="000000"/>
-          <w:sz w:val="22"/>
-        </w:rPr>
+        <w:t>, as shown in Equation (</w:t>
+      </w:r>
+      <w:r>
         <w:fldChar w:fldCharType="begin"/>
       </w:r>
       <w:r>
-        <w:rPr>
-          <w:rFonts w:ascii="Arial" w:hAnsi="Arial" w:eastAsia="Arial" w:cs="Arial"/>
-          <w:color w:val="000000"/>
-          <w:sz w:val="22"/>
-        </w:rPr>
         <w:instrText xml:space="preserve"> REF eq8 \h </w:instrText>
       </w:r>
       <w:r>
-        <w:rPr>
-          <w:rFonts w:ascii="Arial" w:hAnsi="Arial" w:eastAsia="Arial" w:cs="Arial"/>
-          <w:color w:val="000000"/>
-          <w:sz w:val="22"/>
-        </w:rPr>
         <w:fldChar w:fldCharType="separate"/>
       </w:r>
       <w:r>
-        <w:rPr>
-          <w:rFonts w:ascii="Arial" w:hAnsi="Arial" w:eastAsia="Arial" w:cs="Arial"/>
-          <w:color w:val="000000"/>
-          <w:sz w:val="22"/>
-        </w:rPr>
         <w:t>8</w:t>
       </w:r>
       <w:r>
-        <w:rPr>
-          <w:rFonts w:ascii="Arial" w:hAnsi="Arial" w:eastAsia="Arial" w:cs="Arial"/>
-          <w:color w:val="000000"/>
-          <w:sz w:val="22"/>
-        </w:rPr>
         <w:fldChar w:fldCharType="end"/>
       </w:r>
       <w:r>
-        <w:rPr>
-          <w:rFonts w:ascii="Arial" w:hAnsi="Arial" w:eastAsia="Arial" w:cs="Arial"/>
-          <w:color w:val="000000"/>
-          <w:sz w:val="22"/>
-        </w:rPr>
-        <w:t>). Within each axis, the sine and cosine channels of a pair share that frequency. Equation (</w:t>
-      </w:r>
-      <w:r>
-        <w:rPr>
-          <w:rFonts w:ascii="Arial" w:hAnsi="Arial" w:eastAsia="Arial" w:cs="Arial"/>
-          <w:color w:val="000000"/>
-          <w:sz w:val="22"/>
-        </w:rPr>
-        <w:fldChar w:fldCharType="begin"/>
-      </w:r>
-      <w:r>
-        <w:rPr>
-          <w:rFonts w:ascii="Arial" w:hAnsi="Arial" w:eastAsia="Arial" w:cs="Arial"/>
-          <w:color w:val="000000"/>
-          <w:sz w:val="22"/>
-        </w:rPr>
-        <w:instrText xml:space="preserve"> REF eq9 \h </w:instrText>
-      </w:r>
-      <w:r>
-        <w:rPr>
-          <w:rFonts w:ascii="Arial" w:hAnsi="Arial" w:eastAsia="Arial" w:cs="Arial"/>
-          <w:color w:val="000000"/>
-          <w:sz w:val="22"/>
-        </w:rPr>
-        <w:fldChar w:fldCharType="separate"/>
-      </w:r>
-      <w:r>
-        <w:rPr>
-          <w:rFonts w:ascii="Arial" w:hAnsi="Arial" w:eastAsia="Arial" w:cs="Arial"/>
-          <w:color w:val="000000"/>
-          <w:sz w:val="22"/>
-        </w:rPr>
-        <w:t>9</w:t>
-      </w:r>
-      <w:r>
-        <w:rPr>
-          <w:rFonts w:ascii="Arial" w:hAnsi="Arial" w:eastAsia="Arial" w:cs="Arial"/>
-          <w:color w:val="000000"/>
-          <w:sz w:val="22"/>
-        </w:rPr>
-        <w:fldChar w:fldCharType="end"/>
-      </w:r>
-      <w:r>
-        <w:rPr>
-          <w:rFonts w:ascii="Arial" w:hAnsi="Arial" w:eastAsia="Arial" w:cs="Arial"/>
-          <w:color w:val="000000"/>
-          <w:sz w:val="22"/>
-        </w:rPr>
-        <w:t xml:space="preserve">) then combines the axis-specific mappings </w:t>
-      </w:r>
-      <m:oMath>
-        <m:sSub>
-          <m:e>
-            <m:r>
-              <m:t>S</m:t>
-              <w:rPr>
-                <w:rFonts w:ascii="Cambria Math" w:hAnsi="Cambria Math"/>
-                <w:color w:val="000000"/>
-                <w:sz w:val="21"/>
-                <w:szCs w:val="21"/>
-              </w:rPr>
-            </m:r>
-          </m:e>
-          <m:sub>
-            <m:r>
-              <m:t>r</m:t>
-              <w:rPr>
-                <w:rFonts w:ascii="Cambria Math" w:hAnsi="Cambria Math"/>
-                <w:color w:val="000000"/>
-                <w:sz w:val="21"/>
-                <w:szCs w:val="21"/>
-              </w:rPr>
-            </m:r>
-          </m:sub>
-        </m:sSub>
-        <m:r>
-          <m:t>(r)</m:t>
-          <w:rPr>
-            <w:rFonts w:ascii="Cambria Math" w:hAnsi="Cambria Math"/>
-            <w:color w:val="000000"/>
-            <w:sz w:val="21"/>
-            <w:szCs w:val="21"/>
-          </w:rPr>
-        </m:r>
-      </m:oMath>
-      <w:r>
-        <w:rPr>
-          <w:rFonts w:ascii="Arial" w:hAnsi="Arial" w:eastAsia="Arial" w:cs="Arial"/>
-          <w:color w:val="000000"/>
-          <w:sz w:val="22"/>
-        </w:rPr>
-        <w:t xml:space="preserve"> and </w:t>
-      </w:r>
-      <m:oMath>
-        <m:sSub>
-          <m:e>
-            <m:r>
-              <m:t>S</m:t>
-              <w:rPr>
-                <w:rFonts w:ascii="Cambria Math" w:hAnsi="Cambria Math"/>
-                <w:color w:val="000000"/>
-                <w:sz w:val="21"/>
-                <w:szCs w:val="21"/>
-              </w:rPr>
-            </m:r>
-          </m:e>
-          <m:sub>
-            <m:r>
-              <m:t>c</m:t>
-              <w:rPr>
-                <w:rFonts w:ascii="Cambria Math" w:hAnsi="Cambria Math"/>
-                <w:color w:val="000000"/>
-                <w:sz w:val="21"/>
-                <w:szCs w:val="21"/>
-              </w:rPr>
-            </m:r>
-          </m:sub>
-        </m:sSub>
-        <m:r>
-          <m:t>(c)</m:t>
-          <w:rPr>
-            <w:rFonts w:ascii="Cambria Math" w:hAnsi="Cambria Math"/>
-            <w:color w:val="000000"/>
-            <w:sz w:val="21"/>
-            <w:szCs w:val="21"/>
-          </w:rPr>
-        </m:r>
-      </m:oMath>
-      <w:r>
-        <w:rPr>
-          <w:rFonts w:ascii="Arial" w:hAnsi="Arial" w:eastAsia="Arial" w:cs="Arial"/>
-          <w:color w:val="000000"/>
-          <w:sz w:val="22"/>
-        </w:rPr>
-        <w:t xml:space="preserve"> by addition or element-wise multiplication.</w:t>
+        <w:t>).</w:t>
       </w:r>
     </w:p>
     <w:p>
@@ -6302,6 +6055,129 @@
           </m:eqArr>
         </m:oMath>
       </m:oMathPara>
+    </w:p>
+    <w:p>
+      <w:pPr>
+        <w:keepLines/>
+        <w:jc w:val="center"/>
+      </w:pPr>
+      <w:r>
+        <w:t xml:space="preserve">The quantities </w:t>
+      </w:r>
+      <m:oMath>
+        <m:sSubSup>
+          <m:e>
+            <m:r>
+              <m:t>ω</m:t>
+              <w:rPr>
+                <w:rFonts w:ascii="Cambria Math" w:hAnsi="Cambria Math"/>
+                <w:sz w:val="21"/>
+                <w:szCs w:val="21"/>
+              </w:rPr>
+            </m:r>
+          </m:e>
+          <m:sub>
+            <m:r>
+              <m:t>i</m:t>
+              <w:rPr>
+                <w:rFonts w:ascii="Cambria Math" w:hAnsi="Cambria Math"/>
+                <w:sz w:val="21"/>
+                <w:szCs w:val="21"/>
+              </w:rPr>
+            </m:r>
+          </m:sub>
+          <m:sup>
+            <m:d>
+              <m:dPr>
+                <m:sepChr m:val=""/>
+              </m:dPr>
+              <m:e>
+                <m:r>
+                  <m:t>r</m:t>
+                  <w:rPr>
+                    <w:rFonts w:ascii="Cambria Math" w:hAnsi="Cambria Math"/>
+                    <w:sz w:val="21"/>
+                    <w:szCs w:val="21"/>
+                  </w:rPr>
+                </m:r>
+              </m:e>
+            </m:d>
+          </m:sup>
+        </m:sSubSup>
+      </m:oMath>
+      <w:r>
+        <w:t xml:space="preserve"> and </w:t>
+      </w:r>
+      <m:oMath>
+        <m:sSubSup>
+          <m:e>
+            <m:r>
+              <m:t>ω</m:t>
+              <w:rPr>
+                <w:rFonts w:ascii="Cambria Math" w:hAnsi="Cambria Math"/>
+                <w:sz w:val="21"/>
+                <w:szCs w:val="21"/>
+              </w:rPr>
+            </m:r>
+          </m:e>
+          <m:sub>
+            <m:r>
+              <m:t>i</m:t>
+              <w:rPr>
+                <w:rFonts w:ascii="Cambria Math" w:hAnsi="Cambria Math"/>
+                <w:sz w:val="21"/>
+                <w:szCs w:val="21"/>
+              </w:rPr>
+            </m:r>
+          </m:sub>
+          <m:sup>
+            <m:d>
+              <m:dPr>
+                <m:sepChr m:val=""/>
+              </m:dPr>
+              <m:e>
+                <m:r>
+                  <m:t>c</m:t>
+                  <w:rPr>
+                    <w:rFonts w:ascii="Cambria Math" w:hAnsi="Cambria Math"/>
+                    <w:sz w:val="21"/>
+                    <w:szCs w:val="21"/>
+                  </w:rPr>
+                </m:r>
+              </m:e>
+            </m:d>
+          </m:sup>
+        </m:sSubSup>
+      </m:oMath>
+      <w:r>
+        <w:t xml:space="preserve"> are the row and column frequency factors used inside the sine and cosine functions. With </w:t>
+      </w:r>
+      <m:oMath>
+        <m:r>
+          <m:t>d=128</m:t>
+          <w:rPr>
+            <w:rFonts w:ascii="Cambria Math" w:hAnsi="Cambria Math"/>
+            <w:sz w:val="21"/>
+            <w:szCs w:val="21"/>
+          </w:rPr>
+        </m:r>
+      </m:oMath>
+      <w:r>
+        <w:t xml:space="preserve">, the pair index </w:t>
+      </w:r>
+      <m:oMath>
+        <m:r>
+          <m:t>i</m:t>
+          <w:rPr>
+            <w:rFonts w:ascii="Cambria Math" w:hAnsi="Cambria Math"/>
+            <w:sz w:val="21"/>
+            <w:szCs w:val="21"/>
+          </w:rPr>
+        </m:r>
+      </m:oMath>
+      <w:r>
+        <w:t xml:space="preserve"> ranges from 0 to 63. Both channels in a sine-cosine pair use the same factor for their axis; only the schedule assigned to the two axes differs.</w:t>
+      </w:r>
     </w:p>
     <w:p>
       <w:pPr>
@@ -6604,12 +6480,109 @@
     </w:p>
     <w:p>
       <w:r>
-        <w:rPr>
-          <w:rFonts w:ascii="Arial" w:hAnsi="Arial" w:eastAsia="Arial" w:cs="Arial"/>
-          <w:color w:val="000000"/>
-          <w:sz w:val="22"/>
-        </w:rPr>
-        <w:t>The term shifted therefore refers only to the one-index offset between the row and column frequency schedules. It leaves the patch coordinates, token order and patch-to-position assignment unchanged; those factors are examined separately in Section 3.5.</w:t>
+        <w:t>Equation (</w:t>
+      </w:r>
+      <w:r>
+        <w:fldChar w:fldCharType="begin"/>
+      </w:r>
+      <w:r>
+        <w:instrText xml:space="preserve"> REF eq9 \h </w:instrText>
+      </w:r>
+      <w:r>
+        <w:fldChar w:fldCharType="separate"/>
+      </w:r>
+      <w:r>
+        <w:t>9</w:t>
+      </w:r>
+      <w:r>
+        <w:fldChar w:fldCharType="end"/>
+      </w:r>
+      <w:r>
+        <w:t xml:space="preserve">) combines the axis-specific mappings </w:t>
+      </w:r>
+      <m:oMath>
+        <m:sSup>
+          <m:e>
+            <m:r>
+              <m:t>S</m:t>
+              <w:rPr>
+                <w:rFonts w:ascii="Cambria Math" w:hAnsi="Cambria Math"/>
+                <w:sz w:val="21"/>
+                <w:szCs w:val="21"/>
+              </w:rPr>
+            </m:r>
+          </m:e>
+          <m:sup>
+            <m:d>
+              <m:dPr>
+                <m:sepChr m:val=""/>
+              </m:dPr>
+              <m:e>
+                <m:r>
+                  <m:t>r</m:t>
+                  <w:rPr>
+                    <w:rFonts w:ascii="Cambria Math" w:hAnsi="Cambria Math"/>
+                    <w:sz w:val="21"/>
+                    <w:szCs w:val="21"/>
+                  </w:rPr>
+                </m:r>
+              </m:e>
+            </m:d>
+          </m:sup>
+        </m:sSup>
+        <m:r>
+          <m:t>(r)</m:t>
+          <w:rPr>
+            <w:rFonts w:ascii="Cambria Math" w:hAnsi="Cambria Math"/>
+            <w:sz w:val="21"/>
+            <w:szCs w:val="21"/>
+          </w:rPr>
+        </m:r>
+      </m:oMath>
+      <w:r>
+        <w:t xml:space="preserve"> and </w:t>
+      </w:r>
+      <m:oMath>
+        <m:sSup>
+          <m:e>
+            <m:r>
+              <m:t>S</m:t>
+              <w:rPr>
+                <w:rFonts w:ascii="Cambria Math" w:hAnsi="Cambria Math"/>
+                <w:sz w:val="21"/>
+                <w:szCs w:val="21"/>
+              </w:rPr>
+            </m:r>
+          </m:e>
+          <m:sup>
+            <m:d>
+              <m:dPr>
+                <m:sepChr m:val=""/>
+              </m:dPr>
+              <m:e>
+                <m:r>
+                  <m:t>c</m:t>
+                  <w:rPr>
+                    <w:rFonts w:ascii="Cambria Math" w:hAnsi="Cambria Math"/>
+                    <w:sz w:val="21"/>
+                    <w:szCs w:val="21"/>
+                  </w:rPr>
+                </m:r>
+              </m:e>
+            </m:d>
+          </m:sup>
+        </m:sSup>
+        <m:r>
+          <m:t>(c)</m:t>
+          <w:rPr>
+            <w:rFonts w:ascii="Cambria Math" w:hAnsi="Cambria Math"/>
+            <w:sz w:val="21"/>
+            <w:szCs w:val="21"/>
+          </w:rPr>
+        </m:r>
+      </m:oMath>
+      <w:r>
+        <w:t xml:space="preserve"> using the same addition and multiplication rules as before. The superscripts label the frequency schedule used for each axis; they are not powers. The term shifted therefore refers only to the one-index offset between the two schedules. It does not move a patch, change its row or column, or alter token order. Patch ordering and position assignment are examined separately in Section 3.5.</w:t>
       </w:r>
     </w:p>
     <w:p>
@@ -6622,45 +6595,46 @@
     </w:p>
     <w:p>
       <w:r>
-        <w:t xml:space="preserve">The squared multiplicative encoding applies an element-wise square after the row and column vectors have been multiplied. The shifted squared variant applies the same operation to the shifted product. The radial encoding instead converts the row and column coordinates into their Euclidean distance </w:t>
-      </w:r>
-      <w:r>
-        <w:rPr>
-          <w:rFonts w:ascii="Cambria Math" w:eastAsia="Cambria Math" w:hAnsi="Cambria Math" w:cs="Cambria Math"/>
-          <w:i/>
-        </w:rPr>
-        <w:t>ρ(r, c)</w:t>
-      </w:r>
-      <w:r>
-        <w:t xml:space="preserve"> from the top-left patch at </w:t>
-      </w:r>
-      <w:r>
-        <w:rPr>
-          <w:rFonts w:ascii="Cambria Math" w:eastAsia="Cambria Math" w:hAnsi="Cambria Math" w:cs="Cambria Math"/>
-          <w:i/>
-        </w:rPr>
-        <w:t>(0, 0)</w:t>
-      </w:r>
-      <w:r>
-        <w:t xml:space="preserve"> and applies the sinusoidal mapping to this scalar value. Equation (</w:t>
-      </w:r>
-      <w:r>
-        <w:fldChar w:fldCharType="begin"/>
-      </w:r>
-      <w:r>
-        <w:instrText xml:space="preserve"> REF eq10 \h </w:instrText>
-      </w:r>
-      <w:r>
-        <w:fldChar w:fldCharType="separate"/>
+        <w:t xml:space="preserve">The squared designs test whether the sign of the multiplicative positional term is useful. The unshifted version first multiplies the row and column vectors component by component and then squares every result; the shifted squared version applies the same operation after using the two shifted frequency schedules. The radial design tests a different simplification. It replaces the coordinate pair </w:t>
       </w:r>
       <m:oMath>
         <m:r>
+          <m:t>(r,c)</m:t>
           <w:rPr>
             <w:rFonts w:ascii="Cambria Math" w:hAnsi="Cambria Math"/>
+            <w:sz w:val="21"/>
+            <w:szCs w:val="21"/>
           </w:rPr>
-          <m:t>10</m:t>
         </m:r>
       </m:oMath>
+      <w:r>
+        <w:t xml:space="preserve"> with its Euclidean distance from the top-left patch at </w:t>
+      </w:r>
+      <m:oMath>
+        <m:r>
+          <m:t>(0,0)</m:t>
+          <w:rPr>
+            <w:rFonts w:ascii="Cambria Math" w:hAnsi="Cambria Math"/>
+            <w:sz w:val="21"/>
+            <w:szCs w:val="21"/>
+          </w:rPr>
+        </m:r>
+      </m:oMath>
+      <w:r>
+        <w:t xml:space="preserve"> and applies the common sinusoidal mapping to that single value. Equation (</w:t>
+      </w:r>
+      <w:r>
+        <w:fldChar w:fldCharType="begin"/>
+      </w:r>
+      <w:r>
+        <w:instrText xml:space="preserve"> REF eq10 \h </w:instrText>
+      </w:r>
+      <w:r>
+        <w:fldChar w:fldCharType="separate"/>
+      </w:r>
+      <w:r>
+        <w:t>10</w:t>
+      </w:r>
       <w:r>
         <w:fldChar w:fldCharType="end"/>
       </w:r>
@@ -6898,7 +6872,85 @@
     </w:p>
     <w:p>
       <w:r>
-        <w:t>Element-wise squaring makes every component non-negative. The radial construction assigns the same positional vector to patches at the same distance from the top-left origin, so it represents distance but not direction.</w:t>
+        <w:t xml:space="preserve">In Equation (10), </w:t>
+      </w:r>
+      <m:oMath>
+        <m:sSub>
+          <m:e>
+            <m:r>
+              <m:t>P</m:t>
+              <w:rPr>
+                <w:rFonts w:ascii="Cambria Math" w:hAnsi="Cambria Math"/>
+                <w:sz w:val="21"/>
+                <w:szCs w:val="21"/>
+              </w:rPr>
+            </m:r>
+          </m:e>
+          <m:sub>
+            <m:r>
+              <m:rPr>
+                <m:nor/>
+              </m:rPr>
+              <m:t>sq</m:t>
+              <w:rPr>
+                <w:rFonts w:ascii="Cambria Math" w:hAnsi="Cambria Math"/>
+                <w:sz w:val="21"/>
+                <w:szCs w:val="21"/>
+              </w:rPr>
+            </m:r>
+          </m:sub>
+        </m:sSub>
+      </m:oMath>
+      <w:r>
+        <w:t xml:space="preserve"> is the squared multiplicative term, </w:t>
+      </w:r>
+      <m:oMath>
+        <m:r>
+          <m:t>ρ(r,c)</m:t>
+          <w:rPr>
+            <w:rFonts w:ascii="Cambria Math" w:hAnsi="Cambria Math"/>
+            <w:sz w:val="21"/>
+            <w:szCs w:val="21"/>
+          </w:rPr>
+        </m:r>
+      </m:oMath>
+      <w:r>
+        <w:t xml:space="preserve"> is the radial distance, and </w:t>
+      </w:r>
+      <m:oMath>
+        <m:sSub>
+          <m:e>
+            <m:r>
+              <m:t>P</m:t>
+              <w:rPr>
+                <w:rFonts w:ascii="Cambria Math" w:hAnsi="Cambria Math"/>
+                <w:sz w:val="21"/>
+                <w:szCs w:val="21"/>
+              </w:rPr>
+            </m:r>
+          </m:e>
+          <m:sub>
+            <m:r>
+              <m:rPr>
+                <m:nor/>
+              </m:rPr>
+              <m:t>rad</m:t>
+              <w:rPr>
+                <w:rFonts w:ascii="Cambria Math" w:hAnsi="Cambria Math"/>
+                <w:sz w:val="21"/>
+                <w:szCs w:val="21"/>
+              </w:rPr>
+            </m:r>
+          </m:sub>
+        </m:sSub>
+      </m:oMath>
+      <w:r>
+        <w:t xml:space="preserve"> is the corresponding radial positional term. Squaring makes every component non-negative, but it discards whether the original product was positive or negative. The radial construction preserves distance from the top-left origin but not direction: patches at the same distance receive the same vector. These methods remain parameter-free and are treated as targeted extensions rather than assumed improvements.</w:t>
+      </w:r>
+    </w:p>
+    <w:p>
+      <w:r>
+        <w:t>The core comparison is deliberately limited to methods that produce a 128-component positional term and add it at the same point in the shared ViT. Other approaches reviewed in Sections 2.3 and 2.6, including relative-position, conditional and rotary encodings [10]–[12], either modify the attention calculation or introduce learned position-generating components. Including them would change more than the positional vector itself. The hybrid and dual-branch models also alter parameter count or architecture, so they are evaluated separately in Section 3.6.</w:t>
       </w:r>
     </w:p>
     <w:p>
@@ -8665,66 +8717,7 @@
     </w:p>
     <w:p>
       <w:r>
-        <w:rPr>
-          <w:sz w:val="21"/>
-        </w:rPr>
-        <w:t xml:space="preserve">Patch extraction, sequence storage and positional assignment are treated as separate operations. The stride-4 convolution first produces the 64 physical patches in row-major order. An index-selection operation then stores them according to one of four deterministic modes: </w:t>
-      </w:r>
-      <w:proofErr w:type="spellStart"/>
-      <w:r>
-        <w:rPr>
-          <w:sz w:val="21"/>
-        </w:rPr>
-        <w:t>normal_row</w:t>
-      </w:r>
-      <w:proofErr w:type="spellEnd"/>
-      <w:r>
-        <w:rPr>
-          <w:sz w:val="21"/>
-        </w:rPr>
-        <w:t xml:space="preserve">, </w:t>
-      </w:r>
-      <w:proofErr w:type="spellStart"/>
-      <w:r>
-        <w:rPr>
-          <w:sz w:val="21"/>
-        </w:rPr>
-        <w:t>normal_col</w:t>
-      </w:r>
-      <w:proofErr w:type="spellEnd"/>
-      <w:r>
-        <w:rPr>
-          <w:sz w:val="21"/>
-        </w:rPr>
-        <w:t xml:space="preserve">, </w:t>
-      </w:r>
-      <w:proofErr w:type="spellStart"/>
-      <w:r>
-        <w:rPr>
-          <w:sz w:val="21"/>
-        </w:rPr>
-        <w:t>proper_row</w:t>
-      </w:r>
-      <w:proofErr w:type="spellEnd"/>
-      <w:r>
-        <w:rPr>
-          <w:sz w:val="21"/>
-        </w:rPr>
-        <w:t xml:space="preserve"> (row-wise serpentine) or </w:t>
-      </w:r>
-      <w:proofErr w:type="spellStart"/>
-      <w:r>
-        <w:rPr>
-          <w:sz w:val="21"/>
-        </w:rPr>
-        <w:t>proper_col</w:t>
-      </w:r>
-      <w:proofErr w:type="spellEnd"/>
-      <w:r>
-        <w:rPr>
-          <w:sz w:val="21"/>
-        </w:rPr>
-        <w:t xml:space="preserve"> (column-wise serpentine).</w:t>
+        <w:t>Patch extraction, sequence storage and positional assignment are treated as separate operations. The stride-4 convolution first produces 64 physical patches in row-major order. An index-selection step then stores them in one of four deterministic modes. normal_row reads left to right and then top to bottom; normal_col reads top to bottom and then moves across columns. proper_row follows a row-wise serpentine path, reversing direction on alternate rows, while proper_col applies the same idea down alternate columns.</w:t>
       </w:r>
     </w:p>
     <w:p>
@@ -8733,46 +8726,47 @@
       </w:r>
       <m:oMath>
         <m:sSub>
-          <m:sSubPr>
-            <m:ctrlPr>
-              <w:rPr>
-                <w:rFonts w:ascii="Cambria Math" w:hAnsi="Cambria Math"/>
-              </w:rPr>
-            </m:ctrlPr>
-          </m:sSubPr>
           <m:e>
             <m:r>
+              <m:t>π</m:t>
               <w:rPr>
                 <w:rFonts w:ascii="Cambria Math" w:hAnsi="Cambria Math"/>
-              </w:rPr>
-              <m:t>π</m:t>
+                <w:sz w:val="21"/>
+                <w:szCs w:val="21"/>
+              </w:rPr>
             </m:r>
           </m:e>
           <m:sub>
             <m:r>
+              <m:t>u</m:t>
               <w:rPr>
                 <w:rFonts w:ascii="Cambria Math" w:hAnsi="Cambria Math"/>
-              </w:rPr>
-              <m:t>u</m:t>
+                <w:sz w:val="21"/>
+                <w:szCs w:val="21"/>
+              </w:rPr>
             </m:r>
           </m:sub>
         </m:sSub>
         <m:r>
+          <m:t>(s)</m:t>
           <w:rPr>
             <w:rFonts w:ascii="Cambria Math" w:hAnsi="Cambria Math"/>
+            <w:sz w:val="21"/>
+            <w:szCs w:val="21"/>
           </w:rPr>
-          <m:t>(s)</m:t>
         </m:r>
       </m:oMath>
       <w:r>
-        <w:t xml:space="preserve"> be the physical row-major patch index stored at sequence slot </w:t>
+        <w:t xml:space="preserve"> be the physical row-major patch index stored in sequence slot </w:t>
       </w:r>
       <m:oMath>
         <m:r>
+          <m:t>s</m:t>
           <w:rPr>
             <w:rFonts w:ascii="Cambria Math" w:hAnsi="Cambria Math"/>
+            <w:sz w:val="21"/>
+            <w:szCs w:val="21"/>
           </w:rPr>
-          <m:t>s</m:t>
         </m:r>
       </m:oMath>
       <w:r>
@@ -8780,25 +8774,29 @@
       </w:r>
       <m:oMath>
         <m:r>
+          <m:t>u</m:t>
           <w:rPr>
             <w:rFonts w:ascii="Cambria Math" w:hAnsi="Cambria Math"/>
+            <w:sz w:val="21"/>
+            <w:szCs w:val="21"/>
           </w:rPr>
-          <m:t>u</m:t>
         </m:r>
       </m:oMath>
       <w:r>
-        <w:t xml:space="preserve">. The fixed positional buffer is not permuted with the physical patches; slot </w:t>
+        <w:t xml:space="preserve">. The fixed positional buffer is not moved with the physical patches: slot </w:t>
       </w:r>
       <m:oMath>
         <m:r>
+          <m:t>s</m:t>
           <w:rPr>
             <w:rFonts w:ascii="Cambria Math" w:hAnsi="Cambria Math"/>
+            <w:sz w:val="21"/>
+            <w:szCs w:val="21"/>
           </w:rPr>
-          <m:t>s</m:t>
         </m:r>
       </m:oMath>
       <w:r>
-        <w:t xml:space="preserve"> retains the row-major PE coordinate assigned to that slot, as formalised in Equation (</w:t>
+        <w:t xml:space="preserve"> keeps the row-major PE coordinate assigned to that slot. Equation (</w:t>
       </w:r>
       <w:r>
         <w:fldChar w:fldCharType="begin"/>
@@ -8808,85 +8806,50 @@
       </w:r>
       <w:r>
         <w:fldChar w:fldCharType="separate"/>
+      </w:r>
+      <w:r>
+        <w:t>11</w:t>
+      </w:r>
+      <w:r>
+        <w:fldChar w:fldCharType="end"/>
+      </w:r>
+      <w:r>
+        <w:t xml:space="preserve">) formalises this rule. Here, </w:t>
       </w:r>
       <m:oMath>
         <m:r>
+          <m:t>G=8</m:t>
           <w:rPr>
             <w:rFonts w:ascii="Cambria Math" w:hAnsi="Cambria Math"/>
+            <w:sz w:val="21"/>
+            <w:szCs w:val="21"/>
           </w:rPr>
-          <m:t>11</m:t>
         </m:r>
       </m:oMath>
       <w:r>
-        <w:fldChar w:fldCharType="end"/>
-      </w:r>
-      <w:r>
-        <w:t xml:space="preserve">). The physical grid coordinate is obtained by applying integer division and modulo </w:t>
+        <w:t xml:space="preserve"> is the grid width, integer division gives the row, modulo gives the column, and </w:t>
       </w:r>
       <m:oMath>
         <m:r>
+          <m:t>a(s)</m:t>
           <w:rPr>
             <w:rFonts w:ascii="Cambria Math" w:hAnsi="Cambria Math"/>
+            <w:sz w:val="21"/>
+            <w:szCs w:val="21"/>
           </w:rPr>
-          <m:t>G</m:t>
         </m:r>
       </m:oMath>
       <w:r>
-        <w:t xml:space="preserve"> to </w:t>
+        <w:t xml:space="preserve"> denotes the PE coordinate attached to slot </w:t>
       </w:r>
       <m:oMath>
-        <m:sSub>
-          <m:sSubPr>
-            <m:ctrlPr>
-              <w:rPr>
-                <w:rFonts w:ascii="Cambria Math" w:hAnsi="Cambria Math"/>
-              </w:rPr>
-            </m:ctrlPr>
-          </m:sSubPr>
-          <m:e>
-            <m:r>
-              <w:rPr>
-                <w:rFonts w:ascii="Cambria Math" w:hAnsi="Cambria Math"/>
-              </w:rPr>
-              <m:t>π</m:t>
-            </m:r>
-          </m:e>
-          <m:sub>
-            <m:r>
-              <w:rPr>
-                <w:rFonts w:ascii="Cambria Math" w:hAnsi="Cambria Math"/>
-              </w:rPr>
-              <m:t>u</m:t>
-            </m:r>
-          </m:sub>
-        </m:sSub>
         <m:r>
+          <m:t>s</m:t>
           <w:rPr>
             <w:rFonts w:ascii="Cambria Math" w:hAnsi="Cambria Math"/>
+            <w:sz w:val="21"/>
+            <w:szCs w:val="21"/>
           </w:rPr>
-          <m:t>(s)</m:t>
-        </m:r>
-      </m:oMath>
-      <w:r>
-        <w:t xml:space="preserve">. The notation </w:t>
-      </w:r>
-      <m:oMath>
-        <m:r>
-          <w:rPr>
-            <w:rFonts w:ascii="Cambria Math" w:hAnsi="Cambria Math"/>
-          </w:rPr>
-          <m:t>a(s)</m:t>
-        </m:r>
-      </m:oMath>
-      <w:r>
-        <w:t xml:space="preserve"> denotes the PE coordinate assigned to slot </w:t>
-      </w:r>
-      <m:oMath>
-        <m:r>
-          <w:rPr>
-            <w:rFonts w:ascii="Cambria Math" w:hAnsi="Cambria Math"/>
-          </w:rPr>
-          <m:t>s</m:t>
         </m:r>
       </m:oMath>
       <w:r>
@@ -9041,43 +9004,7 @@
     </w:p>
     <w:p>
       <w:r>
-        <w:t xml:space="preserve">Consequently, a change in unfolding mode can alter the pairing between a physical patch and a fixed positional vector, even though the encoder architecture is unchanged. The mapping audit records </w:t>
-      </w:r>
-      <m:oMath>
-        <m:sSub>
-          <m:sSubPr>
-            <m:ctrlPr>
-              <w:rPr>
-                <w:rFonts w:ascii="Cambria Math" w:hAnsi="Cambria Math"/>
-              </w:rPr>
-            </m:ctrlPr>
-          </m:sSubPr>
-          <m:e>
-            <m:r>
-              <w:rPr>
-                <w:rFonts w:ascii="Cambria Math" w:hAnsi="Cambria Math"/>
-              </w:rPr>
-              <m:t>π</m:t>
-            </m:r>
-          </m:e>
-          <m:sub>
-            <m:r>
-              <w:rPr>
-                <w:rFonts w:ascii="Cambria Math" w:hAnsi="Cambria Math"/>
-              </w:rPr>
-              <m:t>u</m:t>
-            </m:r>
-          </m:sub>
-        </m:sSub>
-        <m:r>
-          <w:rPr>
-            <w:rFonts w:ascii="Cambria Math" w:hAnsi="Cambria Math"/>
-          </w:rPr>
-          <m:t>(s)</m:t>
-        </m:r>
-      </m:oMath>
-      <w:r>
-        <w:t>, the physical coordinate of that patch, the sequence slot and the assigned PE coordinate for all 64 slots. Deterministic tests cover all four modes before performance differences are interpreted as patch-to-position assignment effects.</w:t>
+        <w:t>Changing the unfolding mode can therefore attach a physical patch to a different fixed positional vector even though the encoder does not change. Before training results are interpreted, a deterministic audit records the physical patch index, its row and column, its sequence slot and the PE coordinate assigned at that slot for all 64 positions. Tests cover all four modes. This check is important because any later accuracy difference concerns patch-to-position assignment, not an unverified change in the model or data.</w:t>
       </w:r>
     </w:p>
     <w:p>
@@ -9090,24 +9017,7 @@
     </w:p>
     <w:p>
       <w:r>
-        <w:rPr>
-          <w:sz w:val="21"/>
-        </w:rPr>
-        <w:t xml:space="preserve">The extension models test two different questions: whether a fixed spatial term adds information to a learnable positional table, and whether separate row/column encoders benefit from explicit representation fusion. They are </w:t>
-      </w:r>
-      <w:proofErr w:type="spellStart"/>
-      <w:r>
-        <w:rPr>
-          <w:sz w:val="21"/>
-        </w:rPr>
-        <w:t>analysed</w:t>
-      </w:r>
-      <w:proofErr w:type="spellEnd"/>
-      <w:r>
-        <w:rPr>
-          <w:sz w:val="21"/>
-        </w:rPr>
-        <w:t xml:space="preserve"> separately from the core PE comparison because they add parameters or duplicate the encoder.</w:t>
+        <w:t>The extension models ask whether extra positional or architectural complexity improves on the single-branch comparison. The hybrid adds a fixed term to a learnable table; dual-branch models process row and column signals separately and fuse them. Because both designs change more than the positional vector, they are reported separately from the core comparison and interpreted alongside their parameter counts.</w:t>
       </w:r>
     </w:p>
     <w:p>
@@ -9120,45 +9030,44 @@
     </w:p>
     <w:p>
       <w:r>
-        <w:t xml:space="preserve">The hybrid uses normal column-major patch ordering and combines the learnable absolute table </w:t>
+        <w:t xml:space="preserve">The hybrid uses normal column-major ordering and combines the learnable table </w:t>
       </w:r>
       <m:oMath>
         <m:r>
+          <m:t>L</m:t>
           <w:rPr>
             <w:rFonts w:ascii="Cambria Math" w:hAnsi="Cambria Math"/>
+            <w:sz w:val="21"/>
+            <w:szCs w:val="21"/>
           </w:rPr>
-          <m:t>L</m:t>
         </m:r>
       </m:oMath>
       <w:r>
-        <w:t xml:space="preserve"> with the unshifted multiplicative fixed tensor </w:t>
+        <w:t xml:space="preserve"> with unshifted multiplicative </w:t>
       </w:r>
       <m:oMath>
         <m:sSub>
-          <m:sSubPr>
-            <m:ctrlPr>
-              <w:rPr>
-                <w:rFonts w:ascii="Cambria Math" w:hAnsi="Cambria Math"/>
-              </w:rPr>
-            </m:ctrlPr>
-          </m:sSubPr>
           <m:e>
             <m:r>
+              <m:t>P</m:t>
               <w:rPr>
                 <w:rFonts w:ascii="Cambria Math" w:hAnsi="Cambria Math"/>
-              </w:rPr>
-              <m:t>P</m:t>
+                <w:sz w:val="21"/>
+                <w:szCs w:val="21"/>
+              </w:rPr>
             </m:r>
           </m:e>
           <m:sub>
             <m:r>
               <m:rPr>
-                <m:sty m:val="p"/>
+                <m:nor/>
               </m:rPr>
+              <m:t>mult</m:t>
               <w:rPr>
                 <w:rFonts w:ascii="Cambria Math" w:hAnsi="Cambria Math"/>
-              </w:rPr>
-              <m:t>mult</m:t>
+                <w:sz w:val="21"/>
+                <w:szCs w:val="21"/>
+              </w:rPr>
             </m:r>
           </m:sub>
         </m:sSub>
@@ -9175,76 +9084,62 @@
       <w:r>
         <w:fldChar w:fldCharType="separate"/>
       </w:r>
+      <w:r>
+        <w:t>12</w:t>
+      </w:r>
+      <w:r>
+        <w:fldChar w:fldCharType="end"/>
+      </w:r>
+      <w:r>
+        <w:t xml:space="preserve">) defines the input. The trainable scalar </w:t>
+      </w:r>
       <m:oMath>
         <m:r>
+          <m:t>α</m:t>
           <w:rPr>
             <w:rFonts w:ascii="Cambria Math" w:hAnsi="Cambria Math"/>
+            <w:sz w:val="21"/>
+            <w:szCs w:val="21"/>
           </w:rPr>
-          <m:t>12</m:t>
         </m:r>
       </m:oMath>
       <w:r>
-        <w:fldChar w:fldCharType="end"/>
-      </w:r>
-      <w:r>
-        <w:t xml:space="preserve">) defines the combined input. The single trainable scalar </w:t>
-      </w:r>
-      <m:oMath>
-        <m:r>
-          <w:rPr>
-            <w:rFonts w:ascii="Cambria Math" w:hAnsi="Cambria Math"/>
-          </w:rPr>
-          <m:t>α</m:t>
-        </m:r>
-      </m:oMath>
-      <w:r>
-        <w:t xml:space="preserve"> is the fixed-position scale, implemented as </w:t>
-      </w:r>
-      <w:r>
-        <w:rPr>
-          <w:rFonts w:ascii="Courier New" w:hAnsi="Courier New"/>
-          <w:sz w:val="20"/>
-        </w:rPr>
-        <w:t>fixed_pos_scale</w:t>
-      </w:r>
-      <w:r>
-        <w:t xml:space="preserve">, and </w:t>
+        <w:t xml:space="preserve"> controls the fixed contribution and starts at </w:t>
       </w:r>
       <m:oMath>
         <m:sSub>
-          <m:sSubPr>
-            <m:ctrlPr>
-              <w:rPr>
-                <w:rFonts w:ascii="Cambria Math" w:hAnsi="Cambria Math"/>
-              </w:rPr>
-            </m:ctrlPr>
-          </m:sSubPr>
           <m:e>
             <m:r>
+              <m:t>α</m:t>
               <w:rPr>
                 <w:rFonts w:ascii="Cambria Math" w:hAnsi="Cambria Math"/>
-              </w:rPr>
-              <m:t>α</m:t>
+                <w:sz w:val="21"/>
+                <w:szCs w:val="21"/>
+              </w:rPr>
             </m:r>
           </m:e>
           <m:sub>
             <m:r>
+              <m:t>0</m:t>
               <w:rPr>
                 <w:rFonts w:ascii="Cambria Math" w:hAnsi="Cambria Math"/>
-              </w:rPr>
-              <m:t>0</m:t>
+                <w:sz w:val="21"/>
+                <w:szCs w:val="21"/>
+              </w:rPr>
             </m:r>
           </m:sub>
         </m:sSub>
         <m:r>
+          <m:t>=0</m:t>
           <w:rPr>
             <w:rFonts w:ascii="Cambria Math" w:hAnsi="Cambria Math"/>
+            <w:sz w:val="21"/>
+            <w:szCs w:val="21"/>
           </w:rPr>
-          <m:t>=0</m:t>
         </m:r>
       </m:oMath>
       <w:r>
-        <w:t xml:space="preserve"> denotes its initial value.</w:t>
+        <w:t>.</w:t>
       </w:r>
     </w:p>
     <w:p>
@@ -9451,24 +9346,7 @@
     </w:p>
     <w:p>
       <w:r>
-        <w:rPr>
-          <w:sz w:val="21"/>
-        </w:rPr>
-        <w:t xml:space="preserve">The scalar is </w:t>
-      </w:r>
-      <w:proofErr w:type="spellStart"/>
-      <w:r>
-        <w:rPr>
-          <w:sz w:val="21"/>
-        </w:rPr>
-        <w:t>initialised</w:t>
-      </w:r>
-      <w:proofErr w:type="spellEnd"/>
-      <w:r>
-        <w:rPr>
-          <w:sz w:val="21"/>
-        </w:rPr>
-        <w:t xml:space="preserve"> to zero, so the initial positional input matches the learnable-position form before training adjusts the fixed component. Relative to the order-matched learnable model, the hybrid adds exactly one trainable parameter. Its effect is therefore evaluated against that order-matched control rather than only against the default row-major learnable model.</w:t>
+        <w:t>Starting at zero makes the initial input identical to the learnable control; training can then increase, decrease or reverse the fixed term. The hybrid adds one parameter, so it is compared with the learnable model using the same column-major ordering.</w:t>
       </w:r>
     </w:p>
     <w:p>
@@ -9481,31 +9359,28 @@
     </w:p>
     <w:p>
       <w:r>
-        <w:t xml:space="preserve">Latent-fusion models apply independent row-wise and column-wise ViT encoders to the same image and extract their final classification-token representations </w:t>
+        <w:t xml:space="preserve">Latent fusion uses two ViT encoders on the same image: one with row PE and one with column PE. Their classification-token vectors are </w:t>
       </w:r>
       <m:oMath>
         <m:sSub>
-          <m:sSubPr>
-            <m:ctrlPr>
-              <w:rPr>
-                <w:rFonts w:ascii="Cambria Math" w:hAnsi="Cambria Math"/>
-              </w:rPr>
-            </m:ctrlPr>
-          </m:sSubPr>
           <m:e>
             <m:r>
+              <m:t>h</m:t>
               <w:rPr>
                 <w:rFonts w:ascii="Cambria Math" w:hAnsi="Cambria Math"/>
-              </w:rPr>
-              <m:t>h</m:t>
+                <w:sz w:val="21"/>
+                <w:szCs w:val="21"/>
+              </w:rPr>
             </m:r>
           </m:e>
           <m:sub>
             <m:r>
+              <m:t>r</m:t>
               <w:rPr>
                 <w:rFonts w:ascii="Cambria Math" w:hAnsi="Cambria Math"/>
-              </w:rPr>
-              <m:t>r</m:t>
+                <w:sz w:val="21"/>
+                <w:szCs w:val="21"/>
+              </w:rPr>
             </m:r>
           </m:sub>
         </m:sSub>
@@ -9515,33 +9390,30 @@
       </w:r>
       <m:oMath>
         <m:sSub>
-          <m:sSubPr>
-            <m:ctrlPr>
-              <w:rPr>
-                <w:rFonts w:ascii="Cambria Math" w:hAnsi="Cambria Math"/>
-              </w:rPr>
-            </m:ctrlPr>
-          </m:sSubPr>
           <m:e>
             <m:r>
+              <m:t>h</m:t>
               <w:rPr>
                 <w:rFonts w:ascii="Cambria Math" w:hAnsi="Cambria Math"/>
-              </w:rPr>
-              <m:t>h</m:t>
+                <w:sz w:val="21"/>
+                <w:szCs w:val="21"/>
+              </w:rPr>
             </m:r>
           </m:e>
           <m:sub>
             <m:r>
+              <m:t>c</m:t>
               <w:rPr>
                 <w:rFonts w:ascii="Cambria Math" w:hAnsi="Cambria Math"/>
-              </w:rPr>
-              <m:t>c</m:t>
+                <w:sz w:val="21"/>
+                <w:szCs w:val="21"/>
+              </w:rPr>
             </m:r>
           </m:sub>
         </m:sSub>
       </m:oMath>
       <w:r>
-        <w:t>. The mean variant averages the two vectors directly. The concatenation variant passes their concatenation through a layer-normalised MLP, while the mean-MLP variant applies an MLP after averaging. These fusion rules are summarised in Equation (</w:t>
+        <w:t>. One variant averages them, one applies an MLP after averaging, and one concatenates them before a layer-normalised MLP. Equation (</w:t>
       </w:r>
       <w:r>
         <w:fldChar w:fldCharType="begin"/>
@@ -9552,19 +9424,14 @@
       <w:r>
         <w:fldChar w:fldCharType="separate"/>
       </w:r>
-      <m:oMath>
-        <m:r>
-          <w:rPr>
-            <w:rFonts w:ascii="Cambria Math" w:hAnsi="Cambria Math"/>
-          </w:rPr>
-          <m:t>13</m:t>
-        </m:r>
-      </m:oMath>
+      <w:r>
+        <w:t>13</w:t>
+      </w:r>
       <w:r>
         <w:fldChar w:fldCharType="end"/>
       </w:r>
       <w:r>
-        <w:t>).</w:t>
+        <w:t>) summarises the basic rules.</w:t>
       </w:r>
     </w:p>
     <w:p>
@@ -9821,19 +9688,20 @@
     </w:p>
     <w:p>
       <w:r>
-        <w:t xml:space="preserve">A linear classification head maps the fused representation to class logits. On CIFAR-10, the mean, mean-MLP and concatenation-MLP variants contain 1,600,778, 1,732,746 and 1,798,538 trainable parameters, respectively, compared with 801,034 for a single fixed-PE </w:t>
-      </w:r>
-      <w:r>
-        <w:lastRenderedPageBreak/>
-        <w:t xml:space="preserve">encoder. The increase mainly reflects duplication of the complete </w:t>
-      </w:r>
-      <w:proofErr w:type="spellStart"/>
-      <w:r>
-        <w:t>ViT</w:t>
-      </w:r>
-      <w:proofErr w:type="spellEnd"/>
-      <w:r>
-        <w:t xml:space="preserve"> encoder, with additional parameters contributed by the learned fusion MLP where present.</w:t>
+        <w:t xml:space="preserve">In Equation (13), </w:t>
+      </w:r>
+      <m:oMath>
+        <m:r>
+          <m:t>g(·)</m:t>
+          <w:rPr>
+            <w:rFonts w:ascii="Cambria Math" w:hAnsi="Cambria Math"/>
+            <w:sz w:val="21"/>
+            <w:szCs w:val="21"/>
+          </w:rPr>
+        </m:r>
+      </m:oMath>
+      <w:r>
+        <w:t xml:space="preserve"> denotes the learned fusion MLP and square brackets denote vector concatenation. A linear head maps the fused representation to class scores. On CIFAR-10, mean, mean-MLP and concatenation-MLP fusion contain 1,600,778, 1,732,746 and 1,798,538 trainable parameters, compared with 801,034 for one fixed-PE encoder. Most of the increase comes from duplicating the encoder; the MLP variants add further parameters in the fusion stage.</w:t>
       </w:r>
     </w:p>
     <w:p>
@@ -9846,51 +9714,33 @@
     </w:p>
     <w:p>
       <w:r>
-        <w:t xml:space="preserve">The cross-attention models retain the complete row and column token sequences. For one attention head, given a query sequence </w:t>
+        <w:t xml:space="preserve">Cross-attention allows one branch to request information from the other before classification. The models therefore retain the complete row and column token sequences rather than only their final classification tokens. For one attention head, </w:t>
       </w:r>
       <m:oMath>
         <m:r>
+          <m:t>Q</m:t>
           <w:rPr>
             <w:rFonts w:ascii="Cambria Math" w:hAnsi="Cambria Math"/>
+            <w:sz w:val="21"/>
+            <w:szCs w:val="21"/>
           </w:rPr>
-          <m:t>Q</m:t>
         </m:r>
       </m:oMath>
       <w:r>
-        <w:t xml:space="preserve"> and a context sequence </w:t>
+        <w:t xml:space="preserve"> is the sequence being updated and </w:t>
       </w:r>
       <m:oMath>
         <m:r>
+          <m:t>C</m:t>
           <w:rPr>
             <w:rFonts w:ascii="Cambria Math" w:hAnsi="Cambria Math"/>
+            <w:sz w:val="21"/>
+            <w:szCs w:val="21"/>
           </w:rPr>
-          <m:t>C</m:t>
         </m:r>
       </m:oMath>
       <w:r>
-        <w:t xml:space="preserve">, the cross-attention operation projects queries from </w:t>
-      </w:r>
-      <m:oMath>
-        <m:r>
-          <w:rPr>
-            <w:rFonts w:ascii="Cambria Math" w:hAnsi="Cambria Math"/>
-          </w:rPr>
-          <m:t>Q</m:t>
-        </m:r>
-      </m:oMath>
-      <w:r>
-        <w:t xml:space="preserve"> and keys and values from </w:t>
-      </w:r>
-      <m:oMath>
-        <m:r>
-          <w:rPr>
-            <w:rFonts w:ascii="Cambria Math" w:hAnsi="Cambria Math"/>
-          </w:rPr>
-          <m:t>C</m:t>
-        </m:r>
-      </m:oMath>
-      <w:r>
-        <w:t xml:space="preserve"> using the operation in Equation (</w:t>
+        <w:t xml:space="preserve"> is the other branch used as context. Equation (</w:t>
       </w:r>
       <w:r>
         <w:fldChar w:fldCharType="begin"/>
@@ -9901,19 +9751,14 @@
       <w:r>
         <w:fldChar w:fldCharType="separate"/>
       </w:r>
-      <m:oMath>
-        <m:r>
-          <w:rPr>
-            <w:rFonts w:ascii="Cambria Math" w:hAnsi="Cambria Math"/>
-          </w:rPr>
-          <m:t>14</m:t>
-        </m:r>
-      </m:oMath>
+      <w:r>
+        <w:t>14</w:t>
+      </w:r>
       <w:r>
         <w:fldChar w:fldCharType="end"/>
       </w:r>
       <w:r>
-        <w:t>).</w:t>
+        <w:t>) gives the operation.</w:t>
       </w:r>
     </w:p>
     <w:p>
@@ -10161,74 +10006,156 @@
     </w:p>
     <w:p>
       <w:r>
-        <w:t xml:space="preserve">The multi-head module evaluates Equation (14) independently in four heads, concatenates their outputs and applies the learned output projection. Here </w:t>
+        <w:t xml:space="preserve">In Equation (14), </w:t>
+      </w:r>
+      <m:oMath>
+        <m:sSup>
+          <m:e>
+            <m:r>
+              <m:t>W</m:t>
+              <w:rPr>
+                <w:rFonts w:ascii="Cambria Math" w:hAnsi="Cambria Math"/>
+                <w:sz w:val="21"/>
+                <w:szCs w:val="21"/>
+              </w:rPr>
+            </m:r>
+          </m:e>
+          <m:sup>
+            <m:r>
+              <m:t>Q</m:t>
+              <w:rPr>
+                <w:rFonts w:ascii="Cambria Math" w:hAnsi="Cambria Math"/>
+                <w:sz w:val="21"/>
+                <w:szCs w:val="21"/>
+              </w:rPr>
+            </m:r>
+          </m:sup>
+        </m:sSup>
+      </m:oMath>
+      <w:r>
+        <w:t xml:space="preserve">, </w:t>
+      </w:r>
+      <m:oMath>
+        <m:sSup>
+          <m:e>
+            <m:r>
+              <m:t>W</m:t>
+              <w:rPr>
+                <w:rFonts w:ascii="Cambria Math" w:hAnsi="Cambria Math"/>
+                <w:sz w:val="21"/>
+                <w:szCs w:val="21"/>
+              </w:rPr>
+            </m:r>
+          </m:e>
+          <m:sup>
+            <m:r>
+              <m:t>K</m:t>
+              <w:rPr>
+                <w:rFonts w:ascii="Cambria Math" w:hAnsi="Cambria Math"/>
+                <w:sz w:val="21"/>
+                <w:szCs w:val="21"/>
+              </w:rPr>
+            </m:r>
+          </m:sup>
+        </m:sSup>
+      </m:oMath>
+      <w:r>
+        <w:t xml:space="preserve"> and </w:t>
+      </w:r>
+      <m:oMath>
+        <m:sSup>
+          <m:e>
+            <m:r>
+              <m:t>W</m:t>
+              <w:rPr>
+                <w:rFonts w:ascii="Cambria Math" w:hAnsi="Cambria Math"/>
+                <w:sz w:val="21"/>
+                <w:szCs w:val="21"/>
+              </w:rPr>
+            </m:r>
+          </m:e>
+          <m:sup>
+            <m:r>
+              <m:t>V</m:t>
+              <w:rPr>
+                <w:rFonts w:ascii="Cambria Math" w:hAnsi="Cambria Math"/>
+                <w:sz w:val="21"/>
+                <w:szCs w:val="21"/>
+              </w:rPr>
+            </m:r>
+          </m:sup>
+        </m:sSup>
+      </m:oMath>
+      <w:r>
+        <w:t xml:space="preserve"> are learned query, key and value projections, and </w:t>
       </w:r>
       <m:oMath>
         <m:sSub>
-          <m:sSubPr>
-            <m:ctrlPr>
-              <w:rPr>
-                <w:rFonts w:ascii="Cambria Math" w:hAnsi="Cambria Math"/>
-              </w:rPr>
-            </m:ctrlPr>
-          </m:sSubPr>
           <m:e>
             <m:r>
+              <m:t>d</m:t>
               <w:rPr>
                 <w:rFonts w:ascii="Cambria Math" w:hAnsi="Cambria Math"/>
-              </w:rPr>
-              <m:t>d</m:t>
+                <w:sz w:val="21"/>
+                <w:szCs w:val="21"/>
+              </w:rPr>
             </m:r>
           </m:e>
           <m:sub>
             <m:r>
+              <m:t>h</m:t>
               <w:rPr>
                 <w:rFonts w:ascii="Cambria Math" w:hAnsi="Cambria Math"/>
-              </w:rPr>
-              <m:t>h</m:t>
+                <w:sz w:val="21"/>
+                <w:szCs w:val="21"/>
+              </w:rPr>
             </m:r>
           </m:sub>
         </m:sSub>
         <m:r>
+          <m:t>=</m:t>
           <w:rPr>
             <w:rFonts w:ascii="Cambria Math" w:hAnsi="Cambria Math"/>
+            <w:sz w:val="21"/>
+            <w:szCs w:val="21"/>
           </w:rPr>
-          <m:t>=</m:t>
         </m:r>
         <m:f>
           <m:fPr>
-            <m:ctrlPr>
-              <w:rPr>
-                <w:rFonts w:ascii="Cambria Math" w:hAnsi="Cambria Math"/>
-              </w:rPr>
-            </m:ctrlPr>
+            <m:type m:val="bar"/>
           </m:fPr>
           <m:num>
             <m:r>
+              <m:t>D</m:t>
               <w:rPr>
                 <w:rFonts w:ascii="Cambria Math" w:hAnsi="Cambria Math"/>
-              </w:rPr>
-              <m:t>D</m:t>
+                <w:sz w:val="21"/>
+                <w:szCs w:val="21"/>
+              </w:rPr>
             </m:r>
           </m:num>
           <m:den>
             <m:r>
+              <m:t>4</m:t>
               <w:rPr>
                 <w:rFonts w:ascii="Cambria Math" w:hAnsi="Cambria Math"/>
-              </w:rPr>
-              <m:t>4</m:t>
+                <w:sz w:val="21"/>
+                <w:szCs w:val="21"/>
+              </w:rPr>
             </m:r>
           </m:den>
         </m:f>
         <m:r>
+          <m:t>=32</m:t>
           <w:rPr>
             <w:rFonts w:ascii="Cambria Math" w:hAnsi="Cambria Math"/>
+            <w:sz w:val="21"/>
+            <w:szCs w:val="21"/>
           </w:rPr>
-          <m:t>=32</m:t>
         </m:r>
       </m:oMath>
       <w:r>
-        <w:t xml:space="preserve"> is the per-head dimension. One block updates row tokens using column tokens as context, and a second block performs the reverse update. Both use pre-normalisation, residual connections and an MLP. The updated classification tokens are concatenated and passed to either a linear head or an MLP head. The linear-head and MLP-head variants contain 1,999,114 and 2,031,242 trainable parameters, respectively. Parameter count is therefore reported alongside accuracy because this increases capacity as well as changing the fusion mechanism.</w:t>
+        <w:t xml:space="preserve"> is the width of each attention head. Four heads perform this exchange in parallel; their outputs are concatenated and projected back to the model dimension. One block updates row tokens from column context and another updates column tokens from row context. Both use pre-normalisation, residual connections and an MLP. The updated classification tokens are concatenated and passed to either a linear or MLP head. These variants contain 1,999,114 and 2,031,242 parameters, so accuracy is interpreted alongside model size.</w:t>
       </w:r>
     </w:p>
     <w:p>
@@ -10241,46 +10168,12 @@
     </w:p>
     <w:p>
       <w:r>
-        <w:t xml:space="preserve">Single-label classification models are trained with cross-entropy loss and </w:t>
-      </w:r>
-      <w:proofErr w:type="spellStart"/>
-      <w:r>
-        <w:t>AdamW</w:t>
-      </w:r>
-      <w:proofErr w:type="spellEnd"/>
-      <w:r>
-        <w:t xml:space="preserve"> </w:t>
-      </w:r>
-      <w:r>
-        <w:fldChar w:fldCharType="begin"/>
-      </w:r>
-      <w:r>
-        <w:instrText xml:space="preserve"> ADDIN ZOTERO_ITEM CSL_CITATION {"citationID":"28c0f027","properties":{"unsorted":false,"formattedCitation":"[14]","plainCitation":"[14]","noteIndex":0},"citationItems":[{"id":312,"uris":["http://zotero.org/users/15596373/items/X7AJBVEP"],"itemData":{"id":312,"type":"paper-conference","title":"Decoupled Weight Decay Regularization","container-title":"International Conference on Learning Representations","URL":"https://openreview.net/forum?id=Bkg6RiCqY7","author":[{"family":"Loshchilov","given":"Ilya"},{"family":"Hutter","given":"Frank"}],"issued":{"date-parts":[[2019]]}}}]} </w:instrText>
-      </w:r>
-      <w:r>
-        <w:fldChar w:fldCharType="separate"/>
-      </w:r>
-      <w:r>
-        <w:t>[14]</w:t>
-      </w:r>
-      <w:r>
-        <w:fldChar w:fldCharType="end"/>
-      </w:r>
-      <w:r>
-        <w:t xml:space="preserve">. The formal CIFAR-10 comparison uses a learning rate of 3 × 10⁻⁴, weight decay 0.05, batch size 128 and a maximum of 100 epochs. </w:t>
-      </w:r>
-      <w:proofErr w:type="spellStart"/>
-      <w:r>
-        <w:t>ReduceLROnPlateau</w:t>
-      </w:r>
-      <w:proofErr w:type="spellEnd"/>
-      <w:r>
-        <w:t xml:space="preserve"> monitors validation accuracy, reducing the learning rate by a factor of 0.5 after five unimproved epochs, with a minimum learning rate of 1 × 10⁻⁶.</w:t>
+        <w:t>One optimisation protocol is used across models so that method-specific tuning does not become another experimental variable. Models are trained for single-label classification with cross-entropy loss and AdamW [14], using a learning rate of 3 × 10⁻⁴, weight decay 0.05, batch size 128 and at most 100 epochs. ReduceLROnPlateau monitors validation accuracy and halves the learning rate after five epochs without improvement, down to 1 × 10⁻⁶. This shared protocol supports a fair comparison, although it may not be the individually optimal setting for every positional encoding.</w:t>
       </w:r>
     </w:p>
     <w:p>
       <w:r>
-        <w:t>Early stopping also monitors validation accuracy, using patience 10 and minimum change 0.001. The parameter state with the best qualifying validation value is retained. After training stops, this state is restored and evaluated on the validation set and then once on the official test set. Within an individual run, test measurements are not used for learning-rate scheduling, early stopping or checkpoint selection. The main comparison repeats this protocol with training seeds 42, 43, 44, 45 and 46 while keeping the data split seed at 42.</w:t>
+        <w:t>Early stopping uses the same validation metric, with patience 10 and a minimum qualifying change of 0.001. The parameter state with the best qualifying validation accuracy is saved. When training ends, that state is restored and evaluated once on the validation set and then on the official test set. Test results never influence the learning-rate schedule, stopping time or selected checkpoint. The main comparison repeats the protocol with training seeds 42, 43, 44, 45 and 46 while the data split seed remains 42.</w:t>
       </w:r>
     </w:p>
     <w:p>
@@ -10293,57 +10186,50 @@
     </w:p>
     <w:p>
       <w:r>
-        <w:t xml:space="preserve">Test accuracy and cross-entropy loss are the primary outcome measures. Macro-precision, macro-recall and macro-F1 are computed from the confusion matrix and retained as secondary measures, with macro-F1 becoming more informative for the 100-class extension. </w:t>
-      </w:r>
-      <w:r>
-        <w:lastRenderedPageBreak/>
-        <w:t>Per-class measures and confusion matrices support diagnostic analysis, while the number of trainable parameters is reported for comparisons involving hybrid or fusion models.</w:t>
+        <w:t>Test accuracy and cross-entropy loss are the primary outcomes. Accuracy is the proportion of images assigned the correct class, so higher is better. Cross-entropy also reflects the confidence of the predicted probabilities, and lower is better. Macro-precision, macro-recall and macro-F1 are calculated from the confusion matrix as secondary measures; each class contributes equally, which is useful for the 100-class extension. Per-class scores and confusion matrices support diagnosis, while trainable parameter count is reported whenever hybrid or fusion models change capacity.</w:t>
       </w:r>
     </w:p>
     <w:p>
       <w:r>
-        <w:t xml:space="preserve">For each five-seed model, the analysis reports the arithmetic mean, sample standard deviation and a two-sided 95% Student t interval with four degrees of freedom. The interval half-width is </w:t>
+        <w:t xml:space="preserve">For each model trained with five seeds, the analysis reports the arithmetic mean, sample standard deviation and a two-sided 95% Student t interval with four degrees of freedom. Its half-width is </w:t>
       </w:r>
       <m:oMath>
         <m:r>
+          <m:t>2.776×</m:t>
           <w:rPr>
             <w:rFonts w:ascii="Cambria Math" w:hAnsi="Cambria Math"/>
+            <w:sz w:val="21"/>
+            <w:szCs w:val="21"/>
           </w:rPr>
-          <m:t>2.776×</m:t>
         </m:r>
         <m:f>
           <m:fPr>
-            <m:ctrlPr>
-              <w:rPr>
-                <w:rFonts w:ascii="Cambria Math" w:hAnsi="Cambria Math"/>
-              </w:rPr>
-            </m:ctrlPr>
+            <m:type m:val="bar"/>
           </m:fPr>
           <m:num>
             <m:r>
+              <m:t>s</m:t>
               <w:rPr>
                 <w:rFonts w:ascii="Cambria Math" w:hAnsi="Cambria Math"/>
-              </w:rPr>
-              <m:t>s</m:t>
+                <w:sz w:val="21"/>
+                <w:szCs w:val="21"/>
+              </w:rPr>
             </m:r>
           </m:num>
           <m:den>
             <m:rad>
               <m:radPr>
-                <m:degHide m:val="1"/>
-                <m:ctrlPr>
-                  <w:rPr>
-                    <w:rFonts w:ascii="Cambria Math" w:hAnsi="Cambria Math"/>
-                  </w:rPr>
-                </m:ctrlPr>
+                <m:degHide m:val="on"/>
               </m:radPr>
               <m:deg/>
               <m:e>
                 <m:r>
+                  <m:t>5</m:t>
                   <w:rPr>
                     <w:rFonts w:ascii="Cambria Math" w:hAnsi="Cambria Math"/>
+                    <w:sz w:val="21"/>
+                    <w:szCs w:val="21"/>
                   </w:rPr>
-                  <m:t>5</m:t>
                 </m:r>
               </m:e>
             </m:rad>
@@ -10355,14 +10241,16 @@
       </w:r>
       <m:oMath>
         <m:r>
+          <m:t>s</m:t>
           <w:rPr>
             <w:rFonts w:ascii="Cambria Math" w:hAnsi="Cambria Math"/>
+            <w:sz w:val="21"/>
+            <w:szCs w:val="21"/>
           </w:rPr>
-          <m:t>s</m:t>
         </m:r>
       </m:oMath>
       <w:r>
-        <w:t xml:space="preserve"> is the sample standard deviation. Direct comparisons use paired differences between matching seeds and report the mean paired difference with the same interval construction. The five seeds are not treated as five independent datasets, and the analysis does not use non-rejection as evidence of equivalence.</w:t>
+        <w:t xml:space="preserve"> is the sample standard deviation across seeds. When two models use matching seeds, their per-seed differences are calculated first and the same interval is applied to those differences. Pairing removes variation shared by the matched runs and is therefore the main evidence for a direct comparison. The seeds represent repeated training runs, not five independent datasets, and an interval that includes zero is not treated as proof that two methods are equivalent.</w:t>
       </w:r>
     </w:p>
     <w:p>
@@ -10375,23 +10263,7 @@
     </w:p>
     <w:p>
       <w:r>
-        <w:t xml:space="preserve">The project is implemented in </w:t>
-      </w:r>
-      <w:proofErr w:type="spellStart"/>
-      <w:r>
-        <w:t>PyTorch</w:t>
-      </w:r>
-      <w:proofErr w:type="spellEnd"/>
-      <w:r>
-        <w:t xml:space="preserve"> and records the command, dataset sizes, model configuration, training configuration, selected checkpoint and evaluation protocol for each run. Raw per-seed metrics and automatically aggregated statistics are stored in experiment-specific directories, allowing every reported value to be traced to its source summary. The current primary workstation and software environment are </w:t>
-      </w:r>
-      <w:proofErr w:type="spellStart"/>
-      <w:r>
-        <w:t>summarised</w:t>
-      </w:r>
-      <w:proofErr w:type="spellEnd"/>
-      <w:r>
-        <w:t xml:space="preserve"> below.</w:t>
+        <w:t>The project is implemented in PyTorch. Each run records its command, dataset sizes, model and training configuration, selected checkpoint and evaluation protocol. Raw seed-level metrics and automatically aggregated summaries are stored in experiment-specific directories, so values reported in Chapter 4 can be traced to their source files. Table 4 records the primary workstation and software environment used for the current draft.</w:t>
       </w:r>
     </w:p>
     <w:p>
@@ -10399,6 +10271,7 @@
         <w:pStyle w:val="Caption"/>
         <w:keepNext/>
         <w:jc w:val="center"/>
+        <w:pageBreakBefore/>
       </w:pPr>
       <w:r>
         <w:rPr>
@@ -10905,15 +10778,7 @@
     </w:tbl>
     <w:p>
       <w:r>
-        <w:t xml:space="preserve">The per-run configuration files record CUDA as the execution device, but the current logging schema does not preserve the GPU model or Git revision for every historical run. Table 4 therefore records the primary workstation and repository base revision for the current draft rather than attributing every stored result to a uniquely logged machine state. The final release revision should be recorded when the Chapter 4 tables are frozen. Python, </w:t>
-      </w:r>
-      <w:proofErr w:type="spellStart"/>
-      <w:r>
-        <w:t>PyTorch</w:t>
-      </w:r>
-      <w:proofErr w:type="spellEnd"/>
-      <w:r>
-        <w:t xml:space="preserve"> and CUDA random-number generators are seeded, but strict deterministic-algorithm enforcement is not enabled.</w:t>
+        <w:t>Historical run configurations record CUDA as the execution device, but the earlier logging schema did not preserve the GPU model or Git revision for every run. Table 4 therefore describes the primary workstation and the repository snapshot used for this draft; it does not claim that every stored run can be tied to a uniquely recorded machine state. The final submission revision will be recorded when the result tables are frozen. Python, PyTorch and CUDA random-number generators are seeded, but strict deterministic-algorithm enforcement is not enabled, so small nondeterministic differences may remain.</w:t>
       </w:r>
     </w:p>
     <w:p>
@@ -10928,7 +10793,7 @@
     </w:p>
     <w:p>
       <w:r>
-        <w:t>This chapter reports the empirical evaluation in a fixed sequence that follows the research questions. Each experiment first states the comparison and controlled variables, then reports selected-checkpoint test metrics with uncertainty, and finally records factual observations. Explanations of mechanisms, advantages and limitations are reserved for Chapter 5.</w:t>
+        <w:t>This chapter presents the experiments in the order needed to answer the study questions. It begins with the core positional-encoding comparison, then isolates the shifted schedule, changes patch-to-position assignment, reduces the available training data, moves selected models to CIFAR-100, and finally examines hybrid and fusion extensions. Each section states what changes and what remains controlled before reporting the selected-checkpoint test results. Mechanistic explanations and practical recommendations are reserved for Chapter 5 so that observation and interpretation remain distinct.</w:t>
       </w:r>
     </w:p>
     <w:p>
@@ -10941,15 +10806,7 @@
     </w:p>
     <w:p>
       <w:r>
-        <w:t xml:space="preserve">All result tables use the validation-selected checkpoint from each run and report the corresponding held-out test performance. Five-seed results are </w:t>
-      </w:r>
-      <w:proofErr w:type="spellStart"/>
-      <w:r>
-        <w:t>summarised</w:t>
-      </w:r>
-      <w:proofErr w:type="spellEnd"/>
-      <w:r>
-        <w:t xml:space="preserve"> with the mean and two-sided 95% t-confidence interval. Matched models are also compared through same-seed paired differences. Parameter count is reported whenever an architectural extension changes capacity.</w:t>
+        <w:t>All tables report held-out test performance from the checkpoint selected by validation accuracy. Accuracy should be read as higher-is-better and cross-entropy loss as lower-is-better. Five-seed results are shown as a mean with a two-sided 95% t confidence interval. Direct comparisons also use same-seed paired differences, and parameter counts are included whenever a model changes capacity.</w:t>
       </w:r>
     </w:p>
     <w:p>
@@ -11411,7 +11268,7 @@
     </w:tbl>
     <w:p>
       <w:r>
-        <w:t>All values in this chapter are generated from the validation-selected five-seed summary files. The tables report selected-checkpoint test performance using the frozen protocol described in Chapter 3; values following ± and bracketed ranges are 95% t confidence intervals. Validation curves show the mean across seeds 42-46, with shaded bands representing one sample standard deviation. For each configuration, a curve ends at the last epoch shared by all five runs.</w:t>
+        <w:t>All values are generated from the validation-selected five-seed summary files using the frozen protocol in Chapter 3. Values after ± and ranges in brackets are 95% t confidence intervals. Bold entries mark the higher accuracy or lower loss within the comparison group represented in a table. Validation curves show the mean across seeds 42–46, with shaded bands equal to one sample standard deviation. A curve stops at the final epoch completed by all five runs in that configuration, which avoids averaging different numbers of seeds near the end of training.</w:t>
       </w:r>
     </w:p>
     <w:p>
@@ -11424,23 +11281,7 @@
     </w:p>
     <w:p>
       <w:r>
-        <w:t xml:space="preserve">The core comparison evaluates whether positional information is required and how ordinary fixed two-dimensional designs compare with a learned absolute embedding under one shared </w:t>
-      </w:r>
-      <w:proofErr w:type="spellStart"/>
-      <w:r>
-        <w:t>ViT</w:t>
-      </w:r>
-      <w:proofErr w:type="spellEnd"/>
-      <w:r>
-        <w:t xml:space="preserve"> configuration. The comparison includes the no-position control, learned absolute PE, row and column encodings, additive and multiplicative combinations, their shifted-frequency variants, and the radial extension. Architecture, data split, </w:t>
-      </w:r>
-      <w:proofErr w:type="spellStart"/>
-      <w:r>
-        <w:t>optimisation</w:t>
-      </w:r>
-      <w:proofErr w:type="spellEnd"/>
-      <w:r>
-        <w:t>, checkpoint selection and seeds remain fixed.</w:t>
+        <w:t>The first experiment asks two questions: does the shared ViT benefit from any positional information, and how do simple fixed two-dimensional encodings compare with the learned absolute reference? Table 6 includes the no-position control, learnable absolute PE, single-axis row and column PE, additive and multiplicative combinations, their shifted variants, and radial PE. Architecture, data split, optimisation, checkpoint selection and seeds are identical across the comparison.</w:t>
       </w:r>
     </w:p>
     <w:p>
@@ -12763,51 +12604,7 @@
     </w:tbl>
     <w:p>
       <w:r>
-        <w:t xml:space="preserve">Learnable absolute PE achieved the highest mean test accuracy in the core comparison (78.60 ± 0.42%), while shifted multiplicative PE was the strongest fixed design (78.08 ± 0.09%). The no-position control reached 71.29 ± 0.83%, below every positional-encoding variant in Table 6. Among the fixed designs, interval widths varied substantially; the two shifted variants had the narrowest intervals in this experiment. Figure </w:t>
-      </w:r>
-      <w:r>
-        <w:fldChar w:fldCharType="begin"/>
-      </w:r>
-      <w:r>
-        <w:instrText xml:space="preserve"> REF fig4 \h </w:instrText>
-      </w:r>
-      <w:r>
-        <w:fldChar w:fldCharType="separate"/>
-      </w:r>
-      <w:r>
-        <w:rPr>
-          <w:noProof/>
-          <w:sz w:val="20"/>
-        </w:rPr>
-        <w:t>4</w:t>
-      </w:r>
-      <w:r>
-        <w:fldChar w:fldCharType="end"/>
-      </w:r>
-      <w:r>
-        <w:t xml:space="preserve"> shows validation accuracy and loss for the six basic configurations. The shifted variants are examined separately in Figure </w:t>
-      </w:r>
-      <w:r>
-        <w:fldChar w:fldCharType="begin"/>
-      </w:r>
-      <w:r>
-        <w:instrText xml:space="preserve"> REF fig5 \h </w:instrText>
-      </w:r>
-      <w:r>
-        <w:fldChar w:fldCharType="separate"/>
-      </w:r>
-      <w:r>
-        <w:rPr>
-          <w:noProof/>
-          <w:sz w:val="20"/>
-        </w:rPr>
-        <w:t>5</w:t>
-      </w:r>
-      <w:r>
-        <w:fldChar w:fldCharType="end"/>
-      </w:r>
-      <w:r>
-        <w:t>, while the radial extension remains reported in Table 6.</w:t>
+        <w:t>Table 6 shows a clear separation between the no-position control and the leading positional models. Learnable absolute PE had the highest mean test accuracy at 78.60 ± 0.42%. Shifted multiplicative PE was the strongest fixed design at 78.08 ± 0.09%, while no PE reached 71.29 ± 0.83% and was below every positional variant in the table. The uncertainty widths differed across fixed designs; the two shifted variants had the narrowest intervals in these five runs. Figure 4 compares validation accuracy and loss for the six basic configurations. Figure 5 gives the shifted pairs more space, while radial PE remains in Table 6.</w:t>
       </w:r>
     </w:p>
     <w:p>
@@ -12920,15 +12717,7 @@
     </w:p>
     <w:p>
       <w:r>
-        <w:t xml:space="preserve">This focused comparison isolates the frequency-exponent offset used by the shifted variants. The additive pair and multiplicative pair are </w:t>
-      </w:r>
-      <w:proofErr w:type="spellStart"/>
-      <w:r>
-        <w:t>analysed</w:t>
-      </w:r>
-      <w:proofErr w:type="spellEnd"/>
-      <w:r>
-        <w:t xml:space="preserve"> separately so that a small change is not described as a general benefit of shifting. The principal evidence is the same-seed change in test accuracy and loss.</w:t>
+        <w:t>The shifted models differ from their base versions only in the frequency-exponent schedule assigned to the row and column axes. Table 7 compares additive with shifted additive and multiplicative with shifted multiplicative. Analysing the pairs separately avoids turning a small design change into a general claim about all shifted encodings. The main evidence is the same-seed change in test accuracy and loss.</w:t>
       </w:r>
     </w:p>
     <w:p>
@@ -13399,29 +13188,7 @@
     </w:tbl>
     <w:p>
       <w:r>
-        <w:t xml:space="preserve">The shifted additive variant changed test accuracy by +0.17 percentage points (95% CI [−0.57, +0.91]) and improved over its base variant in three of five paired seeds. The shifted multiplicative variant changed accuracy by +0.55 percentage points (95% CI [−0.23, +1.32]) and was higher in all five paired seeds. Because both paired intervals include zero, shifting did not produce a clear or consistently substantial improvement under this five-seed protocol. Figure </w:t>
-      </w:r>
-      <w:r>
-        <w:fldChar w:fldCharType="begin"/>
-      </w:r>
-      <w:r>
-        <w:instrText xml:space="preserve"> REF fig5 \h </w:instrText>
-      </w:r>
-      <w:r>
-        <w:fldChar w:fldCharType="separate"/>
-      </w:r>
-      <w:r>
-        <w:rPr>
-          <w:noProof/>
-          <w:sz w:val="20"/>
-        </w:rPr>
-        <w:t>5</w:t>
-      </w:r>
-      <w:r>
-        <w:fldChar w:fldCharType="end"/>
-      </w:r>
-      <w:r>
-        <w:t xml:space="preserve"> shows the validation trajectories for the same two paired comparisons.</w:t>
+        <w:t>Shifted additive changed mean test accuracy by +0.17 percentage points (95% CI [−0.57, +0.91]) and was higher in three of five paired seeds. Shifted multiplicative changed accuracy by +0.55 points (95% CI [−0.23, +1.32]) and was higher in all five pairs. Both intervals include zero, meaning these runs remain compatible with no average change in either direction. The experiment therefore records a small positive mean shift, especially for multiplication, but not a clear or consistently substantial improvement under the five-seed protocol. Figure 5 shows the corresponding validation trajectories.</w:t>
       </w:r>
     </w:p>
     <w:p>
@@ -13534,39 +13301,7 @@
     </w:p>
     <w:p>
       <w:r>
-        <w:t xml:space="preserve">The assignment study separates physical patch location, sequence slot and the positional coordinate attached to that slot. Results are reported only after the deterministic mapping test confirms all four conventions: </w:t>
-      </w:r>
-      <w:proofErr w:type="spellStart"/>
-      <w:r>
-        <w:t>normal_row</w:t>
-      </w:r>
-      <w:proofErr w:type="spellEnd"/>
-      <w:r>
-        <w:t xml:space="preserve">, </w:t>
-      </w:r>
-      <w:proofErr w:type="spellStart"/>
-      <w:r>
-        <w:t>normal_col</w:t>
-      </w:r>
-      <w:proofErr w:type="spellEnd"/>
-      <w:r>
-        <w:t xml:space="preserve">, </w:t>
-      </w:r>
-      <w:proofErr w:type="spellStart"/>
-      <w:r>
-        <w:t>proper_row</w:t>
-      </w:r>
-      <w:proofErr w:type="spellEnd"/>
-      <w:r>
-        <w:t xml:space="preserve"> and </w:t>
-      </w:r>
-      <w:proofErr w:type="spellStart"/>
-      <w:r>
-        <w:t>proper_col</w:t>
-      </w:r>
-      <w:proofErr w:type="spellEnd"/>
-      <w:r>
-        <w:t>. The no-position and learned controls are retained to show whether any observed variation is specific to fixed positional mappings.</w:t>
+        <w:t>The assignment study changes which positional coordinate is attached to each physical patch while keeping the encoder fixed. Table 8 reports the four mappings defined in Section 3.5 only after their 64-slot index maps passed deterministic tests. No PE and learnable PE remain in the comparison as controls: if their results barely change while fixed PE changes more, the interaction is specific to the fixed patch-coordinate mapping rather than a general consequence of sequence storage.</w:t>
       </w:r>
     </w:p>
     <w:p>
@@ -13852,6 +13587,8 @@
             <w:r>
               <w:rPr>
                 <w:sz w:val="16"/>
+                <w:b w:val="1"/>
+                <w:bCs w:val="1"/>
               </w:rPr>
               <w:t>0.9992 ± 0.0991</w:t>
             </w:r>
@@ -14129,6 +13866,8 @@
             <w:r>
               <w:rPr>
                 <w:sz w:val="16"/>
+                <w:b w:val="1"/>
+                <w:bCs w:val="1"/>
               </w:rPr>
               <w:t>71.51 ± 0.53%</w:t>
             </w:r>
@@ -14252,8 +13991,9 @@
             </w:pPr>
             <w:r>
               <w:rPr>
-                <w:b/>
                 <w:sz w:val="16"/>
+                <w:b w:val="1"/>
+                <w:bCs w:val="1"/>
               </w:rPr>
               <w:t>0.7671 ± 0.1216</w:t>
             </w:r>
@@ -14353,8 +14093,9 @@
             </w:pPr>
             <w:r>
               <w:rPr>
-                <w:b/>
                 <w:sz w:val="16"/>
+                <w:b w:val="1"/>
+                <w:bCs w:val="1"/>
               </w:rPr>
               <w:t>0.7671 ± 0.1216</w:t>
             </w:r>
@@ -14454,8 +14195,9 @@
             </w:pPr>
             <w:r>
               <w:rPr>
-                <w:b/>
                 <w:sz w:val="16"/>
+                <w:b w:val="1"/>
+                <w:bCs w:val="1"/>
               </w:rPr>
               <w:t>0.7671 ± 0.1216</w:t>
             </w:r>
@@ -14531,8 +14273,9 @@
             </w:pPr>
             <w:r>
               <w:rPr>
-                <w:b/>
                 <w:sz w:val="16"/>
+                <w:b w:val="1"/>
+                <w:bCs w:val="1"/>
               </w:rPr>
               <w:t>78.64 ± 0.34%</w:t>
             </w:r>
@@ -14633,6 +14376,8 @@
             <w:r>
               <w:rPr>
                 <w:sz w:val="16"/>
+                <w:b w:val="1"/>
+                <w:bCs w:val="1"/>
               </w:rPr>
               <w:t>74.93 ± 0.87%</w:t>
             </w:r>
@@ -14857,6 +14602,8 @@
             <w:r>
               <w:rPr>
                 <w:sz w:val="16"/>
+                <w:b w:val="1"/>
+                <w:bCs w:val="1"/>
               </w:rPr>
               <w:t>0.8638 ± 0.0525</w:t>
             </w:r>
@@ -15133,6 +14880,8 @@
             <w:r>
               <w:rPr>
                 <w:sz w:val="16"/>
+                <w:b w:val="1"/>
+                <w:bCs w:val="1"/>
               </w:rPr>
               <w:t>74.74 ± 1.13%</w:t>
             </w:r>
@@ -15157,6 +14906,8 @@
             <w:r>
               <w:rPr>
                 <w:sz w:val="16"/>
+                <w:b w:val="1"/>
+                <w:bCs w:val="1"/>
               </w:rPr>
               <w:t>0.8765 ± 0.0990</w:t>
             </w:r>
@@ -15433,6 +15184,8 @@
             <w:r>
               <w:rPr>
                 <w:sz w:val="16"/>
+                <w:b w:val="1"/>
+                <w:bCs w:val="1"/>
               </w:rPr>
               <w:t>77.54 ± 0.83%</w:t>
             </w:r>
@@ -15457,6 +15210,8 @@
             <w:r>
               <w:rPr>
                 <w:sz w:val="16"/>
+                <w:b w:val="1"/>
+                <w:bCs w:val="1"/>
               </w:rPr>
               <w:t>0.7906 ± 0.0735</w:t>
             </w:r>
@@ -15766,51 +15521,7 @@
     </w:tbl>
     <w:p>
       <w:r>
-        <w:t xml:space="preserve">The deterministic mapping test passed for all four assignment conventions before these results were aggregated. Mean accuracy varied by only 0.22 percentage points across the no-PE controls and by 0.06 points across the learnable controls. The corresponding ranges were wider for row PE (0.70 points), column PE (2.08 points) and multiplicative PE (2.70 points), recording an assignment interaction for the fixed positional mappings without attributing it to token adjacency. Figures </w:t>
-      </w:r>
-      <w:r>
-        <w:fldChar w:fldCharType="begin"/>
-      </w:r>
-      <w:r>
-        <w:instrText xml:space="preserve"> REF fig6 \h </w:instrText>
-      </w:r>
-      <w:r>
-        <w:fldChar w:fldCharType="separate"/>
-      </w:r>
-      <w:r>
-        <w:rPr>
-          <w:noProof/>
-          <w:sz w:val="20"/>
-        </w:rPr>
-        <w:t>6</w:t>
-      </w:r>
-      <w:r>
-        <w:fldChar w:fldCharType="end"/>
-      </w:r>
-      <w:r>
-        <w:t xml:space="preserve"> and </w:t>
-      </w:r>
-      <w:r>
-        <w:fldChar w:fldCharType="begin"/>
-      </w:r>
-      <w:r>
-        <w:instrText xml:space="preserve"> REF fig7 \h </w:instrText>
-      </w:r>
-      <w:r>
-        <w:fldChar w:fldCharType="separate"/>
-      </w:r>
-      <w:r>
-        <w:rPr>
-          <w:noProof/>
-          <w:sz w:val="20"/>
-        </w:rPr>
-        <w:t>7</w:t>
-      </w:r>
-      <w:r>
-        <w:fldChar w:fldCharType="end"/>
-      </w:r>
-      <w:r>
-        <w:t xml:space="preserve"> show the corresponding validation accuracy and loss trajectories.</w:t>
+        <w:t>All four assignment maps passed the deterministic audit before aggregation. Across the four modes, mean accuracy spanned only 0.22 percentage points for no PE and 0.06 points for learnable PE. The ranges were larger for row PE (0.70 points), column PE (2.08 points) and multiplicative PE (2.70 points). These are descriptive assignment effects for the fixed mappings; they are not attributed to token adjacency because the intervention changes the patch-coordinate pairing defined in Section 3.5. Figures 6 and 7 show the validation accuracy and loss trajectories.</w:t>
       </w:r>
     </w:p>
     <w:p>
@@ -16025,15 +15736,7 @@
     </w:p>
     <w:p>
       <w:r>
-        <w:t xml:space="preserve">The reduced-data experiment tests whether the relationship between learnable absolute PE and shifted multiplicative PE changes when fewer labelled examples are available. Training subsets contain 1,000, 5,000, 10,000 or all available training examples. The subset-construction rule, model configuration, learning rate, </w:t>
-      </w:r>
-      <w:proofErr w:type="spellStart"/>
-      <w:r>
-        <w:t>optimisation</w:t>
-      </w:r>
-      <w:proofErr w:type="spellEnd"/>
-      <w:r>
-        <w:t>, checkpoint selection and seeds remain identical across the two positional encodings.</w:t>
+        <w:t>The reduced-data experiment asks whether a fixed spatial prior becomes more useful when fewer labelled images are available. Learnable absolute PE and shifted multiplicative PE are trained with 1,000, 5,000, 10,000 and all available training examples. Within each data size, both models use the same sampled images, architecture, learning rate, optimisation, checkpoint rule and seeds. The paired difference therefore isolates the PE choice as far as this protocol allows.</w:t>
       </w:r>
     </w:p>
     <w:p>
@@ -16440,6 +16143,8 @@
             <w:r>
               <w:rPr>
                 <w:sz w:val="17"/>
+                <w:b w:val="1"/>
+                <w:bCs w:val="1"/>
               </w:rPr>
               <w:t>40.68 ± 1.43%</w:t>
             </w:r>
@@ -16464,6 +16169,8 @@
             <w:r>
               <w:rPr>
                 <w:sz w:val="17"/>
+                <w:b w:val="1"/>
+                <w:bCs w:val="1"/>
               </w:rPr>
               <w:t>1.8576 ± 0.1205</w:t>
             </w:r>
@@ -16562,6 +16269,8 @@
             <w:r>
               <w:rPr>
                 <w:sz w:val="17"/>
+                <w:b w:val="1"/>
+                <w:bCs w:val="1"/>
               </w:rPr>
               <w:t>55.28 ± 0.90%</w:t>
             </w:r>
@@ -16586,6 +16295,8 @@
             <w:r>
               <w:rPr>
                 <w:sz w:val="17"/>
+                <w:b w:val="1"/>
+                <w:bCs w:val="1"/>
               </w:rPr>
               <w:t>1.3382 ± 0.0426</w:t>
             </w:r>
@@ -16802,6 +16513,8 @@
             <w:r>
               <w:rPr>
                 <w:sz w:val="17"/>
+                <w:b w:val="1"/>
+                <w:bCs w:val="1"/>
               </w:rPr>
               <w:t>62.37 ± 1.56%</w:t>
             </w:r>
@@ -16826,6 +16539,8 @@
             <w:r>
               <w:rPr>
                 <w:sz w:val="17"/>
+                <w:b w:val="1"/>
+                <w:bCs w:val="1"/>
               </w:rPr>
               <w:t>1.3212 ± 0.1508</w:t>
             </w:r>
@@ -17041,8 +16756,9 @@
             </w:pPr>
             <w:r>
               <w:rPr>
-                <w:b/>
                 <w:sz w:val="16"/>
+                <w:b w:val="1"/>
+                <w:bCs w:val="1"/>
               </w:rPr>
               <w:t>78.60 ± 0.42%</w:t>
             </w:r>
@@ -17184,8 +16900,9 @@
             </w:pPr>
             <w:r>
               <w:rPr>
-                <w:b/>
                 <w:sz w:val="16"/>
+                <w:b w:val="1"/>
+                <w:bCs w:val="1"/>
               </w:rPr>
               <w:t>0.7535 ± 0.0727</w:t>
             </w:r>
@@ -17219,29 +16936,7 @@
     </w:tbl>
     <w:p>
       <w:r>
-        <w:t xml:space="preserve">Under the reduced-data protocol, shifted multiplicative PE exceeded learnable absolute PE by 2.54 percentage points at 1,000 examples (95% CI [1.19, 3.89]). The ordering reversed at 5,000 examples, where the paired difference was −1.81 points (95% CI [−2.51, −1.11]), and at 10,000 examples, where the difference was −0.95 points (95% CI [−3.06, 1.15]). The separately trained Full reference favoured learnable PE by 0.52 points (95% CI [0.15, 0.89]). The reversal at 1,000 examples is therefore specific to the most data-limited condition rather than a consistent advantage across subset sizes. Figure </w:t>
-      </w:r>
-      <w:r>
-        <w:fldChar w:fldCharType="begin"/>
-      </w:r>
-      <w:r>
-        <w:instrText xml:space="preserve"> REF fig8 \h </w:instrText>
-      </w:r>
-      <w:r>
-        <w:fldChar w:fldCharType="separate"/>
-      </w:r>
-      <w:r>
-        <w:rPr>
-          <w:noProof/>
-          <w:sz w:val="20"/>
-        </w:rPr>
-        <w:t>8</w:t>
-      </w:r>
-      <w:r>
-        <w:fldChar w:fldCharType="end"/>
-      </w:r>
-      <w:r>
-        <w:t xml:space="preserve"> shows validation accuracy and loss across epochs for the four reduced-data configurations. The Full reference is not joined to these curves because it was trained under the separately frozen learning-rate protocol.</w:t>
+        <w:t>With 1,000 training examples, shifted multiplicative PE exceeded learnable absolute PE by 2.54 percentage points (95% CI [1.19, 3.89]). At 5,000 examples the difference reversed to −1.81 points (95% CI [−2.51, −1.11]); at 10,000 it was −0.95 points (95% CI [−3.06, 1.15]). The separately trained full-data reference favoured learnable PE by 0.52 points (95% CI [0.15, 0.89]). The fixed method's advantage is therefore confined to the most data-limited condition tested here, rather than increasing or persisting across subset sizes. Figure 8 shows validation accuracy and loss for the three reduced subsets. The full-data reference is not connected to those curves because it used the separately frozen full-data learning-rate protocol.</w:t>
       </w:r>
     </w:p>
     <w:p>
@@ -17363,7 +17058,7 @@
     </w:p>
     <w:p>
       <w:r>
-        <w:t>CIFAR-100 extends the evaluation to a more fine-grained classification task without changing input resolution. The main comparison examines whether the relative ordering observed on CIFAR-10 is retained when the number of classes increases. Absolute accuracy is reported for each dataset, but the central observation concerns ranking, uncertainty and method-specific changes rather than the direct difficulty gap between datasets.</w:t>
+        <w:t>CIFAR-100 tests whether the CIFAR-10 ordering survives a more fine-grained classification problem while the 32 × 32 input size and 8 × 8 patch grid stay unchanged. The comparison uses four models chosen before examining the CIFAR-100 results: no PE, learnable absolute PE, shifted additive PE and shifted multiplicative PE. Absolute accuracy is expected to change because the dataset has 100 classes; the relevant comparison is the within-dataset ranking and uncertainty, not the raw gap between CIFAR-10 and CIFAR-100.</w:t>
       </w:r>
     </w:p>
     <w:p>
@@ -17750,6 +17445,8 @@
             <w:r>
               <w:rPr>
                 <w:sz w:val="17"/>
+                <w:b w:val="1"/>
+                <w:bCs w:val="1"/>
               </w:rPr>
               <w:t>78.60 ± 0.42%</w:t>
             </w:r>
@@ -17774,6 +17471,8 @@
             <w:r>
               <w:rPr>
                 <w:sz w:val="17"/>
+                <w:b w:val="1"/>
+                <w:bCs w:val="1"/>
               </w:rPr>
               <w:t>47.66 ± 0.21%</w:t>
             </w:r>
@@ -18075,33 +17774,7 @@
     </w:tbl>
     <w:p>
       <w:r>
-        <w:t xml:space="preserve">The ordering of the four pre-selected models was unchanged between CIFAR-10 and CIFAR-100. Learnable absolute PE ranked first on CIFAR-100 at 47.66 ± 0.21%, followed by shifted </w:t>
-      </w:r>
-      <w:r>
-        <w:lastRenderedPageBreak/>
-        <w:t xml:space="preserve">multiplicative PE at 45.77 ± 1.27%, shifted additive PE at 45.24 ± 1.35%, and the no-position control at 40.16 ± 0.69%. This preserves the within-dataset ranking but does not by itself establish that the same gaps will hold for other architectures or image domains. Figure </w:t>
-      </w:r>
-      <w:r>
-        <w:fldChar w:fldCharType="begin"/>
-      </w:r>
-      <w:r>
-        <w:instrText xml:space="preserve"> REF fig9 \h </w:instrText>
-      </w:r>
-      <w:r>
-        <w:fldChar w:fldCharType="separate"/>
-      </w:r>
-      <w:r>
-        <w:rPr>
-          <w:noProof/>
-          <w:sz w:val="20"/>
-        </w:rPr>
-        <w:t>9</w:t>
-      </w:r>
-      <w:r>
-        <w:fldChar w:fldCharType="end"/>
-      </w:r>
-      <w:r>
-        <w:t xml:space="preserve"> shows the corresponding CIFAR-100 validation accuracy and loss trajectories.</w:t>
+        <w:t>The four models kept the same order on both datasets. On CIFAR-100, learnable absolute PE ranked first at 47.66 ± 0.21%, followed by shifted multiplicative PE at 45.77 ± 1.27%, shifted additive PE at 45.24 ± 1.35%, and no PE at 40.16 ± 0.69%. The preserved ranking is evidence about this shared architecture and these two datasets; it does not establish that the same gaps will hold for larger ViTs or other image domains. Figure 9 shows the CIFAR-100 validation trajectories.</w:t>
       </w:r>
     </w:p>
     <w:p>
@@ -18215,7 +17888,7 @@
     </w:p>
     <w:p>
       <w:r>
-        <w:t>The final experimental group records designs that add either positional or architectural complexity beyond the core comparison. Hybrid PE is compared with an order-matched learned baseline. Fusion models are reported with parameter count so that increased capacity is visible. Squared and radial encodings are retained as informative extensions even when they do not improve the best core model.</w:t>
+        <w:t>The final group asks whether extra complexity earns better performance than the single-branch models. The hybrid is compared with a learnable control using the same patch order. Fusion models are shown with parameter count because they duplicate the encoder or add learned fusion layers. Squared and radial PE remain in the table as targeted fixed-encoding tests, even though they were not among the strongest core methods.</w:t>
       </w:r>
     </w:p>
     <w:p>
@@ -18702,8 +18375,9 @@
             </w:pPr>
             <w:r>
               <w:rPr>
-                <w:b/>
                 <w:sz w:val="16"/>
+                <w:b w:val="1"/>
+                <w:bCs w:val="1"/>
               </w:rPr>
               <w:t>78.66 ± 0.51%</w:t>
             </w:r>
@@ -18727,8 +18401,9 @@
             </w:pPr>
             <w:r>
               <w:rPr>
-                <w:b/>
                 <w:sz w:val="16"/>
+                <w:b w:val="1"/>
+                <w:bCs w:val="1"/>
               </w:rPr>
               <w:t>0.7587 ± 0.0881</w:t>
             </w:r>
@@ -18851,6 +18526,8 @@
             <w:r>
               <w:rPr>
                 <w:sz w:val="16"/>
+                <w:b w:val="1"/>
+                <w:bCs w:val="1"/>
               </w:rPr>
               <w:t>78.60 ± 0.42%</w:t>
             </w:r>
@@ -18875,6 +18552,8 @@
             <w:r>
               <w:rPr>
                 <w:sz w:val="16"/>
+                <w:b w:val="1"/>
+                <w:bCs w:val="1"/>
               </w:rPr>
               <w:t>0.7671 ± 0.1216</w:t>
             </w:r>
@@ -19655,6 +19334,8 @@
             <w:r>
               <w:rPr>
                 <w:sz w:val="16"/>
+                <w:b w:val="1"/>
+                <w:bCs w:val="1"/>
               </w:rPr>
               <w:t>0.7642 ± 0.0814</w:t>
             </w:r>
@@ -19737,6 +19418,8 @@
             <w:r>
               <w:rPr>
                 <w:sz w:val="16"/>
+                <w:b w:val="1"/>
+                <w:bCs w:val="1"/>
               </w:rPr>
               <w:t>77.61 ± 0.82%</w:t>
             </w:r>
@@ -19876,29 +19559,7 @@
     </w:tbl>
     <w:p>
       <w:r>
-        <w:t xml:space="preserve">The hybrid differed from its order-matched learned control by +0.09 pp ([-0.24, +0.41] pp); the selected-checkpoint fixed-position scale had mean 0.0060 and ranged from -0.0403 to 0.0492. The best dual-branch result was the cross-attention model with an MLP head at 77.74 ± 0.44%, but its paired difference from learnable absolute PE was -0.86 pp ([-1.45, -0.27] pp) while its parameter count increased from 809,354 to 2,031,242. Neither squared variant nor radial PE exceeded the strongest core single-branch results. Figure </w:t>
-      </w:r>
-      <w:r>
-        <w:fldChar w:fldCharType="begin"/>
-      </w:r>
-      <w:r>
-        <w:instrText xml:space="preserve"> REF fig10 \h </w:instrText>
-      </w:r>
-      <w:r>
-        <w:fldChar w:fldCharType="separate"/>
-      </w:r>
-      <w:r>
-        <w:rPr>
-          <w:noProof/>
-          <w:sz w:val="20"/>
-        </w:rPr>
-        <w:t>10</w:t>
-      </w:r>
-      <w:r>
-        <w:fldChar w:fldCharType="end"/>
-      </w:r>
-      <w:r>
-        <w:t xml:space="preserve"> shows the validation dynamics of the five fusion variants alongside learnable absolute PE.</w:t>
+        <w:t>The hybrid differed from its order-matched learned control by +0.09 percentage points (95% CI [−0.24, +0.41]). At the selected checkpoints, its learned fixed-position scale had a mean of 0.0060 and ranged from −0.0403 to 0.0492. The best dual-branch result came from cross-attention with an MLP head at 77.74 ± 0.44%, but it remained 0.86 points below learnable absolute PE in the paired comparison (95% CI [−1.45, −0.27]) while increasing the parameter count from 809,354 to 2,031,242. Neither squared variant nor radial PE exceeded the strongest core single-branch results. Figure 10 compares the validation dynamics of the five fusion variants with learnable absolute PE.</w:t>
       </w:r>
     </w:p>
     <w:p>
@@ -20015,12 +19676,12 @@
         <w:keepLines/>
       </w:pPr>
       <w:r>
-        <w:t>The completed experiments establish five factual patterns. Positional information improved on the no-PE control, learnable absolute PE had the highest core mean accuracy, and shifted multiplicative PE was the strongest fixed design. Patch-assignment effects were small for the no-PE and learnable controls but larger for several fixed mappings. In the reduced-data study, shifted multiplicative PE exceeded learnable PE only at 1,000 examples; the ordering reversed at 5,000 and 10,000 examples. The four pre-selected methods retained the same ranking on CIFAR-100.</w:t>
+        <w:t>Across the experiments, positional information consistently improved on the no-PE control, learnable absolute PE had the highest core mean accuracy, and shifted multiplicative PE was the strongest fixed design. Patch-assignment changes were small for no PE and learnable PE but larger for several fixed mappings. In the reduced-data study, shifted multiplicative PE led only with 1,000 training examples; learnable PE had the higher mean at 5,000, 10,000 and full data. The four pre-selected methods kept the same ranking on CIFAR-100. Finally, none of the more expensive fusion designs improved on the learnable single-branch reference.</w:t>
       </w:r>
     </w:p>
     <w:p>
       <w:r>
-        <w:t>These robustness experiments extend the evidence beyond the original CIFAR-10 comparison while remaining bounded by one architecture, one split-construction rule and five training seeds. Chapter 5 interprets the low-data reversal and stable CIFAR-100 ranking without treating either result as a universal property of positional encoding.</w:t>
+        <w:t>The evidence is broader than a single CIFAR-10 table, but it remains bounded by one small ViT architecture, one split-construction rule and five training seeds. Chapter 5 examines what the low-data reversal, assignment effects and stable CIFAR-100 ranking may mean without treating them as universal properties of positional encoding.</w:t>
       </w:r>
     </w:p>
     <w:p>

</xml_diff>